<commit_message>
Deploy latest version of PFS documents 8168573381924285e88554d5dc82d0039d82ea44
</commit_message>
<xml_diff>
--- a/latest/GSLC.docx
+++ b/latest/GSLC.docx
@@ -117,7 +117,7 @@
         <w:pStyle w:val="FirstParagraph"/>
       </w:pPr>
       <w:r>
-        <w:t xml:space="preserve">Not available yet</w:t>
+        <w:t xml:space="preserve">Not available, see previous versions of the document for its history.</w:t>
       </w:r>
     </w:p>
     <w:bookmarkEnd w:id="25"/>
@@ -151,7 +151,7 @@
         </w:numPr>
       </w:pPr>
       <w:r>
-        <w:t xml:space="preserve">Ake Rosenqvist, soloEO / Japan Aerospace Exploration Agency (JAXA), Japan</w:t>
+        <w:t xml:space="preserve">Ake Rosenqvist, soloEO / Japan Aerospace Exploration Agency, Japan</w:t>
       </w:r>
     </w:p>
     <w:p>
@@ -235,6 +235,18 @@
         </w:numPr>
       </w:pPr>
       <w:r>
+        <w:t xml:space="preserve">David Bekaert, Jet Propulsion Laboratory, USA</w:t>
+      </w:r>
+    </w:p>
+    <w:p>
+      <w:pPr>
+        <w:pStyle w:val="Compact"/>
+        <w:numPr>
+          <w:ilvl w:val="0"/>
+          <w:numId w:val="1001"/>
+        </w:numPr>
+      </w:pPr>
+      <w:r>
         <w:t xml:space="preserve">Virginia Brancato, Jet Propulsion Laboratory, USA</w:t>
       </w:r>
     </w:p>
@@ -271,6 +283,18 @@
         </w:numPr>
       </w:pPr>
       <w:r>
+        <w:t xml:space="preserve">Matt Garthwaite, CSIRO, Australia</w:t>
+      </w:r>
+    </w:p>
+    <w:p>
+      <w:pPr>
+        <w:pStyle w:val="Compact"/>
+        <w:numPr>
+          <w:ilvl w:val="0"/>
+          <w:numId w:val="1001"/>
+        </w:numPr>
+      </w:pPr>
+      <w:r>
         <w:t xml:space="preserve">Guillaume Hajduch, Collecte Localisation Satellites, France</w:t>
       </w:r>
     </w:p>
@@ -283,6 +307,18 @@
         </w:numPr>
       </w:pPr>
       <w:r>
+        <w:t xml:space="preserve">P.V. Jayasri, ISRO, India</w:t>
+      </w:r>
+    </w:p>
+    <w:p>
+      <w:pPr>
+        <w:pStyle w:val="Compact"/>
+        <w:numPr>
+          <w:ilvl w:val="0"/>
+          <w:numId w:val="1001"/>
+        </w:numPr>
+      </w:pPr>
+      <w:r>
         <w:t xml:space="preserve">Josef Kellndorfer, Earth Big Data, USA</w:t>
       </w:r>
     </w:p>
@@ -307,7 +343,7 @@
         </w:numPr>
       </w:pPr>
       <w:r>
-        <w:t xml:space="preserve">Adam Lewis, Geoscience Australia, Australia</w:t>
+        <w:t xml:space="preserve">Thomas Logan, Alaska Satellite Facility, USA</w:t>
       </w:r>
     </w:p>
     <w:p>
@@ -319,7 +355,7 @@
         </w:numPr>
       </w:pPr>
       <w:r>
-        <w:t xml:space="preserve">Thomas Logan, Alaska Satellite Facility, USA</w:t>
+        <w:t xml:space="preserve">Franz Meyer, Alaska Satellite Facility, USA</w:t>
       </w:r>
     </w:p>
     <w:p>
@@ -331,7 +367,7 @@
         </w:numPr>
       </w:pPr>
       <w:r>
-        <w:t xml:space="preserve">Franz Meyer, Alaska Satellite Facility, USA</w:t>
+        <w:t xml:space="preserve">Nuno Miranda, European Space Agency (ESA), Italy</w:t>
       </w:r>
     </w:p>
     <w:p>
@@ -343,7 +379,7 @@
         </w:numPr>
       </w:pPr>
       <w:r>
-        <w:t xml:space="preserve">Nuno Miranda, European Space Agency (ESA), Italy</w:t>
+        <w:t xml:space="preserve">Muriel Pinheiro, European Space Agency (ESA), Italy</w:t>
       </w:r>
     </w:p>
     <w:p>
@@ -355,7 +391,7 @@
         </w:numPr>
       </w:pPr>
       <w:r>
-        <w:t xml:space="preserve">Muriel Pinheiro, European Space Agency (ESA), Italy</w:t>
+        <w:t xml:space="preserve">Marko Repse, Sinergise, Slovenia</w:t>
       </w:r>
     </w:p>
     <w:p>
@@ -367,7 +403,7 @@
         </w:numPr>
       </w:pPr>
       <w:r>
-        <w:t xml:space="preserve">Marko Repse, Sinergise, Slovenia</w:t>
+        <w:t xml:space="preserve">HariPriya Sakethapuram, ISRO, India</w:t>
       </w:r>
     </w:p>
     <w:p>
@@ -379,7 +415,7 @@
         </w:numPr>
       </w:pPr>
       <w:r>
-        <w:t xml:space="preserve">HariPriya Sakethapuram, ISRO, India</w:t>
+        <w:t xml:space="preserve">Gustavo H. X. Shiroma, Jet Propulsion Laboratory, USA</w:t>
       </w:r>
     </w:p>
     <w:p>
@@ -403,7 +439,7 @@
         </w:numPr>
       </w:pPr>
       <w:r>
-        <w:t xml:space="preserve">Gustavo Shiroma, Jet Propulsion Laboratory, USA</w:t>
+        <w:t xml:space="preserve">Scott Staniewicz, Jet Propulsion Laboratory, USA</w:t>
       </w:r>
     </w:p>
     <w:p>
@@ -439,7 +475,7 @@
         </w:numPr>
       </w:pPr>
       <w:r>
-        <w:t xml:space="preserve">Antonio Valentino, RHEA for European Space Agency (ESA), Italy</w:t>
+        <w:t xml:space="preserve">Antonio Valentino, Starion for European Space Agency (ESA), Italy</w:t>
       </w:r>
     </w:p>
     <w:p>
@@ -464,6 +500,18 @@
       </w:pPr>
       <w:r>
         <w:t xml:space="preserve">Fang Yuan, Digital Earth Africa, Australia</w:t>
+      </w:r>
+    </w:p>
+    <w:p>
+      <w:pPr>
+        <w:pStyle w:val="Compact"/>
+        <w:numPr>
+          <w:ilvl w:val="0"/>
+          <w:numId w:val="1001"/>
+        </w:numPr>
+      </w:pPr>
+      <w:r>
+        <w:t xml:space="preserve">Francesco De Zan, Delta-Phi Remote Sensing GmbH, Germany</w:t>
       </w:r>
     </w:p>
     <w:p>
@@ -532,7 +580,7 @@
         <w:t xml:space="preserve"> </w:t>
       </w:r>
       <w:r>
-        <w:t xml:space="preserve">1.2-draft</w:t>
+        <w:t xml:space="preserve">1.2.0-draft</w:t>
       </w:r>
     </w:p>
     <w:p>
@@ -1366,7 +1414,7 @@
         <w:t xml:space="preserve">suitability of the dataset, and must meet the requirements listed below.</w:t>
       </w:r>
     </w:p>
-    <w:bookmarkStart w:id="34" w:name="sec:meta.metadata-traceability-sar"/>
+    <w:bookmarkStart w:id="34" w:name="sec:meta-trcsar"/>
     <w:p>
       <w:pPr>
         <w:pStyle w:val="berschrift4"/>
@@ -1398,7 +1446,7 @@
         <w:rPr>
           <w:rStyle w:val="VerbatimChar"/>
         </w:rPr>
-        <w:t xml:space="preserve">meta.metadata-traceability-sar</w:t>
+        <w:t xml:space="preserve">meta-trcsar</w:t>
       </w:r>
     </w:p>
     <w:bookmarkStart w:id="31" w:name="threshold-requirements"/>
@@ -1461,7 +1509,7 @@
       <w:r>
         <w:t xml:space="preserve">“</w:t>
       </w:r>
-      <w:hyperlink w:anchor="X96f5cf0495ba802547027bd915355aff9549cc2">
+      <w:hyperlink w:anchor="sec:rcm-rmasar">
         <w:r>
           <w:rPr>
             <w:rStyle w:val="Hyperlink"/>
@@ -1555,7 +1603,7 @@
     </w:p>
     <w:bookmarkEnd w:id="33"/>
     <w:bookmarkEnd w:id="34"/>
-    <w:bookmarkStart w:id="38" w:name="X395b65d2d68dbeeea9cb452c7d813188d36eeff"/>
+    <w:bookmarkStart w:id="38" w:name="sec:meta-mrdsar"/>
     <w:p>
       <w:pPr>
         <w:pStyle w:val="berschrift4"/>
@@ -1587,7 +1635,7 @@
         <w:rPr>
           <w:rStyle w:val="VerbatimChar"/>
         </w:rPr>
-        <w:t xml:space="preserve">meta.metadata-machine-readability-sar</w:t>
+        <w:t xml:space="preserve">meta-mrdsar</w:t>
       </w:r>
     </w:p>
     <w:bookmarkStart w:id="35" w:name="threshold-requirements-1"/>
@@ -1692,7 +1740,7 @@
     </w:p>
     <w:bookmarkEnd w:id="37"/>
     <w:bookmarkEnd w:id="38"/>
-    <w:bookmarkStart w:id="42" w:name="sec:meta.metadata-product-type-sar"/>
+    <w:bookmarkStart w:id="42" w:name="sec:meta-prdtyp"/>
     <w:p>
       <w:pPr>
         <w:pStyle w:val="berschrift4"/>
@@ -1724,7 +1772,7 @@
         <w:rPr>
           <w:rStyle w:val="VerbatimChar"/>
         </w:rPr>
-        <w:t xml:space="preserve">meta.metadata-product-type-sar</w:t>
+        <w:t xml:space="preserve">meta-prdtyp</w:t>
       </w:r>
     </w:p>
     <w:bookmarkStart w:id="39" w:name="threshold-requirements-2"/>
@@ -1832,7 +1880,7 @@
     </w:p>
     <w:bookmarkEnd w:id="41"/>
     <w:bookmarkEnd w:id="42"/>
-    <w:bookmarkStart w:id="46" w:name="sec:meta.metadata-pfs-url"/>
+    <w:bookmarkStart w:id="46" w:name="sec:meta-pfsurl"/>
     <w:p>
       <w:pPr>
         <w:pStyle w:val="berschrift4"/>
@@ -1864,7 +1912,7 @@
         <w:rPr>
           <w:rStyle w:val="VerbatimChar"/>
         </w:rPr>
-        <w:t xml:space="preserve">meta.metadata-pfs-url</w:t>
+        <w:t xml:space="preserve">meta-pfsurl</w:t>
       </w:r>
     </w:p>
     <w:bookmarkStart w:id="43" w:name="threshold-requirements-3"/>
@@ -1972,7 +2020,7 @@
     </w:p>
     <w:bookmarkEnd w:id="45"/>
     <w:bookmarkEnd w:id="46"/>
-    <w:bookmarkStart w:id="50" w:name="sec:meta.metadata-time-sar"/>
+    <w:bookmarkStart w:id="50" w:name="sec:meta-timsar"/>
     <w:p>
       <w:pPr>
         <w:pStyle w:val="berschrift4"/>
@@ -2004,7 +2052,7 @@
         <w:rPr>
           <w:rStyle w:val="VerbatimChar"/>
         </w:rPr>
-        <w:t xml:space="preserve">meta.metadata-time-sar</w:t>
+        <w:t xml:space="preserve">meta-timsar</w:t>
       </w:r>
     </w:p>
     <w:bookmarkStart w:id="47" w:name="threshold-requirements-4"/>
@@ -2038,7 +2086,7 @@
       <w:r>
         <w:t xml:space="preserve">“</w:t>
       </w:r>
-      <w:hyperlink w:anchor="sec:pxl.per-pixel-acquisition-id">
+      <w:hyperlink w:anchor="sec:pxl-ppacqd">
         <w:r>
           <w:rPr>
             <w:rStyle w:val="Hyperlink"/>
@@ -2186,7 +2234,7 @@
         <w:t xml:space="preserve">This may be one or mutliple acquisitions.</w:t>
       </w:r>
     </w:p>
-    <w:bookmarkStart w:id="55" w:name="sec:src.metadata-acquisition-id"/>
+    <w:bookmarkStart w:id="55" w:name="sec:src-acqid"/>
     <w:p>
       <w:pPr>
         <w:pStyle w:val="berschrift4"/>
@@ -2218,7 +2266,7 @@
         <w:rPr>
           <w:rStyle w:val="VerbatimChar"/>
         </w:rPr>
-        <w:t xml:space="preserve">src.metadata-acquisition-id</w:t>
+        <w:t xml:space="preserve">src-acqid</w:t>
       </w:r>
     </w:p>
     <w:bookmarkStart w:id="52" w:name="threshold-requirements-5"/>
@@ -2326,7 +2374,7 @@
     </w:p>
     <w:bookmarkEnd w:id="54"/>
     <w:bookmarkEnd w:id="55"/>
-    <w:bookmarkStart w:id="59" w:name="sec:src.metadata-data-access-source"/>
+    <w:bookmarkStart w:id="59" w:name="sec:src-dacsrc"/>
     <w:p>
       <w:pPr>
         <w:pStyle w:val="berschrift4"/>
@@ -2358,7 +2406,7 @@
         <w:rPr>
           <w:rStyle w:val="VerbatimChar"/>
         </w:rPr>
-        <w:t xml:space="preserve">src.metadata-data-access-source</w:t>
+        <w:t xml:space="preserve">src-dacsrc</w:t>
       </w:r>
     </w:p>
     <w:bookmarkStart w:id="56" w:name="threshold-requirements-6"/>
@@ -2463,7 +2511,7 @@
     </w:p>
     <w:bookmarkEnd w:id="58"/>
     <w:bookmarkEnd w:id="59"/>
-    <w:bookmarkStart w:id="64" w:name="sec:src.metadata-instrument-sar"/>
+    <w:bookmarkStart w:id="64" w:name="sec:src-inssar"/>
     <w:p>
       <w:pPr>
         <w:pStyle w:val="berschrift4"/>
@@ -2495,7 +2543,7 @@
         <w:rPr>
           <w:rStyle w:val="VerbatimChar"/>
         </w:rPr>
-        <w:t xml:space="preserve">src.metadata-instrument-sar</w:t>
+        <w:t xml:space="preserve">src-inssar</w:t>
       </w:r>
     </w:p>
     <w:bookmarkStart w:id="60" w:name="threshold-requirements-7"/>
@@ -2641,7 +2689,7 @@
     </w:p>
     <w:bookmarkEnd w:id="63"/>
     <w:bookmarkEnd w:id="64"/>
-    <w:bookmarkStart w:id="68" w:name="sec:src.metadata-time-source"/>
+    <w:bookmarkStart w:id="68" w:name="sec:src-timsrc"/>
     <w:p>
       <w:pPr>
         <w:pStyle w:val="berschrift4"/>
@@ -2673,7 +2721,7 @@
         <w:rPr>
           <w:rStyle w:val="VerbatimChar"/>
         </w:rPr>
-        <w:t xml:space="preserve">src.metadata-time-source</w:t>
+        <w:t xml:space="preserve">src-timsrc</w:t>
       </w:r>
     </w:p>
     <w:bookmarkStart w:id="65" w:name="threshold-requirements-8"/>
@@ -2781,7 +2829,7 @@
     </w:p>
     <w:bookmarkEnd w:id="67"/>
     <w:bookmarkEnd w:id="68"/>
-    <w:bookmarkStart w:id="72" w:name="X388564888c1c6fa2a0a60a2518ddf0e462cce33"/>
+    <w:bookmarkStart w:id="72" w:name="sec:src-acqpar"/>
     <w:p>
       <w:pPr>
         <w:pStyle w:val="berschrift4"/>
@@ -2813,7 +2861,7 @@
         <w:rPr>
           <w:rStyle w:val="VerbatimChar"/>
         </w:rPr>
-        <w:t xml:space="preserve">src.metadata-acquisition-parameters-sar</w:t>
+        <w:t xml:space="preserve">src-acqpar</w:t>
       </w:r>
     </w:p>
     <w:bookmarkStart w:id="69" w:name="threshold-requirements-9"/>
@@ -2993,7 +3041,7 @@
     </w:p>
     <w:bookmarkEnd w:id="71"/>
     <w:bookmarkEnd w:id="72"/>
-    <w:bookmarkStart w:id="77" w:name="sec:src.metadata-orbit"/>
+    <w:bookmarkStart w:id="77" w:name="sec:src-orbit"/>
     <w:p>
       <w:pPr>
         <w:pStyle w:val="berschrift4"/>
@@ -3025,7 +3073,7 @@
         <w:rPr>
           <w:rStyle w:val="VerbatimChar"/>
         </w:rPr>
-        <w:t xml:space="preserve">src.metadata-orbit</w:t>
+        <w:t xml:space="preserve">src-orbit</w:t>
       </w:r>
     </w:p>
     <w:bookmarkStart w:id="74" w:name="threshold-requirements-10"/>
@@ -3196,7 +3244,7 @@
     </w:p>
     <w:bookmarkEnd w:id="76"/>
     <w:bookmarkEnd w:id="77"/>
-    <w:bookmarkStart w:id="81" w:name="sec:src.metadata-processing-parameters"/>
+    <w:bookmarkStart w:id="81" w:name="sec:src-prcpar"/>
     <w:p>
       <w:pPr>
         <w:pStyle w:val="berschrift4"/>
@@ -3228,7 +3276,7 @@
         <w:rPr>
           <w:rStyle w:val="VerbatimChar"/>
         </w:rPr>
-        <w:t xml:space="preserve">src.metadata-processing-parameters</w:t>
+        <w:t xml:space="preserve">src-prcpar</w:t>
       </w:r>
     </w:p>
     <w:bookmarkStart w:id="78" w:name="threshold-requirements-11"/>
@@ -3417,7 +3465,7 @@
     </w:p>
     <w:bookmarkEnd w:id="80"/>
     <w:bookmarkEnd w:id="81"/>
-    <w:bookmarkStart w:id="85" w:name="sec:src.metadata-image-attributes-sar"/>
+    <w:bookmarkStart w:id="85" w:name="sec:src-imgatt"/>
     <w:p>
       <w:pPr>
         <w:pStyle w:val="berschrift4"/>
@@ -3449,7 +3497,7 @@
         <w:rPr>
           <w:rStyle w:val="VerbatimChar"/>
         </w:rPr>
-        <w:t xml:space="preserve">src.metadata-image-attributes-sar</w:t>
+        <w:t xml:space="preserve">src-imgatt</w:t>
       </w:r>
     </w:p>
     <w:bookmarkStart w:id="82" w:name="threshold-requirements-12"/>
@@ -3638,7 +3686,7 @@
     </w:p>
     <w:bookmarkEnd w:id="84"/>
     <w:bookmarkEnd w:id="85"/>
-    <w:bookmarkStart w:id="89" w:name="sec:src.metadata-sensor-calibration-sar"/>
+    <w:bookmarkStart w:id="89" w:name="sec:src-scasar"/>
     <w:p>
       <w:pPr>
         <w:pStyle w:val="berschrift4"/>
@@ -3670,7 +3718,7 @@
         <w:rPr>
           <w:rStyle w:val="VerbatimChar"/>
         </w:rPr>
-        <w:t xml:space="preserve">src.metadata-sensor-calibration-sar</w:t>
+        <w:t xml:space="preserve">src-scasar</w:t>
       </w:r>
     </w:p>
     <w:bookmarkStart w:id="86" w:name="threshold-requirements-13"/>
@@ -3784,7 +3832,7 @@
     </w:p>
     <w:bookmarkEnd w:id="88"/>
     <w:bookmarkEnd w:id="89"/>
-    <w:bookmarkStart w:id="93" w:name="sec:src.metadata-performance-indicators"/>
+    <w:bookmarkStart w:id="93" w:name="sec:src-prfind"/>
     <w:p>
       <w:pPr>
         <w:pStyle w:val="berschrift4"/>
@@ -3816,7 +3864,7 @@
         <w:rPr>
           <w:rStyle w:val="VerbatimChar"/>
         </w:rPr>
-        <w:t xml:space="preserve">src.metadata-performance-indicators</w:t>
+        <w:t xml:space="preserve">src-prfind</w:t>
       </w:r>
     </w:p>
     <w:bookmarkStart w:id="90" w:name="threshold-requirements-14"/>
@@ -4027,7 +4075,7 @@
     </w:p>
     <w:bookmarkEnd w:id="92"/>
     <w:bookmarkEnd w:id="93"/>
-    <w:bookmarkStart w:id="97" w:name="Xfba7a12354a19b5faae5bafbe3d48cff22204af"/>
+    <w:bookmarkStart w:id="97" w:name="sec:src-polcal"/>
     <w:p>
       <w:pPr>
         <w:pStyle w:val="berschrift4"/>
@@ -4059,7 +4107,7 @@
         <w:rPr>
           <w:rStyle w:val="VerbatimChar"/>
         </w:rPr>
-        <w:t xml:space="preserve">src.metadata-polarimetric-calibration-matrices</w:t>
+        <w:t xml:space="preserve">src-polcal</w:t>
       </w:r>
     </w:p>
     <w:bookmarkStart w:id="94" w:name="threshold-requirements-15"/>
@@ -4167,7 +4215,7 @@
     </w:p>
     <w:bookmarkEnd w:id="96"/>
     <w:bookmarkEnd w:id="97"/>
-    <w:bookmarkStart w:id="101" w:name="X5b1ceaf4a0f14a39998a160329b697f4fdfe671"/>
+    <w:bookmarkStart w:id="101" w:name="sec:src-mfrang"/>
     <w:p>
       <w:pPr>
         <w:pStyle w:val="berschrift4"/>
@@ -4199,7 +4247,7 @@
         <w:rPr>
           <w:rStyle w:val="VerbatimChar"/>
         </w:rPr>
-        <w:t xml:space="preserve">src.metadata-mean-faraday-rotation-angle</w:t>
+        <w:t xml:space="preserve">src-mfrang</w:t>
       </w:r>
     </w:p>
     <w:bookmarkStart w:id="98" w:name="threshold-requirements-16"/>
@@ -4307,7 +4355,7 @@
     </w:p>
     <w:bookmarkEnd w:id="100"/>
     <w:bookmarkEnd w:id="101"/>
-    <w:bookmarkStart w:id="105" w:name="sec:src.metadata-ionosphere-indicator"/>
+    <w:bookmarkStart w:id="105" w:name="sec:src-ionind"/>
     <w:p>
       <w:pPr>
         <w:pStyle w:val="berschrift4"/>
@@ -4339,7 +4387,7 @@
         <w:rPr>
           <w:rStyle w:val="VerbatimChar"/>
         </w:rPr>
-        <w:t xml:space="preserve">src.metadata-ionosphere-indicator</w:t>
+        <w:t xml:space="preserve">src-ionind</w:t>
       </w:r>
     </w:p>
     <w:bookmarkStart w:id="102" w:name="threshold-requirements-17"/>
@@ -4485,7 +4533,7 @@
         <w:t xml:space="preserve">Information related to the CEOS-ARD product generation procedure and geographic parameters.</w:t>
       </w:r>
     </w:p>
-    <w:bookmarkStart w:id="110" w:name="sec:prd.metadata-data-access-product"/>
+    <w:bookmarkStart w:id="110" w:name="sec:prd-dacprd"/>
     <w:p>
       <w:pPr>
         <w:pStyle w:val="berschrift4"/>
@@ -4517,7 +4565,7 @@
         <w:rPr>
           <w:rStyle w:val="VerbatimChar"/>
         </w:rPr>
-        <w:t xml:space="preserve">prd.metadata-data-access-product</w:t>
+        <w:t xml:space="preserve">prd-dacprd</w:t>
       </w:r>
     </w:p>
     <w:bookmarkStart w:id="107" w:name="threshold-requirements-18"/>
@@ -4670,7 +4718,7 @@
     </w:p>
     <w:bookmarkEnd w:id="109"/>
     <w:bookmarkEnd w:id="110"/>
-    <w:bookmarkStart w:id="114" w:name="sec:prd.metadata-auxiliary-data"/>
+    <w:bookmarkStart w:id="114" w:name="sec:prd-auxdat"/>
     <w:p>
       <w:pPr>
         <w:pStyle w:val="berschrift4"/>
@@ -4702,7 +4750,7 @@
         <w:rPr>
           <w:rStyle w:val="VerbatimChar"/>
         </w:rPr>
-        <w:t xml:space="preserve">prd.metadata-auxiliary-data</w:t>
+        <w:t xml:space="preserve">prd-auxdat</w:t>
       </w:r>
     </w:p>
     <w:bookmarkStart w:id="111" w:name="threshold-requirements-19"/>
@@ -4830,7 +4878,7 @@
     </w:p>
     <w:bookmarkEnd w:id="113"/>
     <w:bookmarkEnd w:id="114"/>
-    <w:bookmarkStart w:id="118" w:name="sec:prd.metadata-sample-spacing"/>
+    <w:bookmarkStart w:id="118" w:name="sec:prd-smpspc"/>
     <w:p>
       <w:pPr>
         <w:pStyle w:val="berschrift4"/>
@@ -4862,7 +4910,7 @@
         <w:rPr>
           <w:rStyle w:val="VerbatimChar"/>
         </w:rPr>
-        <w:t xml:space="preserve">prd.metadata-sample-spacing</w:t>
+        <w:t xml:space="preserve">prd-smpspc</w:t>
       </w:r>
     </w:p>
     <w:bookmarkStart w:id="115" w:name="threshold-requirements-20"/>
@@ -4994,7 +5042,7 @@
     </w:p>
     <w:bookmarkEnd w:id="117"/>
     <w:bookmarkEnd w:id="118"/>
-    <w:bookmarkStart w:id="122" w:name="sec:prd.metadata-resolution"/>
+    <w:bookmarkStart w:id="122" w:name="sec:prd-resol"/>
     <w:p>
       <w:pPr>
         <w:pStyle w:val="berschrift4"/>
@@ -5026,7 +5074,7 @@
         <w:rPr>
           <w:rStyle w:val="VerbatimChar"/>
         </w:rPr>
-        <w:t xml:space="preserve">prd.metadata-resolution</w:t>
+        <w:t xml:space="preserve">prd-resol</w:t>
       </w:r>
     </w:p>
     <w:bookmarkStart w:id="119" w:name="threshold-requirements-21"/>
@@ -5158,7 +5206,7 @@
     </w:p>
     <w:bookmarkEnd w:id="121"/>
     <w:bookmarkEnd w:id="122"/>
-    <w:bookmarkStart w:id="126" w:name="sec:prd.metadata-geo-bbox"/>
+    <w:bookmarkStart w:id="126" w:name="sec:prd-geobx"/>
     <w:p>
       <w:pPr>
         <w:pStyle w:val="berschrift4"/>
@@ -5190,7 +5238,7 @@
         <w:rPr>
           <w:rStyle w:val="VerbatimChar"/>
         </w:rPr>
-        <w:t xml:space="preserve">prd.metadata-geo-bbox</w:t>
+        <w:t xml:space="preserve">prd-geobx</w:t>
       </w:r>
     </w:p>
     <w:bookmarkStart w:id="123" w:name="threshold-requirements-22"/>
@@ -5218,7 +5266,7 @@
       <w:r>
         <w:t xml:space="preserve">“</w:t>
       </w:r>
-      <w:hyperlink w:anchor="sec:prd.metadata-crs">
+      <w:hyperlink w:anchor="sec:prd-crs">
         <w:r>
           <w:rPr>
             <w:rStyle w:val="Hyperlink"/>
@@ -5341,7 +5389,7 @@
     </w:p>
     <w:bookmarkEnd w:id="125"/>
     <w:bookmarkEnd w:id="126"/>
-    <w:bookmarkStart w:id="130" w:name="sec:prd.metadata-geo-area"/>
+    <w:bookmarkStart w:id="130" w:name="sec:prd-geoare"/>
     <w:p>
       <w:pPr>
         <w:pStyle w:val="berschrift4"/>
@@ -5373,7 +5421,7 @@
         <w:rPr>
           <w:rStyle w:val="VerbatimChar"/>
         </w:rPr>
-        <w:t xml:space="preserve">prd.metadata-geo-area</w:t>
+        <w:t xml:space="preserve">prd-geoare</w:t>
       </w:r>
     </w:p>
     <w:bookmarkStart w:id="127" w:name="threshold-requirements-23"/>
@@ -5481,7 +5529,7 @@
     </w:p>
     <w:bookmarkEnd w:id="129"/>
     <w:bookmarkEnd w:id="130"/>
-    <w:bookmarkStart w:id="134" w:name="sec:prd.metadata-image-size"/>
+    <w:bookmarkStart w:id="134" w:name="sec:prd-imgsiz"/>
     <w:p>
       <w:pPr>
         <w:pStyle w:val="berschrift4"/>
@@ -5513,7 +5561,7 @@
         <w:rPr>
           <w:rStyle w:val="VerbatimChar"/>
         </w:rPr>
-        <w:t xml:space="preserve">prd.metadata-image-size</w:t>
+        <w:t xml:space="preserve">prd-imgsiz</w:t>
       </w:r>
     </w:p>
     <w:bookmarkStart w:id="131" w:name="threshold-requirements-24"/>
@@ -5669,7 +5717,7 @@
     </w:p>
     <w:bookmarkEnd w:id="133"/>
     <w:bookmarkEnd w:id="134"/>
-    <w:bookmarkStart w:id="138" w:name="Xec46cf7db597e44ff2abc275345728e361b06e7"/>
+    <w:bookmarkStart w:id="138" w:name="sec:prd-pxconv"/>
     <w:p>
       <w:pPr>
         <w:pStyle w:val="berschrift4"/>
@@ -5701,7 +5749,7 @@
         <w:rPr>
           <w:rStyle w:val="VerbatimChar"/>
         </w:rPr>
-        <w:t xml:space="preserve">prd.metadata-pixel-coordinate-convention</w:t>
+        <w:t xml:space="preserve">prd-pxconv</w:t>
       </w:r>
     </w:p>
     <w:bookmarkStart w:id="135" w:name="threshold-requirements-25"/>
@@ -5815,7 +5863,7 @@
     </w:p>
     <w:bookmarkEnd w:id="137"/>
     <w:bookmarkEnd w:id="138"/>
-    <w:bookmarkStart w:id="142" w:name="sec:prd.metadata-crs"/>
+    <w:bookmarkStart w:id="142" w:name="sec:prd-crs"/>
     <w:p>
       <w:pPr>
         <w:pStyle w:val="berschrift4"/>
@@ -5847,7 +5895,7 @@
         <w:rPr>
           <w:rStyle w:val="VerbatimChar"/>
         </w:rPr>
-        <w:t xml:space="preserve">prd.metadata-crs</w:t>
+        <w:t xml:space="preserve">prd-crs</w:t>
       </w:r>
     </w:p>
     <w:bookmarkStart w:id="139" w:name="threshold-requirements-26"/>
@@ -5961,7 +6009,7 @@
     </w:p>
     <w:bookmarkEnd w:id="141"/>
     <w:bookmarkEnd w:id="142"/>
-    <w:bookmarkStart w:id="146" w:name="sec:prd.metadata-radar-unit-look-vector"/>
+    <w:bookmarkStart w:id="146" w:name="sec:prd-rulvec"/>
     <w:p>
       <w:pPr>
         <w:pStyle w:val="berschrift4"/>
@@ -5993,7 +6041,7 @@
         <w:rPr>
           <w:rStyle w:val="VerbatimChar"/>
         </w:rPr>
-        <w:t xml:space="preserve">prd.metadata-radar-unit-look-vector</w:t>
+        <w:t xml:space="preserve">prd-rulvec</w:t>
       </w:r>
     </w:p>
     <w:bookmarkStart w:id="143" w:name="threshold-requirements-27"/>
@@ -6029,7 +6077,7 @@
       <w:r>
         <w:t xml:space="preserve">“</w:t>
       </w:r>
-      <w:hyperlink w:anchor="X4a767b65c9b3e55e491f1d9fde6bc847c807905">
+      <w:hyperlink w:anchor="sec:pxl-pprulv">
         <w:r>
           <w:rPr>
             <w:rStyle w:val="Hyperlink"/>
@@ -6148,7 +6196,7 @@
     </w:p>
     <w:bookmarkEnd w:id="145"/>
     <w:bookmarkEnd w:id="146"/>
-    <w:bookmarkStart w:id="150" w:name="sec:prd.metadata-slant-range"/>
+    <w:bookmarkStart w:id="150" w:name="sec:prd-sltrng"/>
     <w:p>
       <w:pPr>
         <w:pStyle w:val="berschrift4"/>
@@ -6180,7 +6228,7 @@
         <w:rPr>
           <w:rStyle w:val="VerbatimChar"/>
         </w:rPr>
-        <w:t xml:space="preserve">prd.metadata-slant-range</w:t>
+        <w:t xml:space="preserve">prd-sltrng</w:t>
       </w:r>
     </w:p>
     <w:bookmarkStart w:id="147" w:name="threshold-requirements-28"/>
@@ -6210,7 +6258,7 @@
       <w:r>
         <w:t xml:space="preserve">“</w:t>
       </w:r>
-      <w:hyperlink w:anchor="sec:pxl.per-pixel-slant-range">
+      <w:hyperlink w:anchor="sec:pxl-ppslrg">
         <w:r>
           <w:rPr>
             <w:rStyle w:val="Hyperlink"/>
@@ -6329,7 +6377,7 @@
     </w:p>
     <w:bookmarkEnd w:id="149"/>
     <w:bookmarkEnd w:id="150"/>
-    <w:bookmarkStart w:id="154" w:name="sec:prd.metadata-orbit-reference-gslc"/>
+    <w:bookmarkStart w:id="154" w:name="sec:prd-orbgsl"/>
     <w:p>
       <w:pPr>
         <w:pStyle w:val="berschrift4"/>
@@ -6361,7 +6409,7 @@
         <w:rPr>
           <w:rStyle w:val="VerbatimChar"/>
         </w:rPr>
-        <w:t xml:space="preserve">prd.metadata-orbit-reference-gslc</w:t>
+        <w:t xml:space="preserve">prd-orbgsl</w:t>
       </w:r>
     </w:p>
     <w:p>
@@ -6558,7 +6606,7 @@
         <w:t xml:space="preserve">Per-pixel metadata should allow users to discriminate between (choose) observations on the basis of their individual suitability for applications.</w:t>
       </w:r>
     </w:p>
-    <w:bookmarkStart w:id="159" w:name="sec:pxl.cloud-optimized-formats"/>
+    <w:bookmarkStart w:id="159" w:name="sec:pxl-cldopt"/>
     <w:p>
       <w:pPr>
         <w:pStyle w:val="berschrift4"/>
@@ -6590,7 +6638,7 @@
         <w:rPr>
           <w:rStyle w:val="VerbatimChar"/>
         </w:rPr>
-        <w:t xml:space="preserve">pxl.cloud-optimized-formats</w:t>
+        <w:t xml:space="preserve">pxl-cldopt</w:t>
       </w:r>
     </w:p>
     <w:bookmarkStart w:id="156" w:name="threshold-requirements-30"/>
@@ -6698,7 +6746,7 @@
     </w:p>
     <w:bookmarkEnd w:id="158"/>
     <w:bookmarkEnd w:id="159"/>
-    <w:bookmarkStart w:id="163" w:name="sec:pxl.metadata-machine-readability-sar"/>
+    <w:bookmarkStart w:id="163" w:name="sec:pxl-mrdsar"/>
     <w:p>
       <w:pPr>
         <w:pStyle w:val="berschrift4"/>
@@ -6730,7 +6778,7 @@
         <w:rPr>
           <w:rStyle w:val="VerbatimChar"/>
         </w:rPr>
-        <w:t xml:space="preserve">pxl.metadata-machine-readability-sar</w:t>
+        <w:t xml:space="preserve">pxl-mrdsar</w:t>
       </w:r>
     </w:p>
     <w:bookmarkStart w:id="160" w:name="threshold-requirements-31"/>
@@ -6835,7 +6883,7 @@
     </w:p>
     <w:bookmarkEnd w:id="162"/>
     <w:bookmarkEnd w:id="163"/>
-    <w:bookmarkStart w:id="167" w:name="sec:pxl.per-pixel-data-mask"/>
+    <w:bookmarkStart w:id="167" w:name="sec:pxl-ppmask"/>
     <w:p>
       <w:pPr>
         <w:pStyle w:val="berschrift4"/>
@@ -6867,7 +6915,7 @@
         <w:rPr>
           <w:rStyle w:val="VerbatimChar"/>
         </w:rPr>
-        <w:t xml:space="preserve">pxl.per-pixel-data-mask</w:t>
+        <w:t xml:space="preserve">pxl-ppmask</w:t>
       </w:r>
     </w:p>
     <w:bookmarkStart w:id="164" w:name="threshold-requirements-32"/>
@@ -7160,7 +7208,7 @@
     </w:p>
     <w:bookmarkEnd w:id="166"/>
     <w:bookmarkEnd w:id="167"/>
-    <w:bookmarkStart w:id="171" w:name="sec:pxl.per-pixel-scattering-area"/>
+    <w:bookmarkStart w:id="171" w:name="sec:pxl-ppscta"/>
     <w:p>
       <w:pPr>
         <w:pStyle w:val="berschrift4"/>
@@ -7192,7 +7240,7 @@
         <w:rPr>
           <w:rStyle w:val="VerbatimChar"/>
         </w:rPr>
-        <w:t xml:space="preserve">pxl.per-pixel-scattering-area</w:t>
+        <w:t xml:space="preserve">pxl-ppscta</w:t>
       </w:r>
     </w:p>
     <w:p>
@@ -7466,7 +7514,7 @@
     </w:p>
     <w:bookmarkEnd w:id="170"/>
     <w:bookmarkEnd w:id="171"/>
-    <w:bookmarkStart w:id="175" w:name="sec:pxl.per-pixel-local-incident-angle"/>
+    <w:bookmarkStart w:id="175" w:name="sec:pxl-pplia"/>
     <w:p>
       <w:pPr>
         <w:pStyle w:val="berschrift4"/>
@@ -7498,7 +7546,7 @@
         <w:rPr>
           <w:rStyle w:val="VerbatimChar"/>
         </w:rPr>
-        <w:t xml:space="preserve">pxl.per-pixel-local-incident-angle</w:t>
+        <w:t xml:space="preserve">pxl-pplia</w:t>
       </w:r>
     </w:p>
     <w:bookmarkStart w:id="172" w:name="threshold-requirements-34"/>
@@ -7694,7 +7742,7 @@
     </w:p>
     <w:bookmarkEnd w:id="174"/>
     <w:bookmarkEnd w:id="175"/>
-    <w:bookmarkStart w:id="179" w:name="X42862d8fb19a6b32ebc3398b92b86f6abe50bf3"/>
+    <w:bookmarkStart w:id="179" w:name="sec:pxl-ppelia"/>
     <w:p>
       <w:pPr>
         <w:pStyle w:val="berschrift4"/>
@@ -7726,7 +7774,7 @@
         <w:rPr>
           <w:rStyle w:val="VerbatimChar"/>
         </w:rPr>
-        <w:t xml:space="preserve">pxl.per-pixel-ellipsoidal-incident-angle</w:t>
+        <w:t xml:space="preserve">pxl-ppelia</w:t>
       </w:r>
     </w:p>
     <w:bookmarkStart w:id="176" w:name="threshold-requirements-35"/>
@@ -7934,7 +7982,7 @@
     </w:p>
     <w:bookmarkEnd w:id="178"/>
     <w:bookmarkEnd w:id="179"/>
-    <w:bookmarkStart w:id="183" w:name="sec:pxl.per-pixel-noise-power"/>
+    <w:bookmarkStart w:id="183" w:name="sec:pxl-ppnspw"/>
     <w:p>
       <w:pPr>
         <w:pStyle w:val="berschrift4"/>
@@ -7966,7 +8014,7 @@
         <w:rPr>
           <w:rStyle w:val="VerbatimChar"/>
         </w:rPr>
-        <w:t xml:space="preserve">pxl.per-pixel-noise-power</w:t>
+        <w:t xml:space="preserve">pxl-ppnspw</w:t>
       </w:r>
     </w:p>
     <w:bookmarkStart w:id="180" w:name="threshold-requirements-36"/>
@@ -8268,7 +8316,7 @@
     </w:p>
     <w:bookmarkEnd w:id="182"/>
     <w:bookmarkEnd w:id="183"/>
-    <w:bookmarkStart w:id="187" w:name="sec:pxl.per-pixel-gamma-sigma-ratio"/>
+    <w:bookmarkStart w:id="187" w:name="sec:pxl-ppgmsg"/>
     <w:p>
       <w:pPr>
         <w:pStyle w:val="berschrift4"/>
@@ -8300,7 +8348,7 @@
         <w:rPr>
           <w:rStyle w:val="VerbatimChar"/>
         </w:rPr>
-        <w:t xml:space="preserve">pxl.per-pixel-gamma-sigma-ratio</w:t>
+        <w:t xml:space="preserve">pxl-ppgmsg</w:t>
       </w:r>
     </w:p>
     <w:bookmarkStart w:id="184" w:name="threshold-requirements-37"/>
@@ -8541,7 +8589,7 @@
     </w:p>
     <w:bookmarkEnd w:id="186"/>
     <w:bookmarkEnd w:id="187"/>
-    <w:bookmarkStart w:id="191" w:name="sec:pxl.per-pixel-acquisition-id"/>
+    <w:bookmarkStart w:id="191" w:name="sec:pxl-ppacqd"/>
     <w:p>
       <w:pPr>
         <w:pStyle w:val="berschrift4"/>
@@ -8573,7 +8621,7 @@
         <w:rPr>
           <w:rStyle w:val="VerbatimChar"/>
         </w:rPr>
-        <w:t xml:space="preserve">pxl.per-pixel-acquisition-id</w:t>
+        <w:t xml:space="preserve">pxl-ppacqd</w:t>
       </w:r>
     </w:p>
     <w:bookmarkStart w:id="188" w:name="threshold-requirements-38"/>
@@ -8615,7 +8663,7 @@
       <w:r>
         <w:t xml:space="preserve">“</w:t>
       </w:r>
-      <w:hyperlink w:anchor="sec:src.metadata-acquisition-id">
+      <w:hyperlink w:anchor="sec:src-acqid">
         <w:r>
           <w:rPr>
             <w:rStyle w:val="Hyperlink"/>
@@ -8805,7 +8853,7 @@
     </w:p>
     <w:bookmarkEnd w:id="190"/>
     <w:bookmarkEnd w:id="191"/>
-    <w:bookmarkStart w:id="195" w:name="sec:pxl.per-pixel-dem"/>
+    <w:bookmarkStart w:id="195" w:name="sec:pxl-ppdem"/>
     <w:p>
       <w:pPr>
         <w:pStyle w:val="berschrift4"/>
@@ -8837,7 +8885,7 @@
         <w:rPr>
           <w:rStyle w:val="VerbatimChar"/>
         </w:rPr>
-        <w:t xml:space="preserve">pxl.per-pixel-dem</w:t>
+        <w:t xml:space="preserve">pxl-ppdem</w:t>
       </w:r>
     </w:p>
     <w:bookmarkStart w:id="192" w:name="threshold-requirements-39"/>
@@ -9021,7 +9069,7 @@
     </w:p>
     <w:bookmarkEnd w:id="194"/>
     <w:bookmarkEnd w:id="195"/>
-    <w:bookmarkStart w:id="199" w:name="X4a767b65c9b3e55e491f1d9fde6bc847c807905"/>
+    <w:bookmarkStart w:id="199" w:name="sec:pxl-pprulv"/>
     <w:p>
       <w:pPr>
         <w:pStyle w:val="berschrift4"/>
@@ -9053,7 +9101,7 @@
         <w:rPr>
           <w:rStyle w:val="VerbatimChar"/>
         </w:rPr>
-        <w:t xml:space="preserve">pxl.per-pixel-radar-unit-look-vector-grid</w:t>
+        <w:t xml:space="preserve">pxl-pprulv</w:t>
       </w:r>
     </w:p>
     <w:bookmarkStart w:id="196" w:name="threshold-requirements-40"/>
@@ -9235,7 +9283,7 @@
     </w:p>
     <w:bookmarkEnd w:id="198"/>
     <w:bookmarkEnd w:id="199"/>
-    <w:bookmarkStart w:id="203" w:name="sec:pxl.per-pixel-slant-range"/>
+    <w:bookmarkStart w:id="203" w:name="sec:pxl-ppslrg"/>
     <w:p>
       <w:pPr>
         <w:pStyle w:val="berschrift4"/>
@@ -9267,7 +9315,7 @@
         <w:rPr>
           <w:rStyle w:val="VerbatimChar"/>
         </w:rPr>
-        <w:t xml:space="preserve">pxl.per-pixel-slant-range</w:t>
+        <w:t xml:space="preserve">pxl-ppslrg</w:t>
       </w:r>
     </w:p>
     <w:bookmarkStart w:id="200" w:name="threshold-requirements-41"/>
@@ -9443,7 +9491,7 @@
     </w:p>
     <w:bookmarkEnd w:id="202"/>
     <w:bookmarkEnd w:id="203"/>
-    <w:bookmarkStart w:id="207" w:name="X9cea8c1dc7d93ab6e879d448c9c5cce0283a0a4"/>
+    <w:bookmarkStart w:id="207" w:name="sec:pxl-ppiphu"/>
     <w:p>
       <w:pPr>
         <w:pStyle w:val="berschrift4"/>
@@ -9475,7 +9523,7 @@
         <w:rPr>
           <w:rStyle w:val="VerbatimChar"/>
         </w:rPr>
-        <w:t xml:space="preserve">pxl.per-pixel-insar-phase-uncertainty</w:t>
+        <w:t xml:space="preserve">pxl-ppiphu</w:t>
       </w:r>
     </w:p>
     <w:bookmarkStart w:id="204" w:name="threshold-requirements-42"/>
@@ -9663,7 +9711,7 @@
     </w:p>
     <w:bookmarkEnd w:id="206"/>
     <w:bookmarkEnd w:id="207"/>
-    <w:bookmarkStart w:id="211" w:name="Xa3b9db384be8b06d0339bf20ea6c91c101142b9"/>
+    <w:bookmarkStart w:id="211" w:name="sec:pxl-ppatpc"/>
     <w:p>
       <w:pPr>
         <w:pStyle w:val="berschrift4"/>
@@ -9695,7 +9743,7 @@
         <w:rPr>
           <w:rStyle w:val="VerbatimChar"/>
         </w:rPr>
-        <w:t xml:space="preserve">pxl.per-pixel-atmospheric-phase-correction</w:t>
+        <w:t xml:space="preserve">pxl-ppatpc</w:t>
       </w:r>
     </w:p>
     <w:bookmarkStart w:id="208" w:name="threshold-requirements-43"/>
@@ -9877,7 +9925,7 @@
     </w:p>
     <w:bookmarkEnd w:id="210"/>
     <w:bookmarkEnd w:id="211"/>
-    <w:bookmarkStart w:id="215" w:name="Xc47e4e371c5fc37a0b150c394967999a57df9cc"/>
+    <w:bookmarkStart w:id="215" w:name="sec:pxl-ppionc"/>
     <w:p>
       <w:pPr>
         <w:pStyle w:val="berschrift4"/>
@@ -9909,7 +9957,7 @@
         <w:rPr>
           <w:rStyle w:val="VerbatimChar"/>
         </w:rPr>
-        <w:t xml:space="preserve">pxl.per-pixel-ionospheric-phase-correction</w:t>
+        <w:t xml:space="preserve">pxl-ppionc</w:t>
       </w:r>
     </w:p>
     <w:bookmarkStart w:id="212" w:name="threshold-requirements-44"/>
@@ -10129,7 +10177,7 @@
         <w:t xml:space="preserve">The requirements below must be met for all pixels/samples/observations in a collection.</w:t>
       </w:r>
     </w:p>
-    <w:bookmarkStart w:id="220" w:name="sec:rcm.cloud-optimized-formats"/>
+    <w:bookmarkStart w:id="220" w:name="sec:rcm-cldopt"/>
     <w:p>
       <w:pPr>
         <w:pStyle w:val="berschrift4"/>
@@ -10161,7 +10209,7 @@
         <w:rPr>
           <w:rStyle w:val="VerbatimChar"/>
         </w:rPr>
-        <w:t xml:space="preserve">rcm.cloud-optimized-formats</w:t>
+        <w:t xml:space="preserve">rcm-cldopt</w:t>
       </w:r>
     </w:p>
     <w:bookmarkStart w:id="217" w:name="threshold-requirements-45"/>
@@ -10269,7 +10317,7 @@
     </w:p>
     <w:bookmarkEnd w:id="219"/>
     <w:bookmarkEnd w:id="220"/>
-    <w:bookmarkStart w:id="224" w:name="sec:rcm.measurements-backscatter-gslc"/>
+    <w:bookmarkStart w:id="224" w:name="sec:rcm-bsgslc"/>
     <w:p>
       <w:pPr>
         <w:pStyle w:val="berschrift4"/>
@@ -10301,7 +10349,7 @@
         <w:rPr>
           <w:rStyle w:val="VerbatimChar"/>
         </w:rPr>
-        <w:t xml:space="preserve">rcm.measurements-backscatter-gslc</w:t>
+        <w:t xml:space="preserve">rcm-bsgslc</w:t>
       </w:r>
     </w:p>
     <w:bookmarkStart w:id="221" w:name="threshold-requirements-46"/>
@@ -10543,7 +10591,7 @@
     </w:p>
     <w:bookmarkEnd w:id="223"/>
     <w:bookmarkEnd w:id="224"/>
-    <w:bookmarkStart w:id="228" w:name="sec:rcm.metadata-scaling-conversion"/>
+    <w:bookmarkStart w:id="228" w:name="sec:rcm-sclcnv"/>
     <w:p>
       <w:pPr>
         <w:pStyle w:val="berschrift4"/>
@@ -10575,7 +10623,7 @@
         <w:rPr>
           <w:rStyle w:val="VerbatimChar"/>
         </w:rPr>
-        <w:t xml:space="preserve">rcm.metadata-scaling-conversion</w:t>
+        <w:t xml:space="preserve">rcm-sclcnv</w:t>
       </w:r>
     </w:p>
     <w:bookmarkStart w:id="225" w:name="threshold-requirements-47"/>
@@ -10680,7 +10728,7 @@
     </w:p>
     <w:bookmarkEnd w:id="227"/>
     <w:bookmarkEnd w:id="228"/>
-    <w:bookmarkStart w:id="232" w:name="sec:rcm.metadata-noise-removal"/>
+    <w:bookmarkStart w:id="232" w:name="sec:rcm-nzrmvl"/>
     <w:p>
       <w:pPr>
         <w:pStyle w:val="berschrift4"/>
@@ -10712,7 +10760,7 @@
         <w:rPr>
           <w:rStyle w:val="VerbatimChar"/>
         </w:rPr>
-        <w:t xml:space="preserve">rcm.metadata-noise-removal</w:t>
+        <w:t xml:space="preserve">rcm-nzrmvl</w:t>
       </w:r>
     </w:p>
     <w:bookmarkStart w:id="229" w:name="threshold-requirements-48"/>
@@ -10846,7 +10894,7 @@
     </w:p>
     <w:bookmarkEnd w:id="231"/>
     <w:bookmarkEnd w:id="232"/>
-    <w:bookmarkStart w:id="236" w:name="Xd6675c55486937f37e5d356fc5bd87194fd6912"/>
+    <w:bookmarkStart w:id="236" w:name="sec:rcm-rtagsl"/>
     <w:p>
       <w:pPr>
         <w:pStyle w:val="berschrift4"/>
@@ -10878,7 +10926,7 @@
         <w:rPr>
           <w:rStyle w:val="VerbatimChar"/>
         </w:rPr>
-        <w:t xml:space="preserve">rcm.corrections-radiometric-terrain-algo-gslc</w:t>
+        <w:t xml:space="preserve">rcm-rtagsl</w:t>
       </w:r>
     </w:p>
     <w:bookmarkStart w:id="233" w:name="threshold-requirements-49"/>
@@ -11086,7 +11134,7 @@
     </w:p>
     <w:bookmarkEnd w:id="235"/>
     <w:bookmarkEnd w:id="236"/>
-    <w:bookmarkStart w:id="240" w:name="X96f5cf0495ba802547027bd915355aff9549cc2"/>
+    <w:bookmarkStart w:id="240" w:name="sec:rcm-rmasar"/>
     <w:p>
       <w:pPr>
         <w:pStyle w:val="berschrift4"/>
@@ -11118,7 +11166,7 @@
         <w:rPr>
           <w:rStyle w:val="VerbatimChar"/>
         </w:rPr>
-        <w:t xml:space="preserve">rcm.metadata-radiometric-accuracy-sar</w:t>
+        <w:t xml:space="preserve">rcm-rmasar</w:t>
       </w:r>
     </w:p>
     <w:bookmarkStart w:id="237" w:name="threshold-requirements-50"/>
@@ -11301,7 +11349,7 @@
         <w:t xml:space="preserve">This section specifies any geometric correction requirements that must be met in order for the data to be analysis ready.</w:t>
       </w:r>
     </w:p>
-    <w:bookmarkStart w:id="245" w:name="X20bf532dfcc73429023dc2f9b692bfe29adce2f"/>
+    <w:bookmarkStart w:id="245" w:name="sec:gcor-gmcalg"/>
     <w:p>
       <w:pPr>
         <w:pStyle w:val="berschrift4"/>
@@ -11333,7 +11381,7 @@
         <w:rPr>
           <w:rStyle w:val="VerbatimChar"/>
         </w:rPr>
-        <w:t xml:space="preserve">gcor.metadata-geometric-correction-algorithm</w:t>
+        <w:t xml:space="preserve">gcor-gmcalg</w:t>
       </w:r>
     </w:p>
     <w:bookmarkStart w:id="242" w:name="threshold-requirements-51"/>
@@ -11509,7 +11557,7 @@
     </w:p>
     <w:bookmarkEnd w:id="244"/>
     <w:bookmarkEnd w:id="245"/>
-    <w:bookmarkStart w:id="249" w:name="sec:gcor.corrections-dem"/>
+    <w:bookmarkStart w:id="249" w:name="sec:gcor-cordem"/>
     <w:p>
       <w:pPr>
         <w:pStyle w:val="berschrift4"/>
@@ -11541,7 +11589,7 @@
         <w:rPr>
           <w:rStyle w:val="VerbatimChar"/>
         </w:rPr>
-        <w:t xml:space="preserve">gcor.corrections-dem</w:t>
+        <w:t xml:space="preserve">gcor-cordem</w:t>
       </w:r>
     </w:p>
     <w:p>
@@ -11720,7 +11768,7 @@
     </w:p>
     <w:bookmarkEnd w:id="248"/>
     <w:bookmarkEnd w:id="249"/>
-    <w:bookmarkStart w:id="253" w:name="X46df8ce20020c0edaf0af6f0a3dbcb83bfe4482"/>
+    <w:bookmarkStart w:id="253" w:name="sec:gcor-geoacr"/>
     <w:p>
       <w:pPr>
         <w:pStyle w:val="berschrift4"/>
@@ -11752,7 +11800,7 @@
         <w:rPr>
           <w:rStyle w:val="VerbatimChar"/>
         </w:rPr>
-        <w:t xml:space="preserve">gcor.corrections-geometric-accuracy-radar</w:t>
+        <w:t xml:space="preserve">gcor-geoacr</w:t>
       </w:r>
     </w:p>
     <w:bookmarkStart w:id="250" w:name="threshold-requirements-53"/>
@@ -11941,7 +11989,7 @@
     </w:p>
     <w:bookmarkEnd w:id="252"/>
     <w:bookmarkEnd w:id="253"/>
-    <w:bookmarkStart w:id="257" w:name="Xb9d365b28d724b5a0f0e58b4c1a94a1d3251d14"/>
+    <w:bookmarkStart w:id="257" w:name="sec:gcor-georfa"/>
     <w:p>
       <w:pPr>
         <w:pStyle w:val="berschrift4"/>
@@ -11973,7 +12021,7 @@
         <w:rPr>
           <w:rStyle w:val="VerbatimChar"/>
         </w:rPr>
-        <w:t xml:space="preserve">gcor.corrections-geometric-refined-accuracy</w:t>
+        <w:t xml:space="preserve">gcor-georfa</w:t>
       </w:r>
     </w:p>
     <w:bookmarkStart w:id="254" w:name="threshold-requirements-54"/>
@@ -12016,7 +12064,7 @@
       <w:r>
         <w:t xml:space="preserve">“</w:t>
       </w:r>
-      <w:hyperlink w:anchor="X46df8ce20020c0edaf0af6f0a3dbcb83bfe4482">
+      <w:hyperlink w:anchor="sec:gcor-geoacr">
         <w:r>
           <w:rPr>
             <w:rStyle w:val="Hyperlink"/>
@@ -12117,7 +12165,7 @@
     </w:p>
     <w:bookmarkEnd w:id="256"/>
     <w:bookmarkEnd w:id="257"/>
-    <w:bookmarkStart w:id="261" w:name="sec:gcor.corrections-gridding-convention"/>
+    <w:bookmarkStart w:id="261" w:name="sec:gcor-gridcv"/>
     <w:p>
       <w:pPr>
         <w:pStyle w:val="berschrift4"/>
@@ -12149,7 +12197,7 @@
         <w:rPr>
           <w:rStyle w:val="VerbatimChar"/>
         </w:rPr>
-        <w:t xml:space="preserve">gcor.corrections-gridding-convention</w:t>
+        <w:t xml:space="preserve">gcor-gridcv</w:t>
       </w:r>
     </w:p>
     <w:bookmarkStart w:id="258" w:name="threshold-requirements-55"/>
@@ -12338,6 +12386,327 @@
       </w:pPr>
       <w:r>
         <w:t xml:space="preserve">General Metadata</w:t>
+      </w:r>
+    </w:p>
+    <w:tbl>
+      <w:tblPr>
+        <w:tblStyle w:val="Table"/>
+        <w:tblW w:type="auto" w:w="0"/>
+        <w:tblLook w:firstRow="1" w:lastRow="0" w:firstColumn="0" w:lastColumn="0" w:noHBand="0" w:noVBand="0" w:val="0020"/>
+      </w:tblPr>
+      <w:tblGrid>
+        <w:gridCol w:w="1980"/>
+        <w:gridCol w:w="1980"/>
+        <w:gridCol w:w="1980"/>
+        <w:gridCol w:w="1980"/>
+      </w:tblGrid>
+      <w:tr>
+        <w:trPr>
+          <w:tblHeader w:val="on"/>
+        </w:trPr>
+        <w:tc>
+          <w:tcPr/>
+          <w:p>
+            <w:pPr>
+              <w:pStyle w:val="Compact"/>
+            </w:pPr>
+            <w:r>
+              <w:t xml:space="preserve">Requirement ID</w:t>
+            </w:r>
+          </w:p>
+        </w:tc>
+        <w:tc>
+          <w:tcPr/>
+          <w:p>
+            <w:pPr>
+              <w:pStyle w:val="Compact"/>
+            </w:pPr>
+            <w:r>
+              <w:t xml:space="preserve">Requirement Title</w:t>
+            </w:r>
+          </w:p>
+        </w:tc>
+        <w:tc>
+          <w:tcPr/>
+          <w:p>
+            <w:pPr>
+              <w:pStyle w:val="Compact"/>
+              <w:jc w:val="center"/>
+            </w:pPr>
+            <w:r>
+              <w:t xml:space="preserve">Threshold</w:t>
+            </w:r>
+          </w:p>
+        </w:tc>
+        <w:tc>
+          <w:tcPr/>
+          <w:p>
+            <w:pPr>
+              <w:pStyle w:val="Compact"/>
+              <w:jc w:val="center"/>
+            </w:pPr>
+            <w:r>
+              <w:t xml:space="preserve">Goal</w:t>
+            </w:r>
+          </w:p>
+        </w:tc>
+      </w:tr>
+      <w:tr>
+        <w:tc>
+          <w:tcPr/>
+          <w:p>
+            <w:pPr>
+              <w:pStyle w:val="Compact"/>
+            </w:pPr>
+            <w:r>
+              <w:rPr>
+                <w:rStyle w:val="VerbatimChar"/>
+              </w:rPr>
+              <w:t xml:space="preserve">meta-trcsar</w:t>
+            </w:r>
+          </w:p>
+        </w:tc>
+        <w:tc>
+          <w:tcPr/>
+          <w:p>
+            <w:pPr>
+              <w:pStyle w:val="Compact"/>
+            </w:pPr>
+            <w:r>
+              <w:t xml:space="preserve">Traceability</w:t>
+            </w:r>
+          </w:p>
+        </w:tc>
+        <w:tc>
+          <w:tcPr/>
+          <w:p>
+            <w:pPr>
+              <w:pStyle w:val="Compact"/>
+              <w:jc w:val="center"/>
+            </w:pPr>
+            <w:r>
+              <w:rPr>
+                <w:i/>
+                <w:iCs/>
+              </w:rPr>
+              <w:t xml:space="preserve">not required</w:t>
+            </w:r>
+          </w:p>
+        </w:tc>
+        <w:tc>
+          <w:tcPr/>
+          <w:p>
+            <w:pPr>
+              <w:pStyle w:val="Compact"/>
+            </w:pPr>
+          </w:p>
+        </w:tc>
+      </w:tr>
+      <w:tr>
+        <w:tc>
+          <w:tcPr/>
+          <w:p>
+            <w:pPr>
+              <w:pStyle w:val="Compact"/>
+            </w:pPr>
+            <w:r>
+              <w:rPr>
+                <w:rStyle w:val="VerbatimChar"/>
+              </w:rPr>
+              <w:t xml:space="preserve">meta-mrdsar</w:t>
+            </w:r>
+          </w:p>
+        </w:tc>
+        <w:tc>
+          <w:tcPr/>
+          <w:p>
+            <w:pPr>
+              <w:pStyle w:val="Compact"/>
+            </w:pPr>
+            <w:r>
+              <w:t xml:space="preserve">Metadata Machine Readability</w:t>
+            </w:r>
+          </w:p>
+        </w:tc>
+        <w:tc>
+          <w:tcPr/>
+          <w:p>
+            <w:pPr>
+              <w:pStyle w:val="Compact"/>
+            </w:pPr>
+          </w:p>
+        </w:tc>
+        <w:tc>
+          <w:tcPr/>
+          <w:p>
+            <w:pPr>
+              <w:pStyle w:val="Compact"/>
+            </w:pPr>
+          </w:p>
+        </w:tc>
+      </w:tr>
+      <w:tr>
+        <w:tc>
+          <w:tcPr/>
+          <w:p>
+            <w:pPr>
+              <w:pStyle w:val="Compact"/>
+            </w:pPr>
+            <w:r>
+              <w:rPr>
+                <w:rStyle w:val="VerbatimChar"/>
+              </w:rPr>
+              <w:t xml:space="preserve">meta-prdtyp</w:t>
+            </w:r>
+          </w:p>
+        </w:tc>
+        <w:tc>
+          <w:tcPr/>
+          <w:p>
+            <w:pPr>
+              <w:pStyle w:val="Compact"/>
+            </w:pPr>
+            <w:r>
+              <w:t xml:space="preserve">Product Type</w:t>
+            </w:r>
+          </w:p>
+        </w:tc>
+        <w:tc>
+          <w:tcPr/>
+          <w:p>
+            <w:pPr>
+              <w:pStyle w:val="Compact"/>
+            </w:pPr>
+          </w:p>
+        </w:tc>
+        <w:tc>
+          <w:tcPr/>
+          <w:p>
+            <w:pPr>
+              <w:pStyle w:val="Compact"/>
+              <w:jc w:val="center"/>
+            </w:pPr>
+            <w:r>
+              <w:rPr>
+                <w:i/>
+                <w:iCs/>
+              </w:rPr>
+              <w:t xml:space="preserve">as threshold</w:t>
+            </w:r>
+          </w:p>
+        </w:tc>
+      </w:tr>
+      <w:tr>
+        <w:tc>
+          <w:tcPr/>
+          <w:p>
+            <w:pPr>
+              <w:pStyle w:val="Compact"/>
+            </w:pPr>
+            <w:r>
+              <w:rPr>
+                <w:rStyle w:val="VerbatimChar"/>
+              </w:rPr>
+              <w:t xml:space="preserve">meta-pfsurl</w:t>
+            </w:r>
+          </w:p>
+        </w:tc>
+        <w:tc>
+          <w:tcPr/>
+          <w:p>
+            <w:pPr>
+              <w:pStyle w:val="Compact"/>
+            </w:pPr>
+            <w:r>
+              <w:t xml:space="preserve">Document Identifier</w:t>
+            </w:r>
+          </w:p>
+        </w:tc>
+        <w:tc>
+          <w:tcPr/>
+          <w:p>
+            <w:pPr>
+              <w:pStyle w:val="Compact"/>
+            </w:pPr>
+          </w:p>
+        </w:tc>
+        <w:tc>
+          <w:tcPr/>
+          <w:p>
+            <w:pPr>
+              <w:pStyle w:val="Compact"/>
+              <w:jc w:val="center"/>
+            </w:pPr>
+            <w:r>
+              <w:rPr>
+                <w:i/>
+                <w:iCs/>
+              </w:rPr>
+              <w:t xml:space="preserve">as threshold</w:t>
+            </w:r>
+          </w:p>
+        </w:tc>
+      </w:tr>
+      <w:tr>
+        <w:tc>
+          <w:tcPr/>
+          <w:p>
+            <w:pPr>
+              <w:pStyle w:val="Compact"/>
+            </w:pPr>
+            <w:r>
+              <w:rPr>
+                <w:rStyle w:val="VerbatimChar"/>
+              </w:rPr>
+              <w:t xml:space="preserve">meta-timsar</w:t>
+            </w:r>
+          </w:p>
+        </w:tc>
+        <w:tc>
+          <w:tcPr/>
+          <w:p>
+            <w:pPr>
+              <w:pStyle w:val="Compact"/>
+            </w:pPr>
+            <w:r>
+              <w:t xml:space="preserve">Data Collection Time</w:t>
+            </w:r>
+          </w:p>
+        </w:tc>
+        <w:tc>
+          <w:tcPr/>
+          <w:p>
+            <w:pPr>
+              <w:pStyle w:val="Compact"/>
+            </w:pPr>
+          </w:p>
+        </w:tc>
+        <w:tc>
+          <w:tcPr/>
+          <w:p>
+            <w:pPr>
+              <w:pStyle w:val="Compact"/>
+              <w:jc w:val="center"/>
+            </w:pPr>
+            <w:r>
+              <w:rPr>
+                <w:i/>
+                <w:iCs/>
+              </w:rPr>
+              <w:t xml:space="preserve">as threshold</w:t>
+            </w:r>
+          </w:p>
+        </w:tc>
+      </w:tr>
+    </w:tbl>
+    <w:bookmarkEnd w:id="264"/>
+    <w:bookmarkStart w:id="265" w:name="source-metadata"/>
+    <w:p>
+      <w:pPr>
+        <w:pStyle w:val="berschrift3"/>
+      </w:pPr>
+      <w:r>
+        <w:t xml:space="preserve">Source Metadata</w:t>
       </w:r>
     </w:p>
     <w:tbl>
@@ -12415,7 +12784,7 @@
               <w:rPr>
                 <w:rStyle w:val="VerbatimChar"/>
               </w:rPr>
-              <w:t xml:space="preserve">meta.metadata-traceability-sar</w:t>
+              <w:t xml:space="preserve">src-acqid</w:t>
             </w:r>
           </w:p>
         </w:tc>
@@ -12426,7 +12795,375 @@
               <w:pStyle w:val="Compact"/>
             </w:pPr>
             <w:r>
-              <w:t xml:space="preserve">Traceability</w:t>
+              <w:t xml:space="preserve">Acquisition ID</w:t>
+            </w:r>
+          </w:p>
+        </w:tc>
+        <w:tc>
+          <w:tcPr/>
+          <w:p>
+            <w:pPr>
+              <w:pStyle w:val="Compact"/>
+            </w:pPr>
+          </w:p>
+        </w:tc>
+        <w:tc>
+          <w:tcPr/>
+          <w:p>
+            <w:pPr>
+              <w:pStyle w:val="Compact"/>
+              <w:jc w:val="center"/>
+            </w:pPr>
+            <w:r>
+              <w:rPr>
+                <w:i/>
+                <w:iCs/>
+              </w:rPr>
+              <w:t xml:space="preserve">as threshold</w:t>
+            </w:r>
+          </w:p>
+        </w:tc>
+      </w:tr>
+      <w:tr>
+        <w:tc>
+          <w:tcPr/>
+          <w:p>
+            <w:pPr>
+              <w:pStyle w:val="Compact"/>
+            </w:pPr>
+            <w:r>
+              <w:rPr>
+                <w:rStyle w:val="VerbatimChar"/>
+              </w:rPr>
+              <w:t xml:space="preserve">src-dacsrc</w:t>
+            </w:r>
+          </w:p>
+        </w:tc>
+        <w:tc>
+          <w:tcPr/>
+          <w:p>
+            <w:pPr>
+              <w:pStyle w:val="Compact"/>
+            </w:pPr>
+            <w:r>
+              <w:t xml:space="preserve">Source Data Access</w:t>
+            </w:r>
+          </w:p>
+        </w:tc>
+        <w:tc>
+          <w:tcPr/>
+          <w:p>
+            <w:pPr>
+              <w:pStyle w:val="Compact"/>
+            </w:pPr>
+          </w:p>
+        </w:tc>
+        <w:tc>
+          <w:tcPr/>
+          <w:p>
+            <w:pPr>
+              <w:pStyle w:val="Compact"/>
+            </w:pPr>
+          </w:p>
+        </w:tc>
+      </w:tr>
+      <w:tr>
+        <w:tc>
+          <w:tcPr/>
+          <w:p>
+            <w:pPr>
+              <w:pStyle w:val="Compact"/>
+            </w:pPr>
+            <w:r>
+              <w:rPr>
+                <w:rStyle w:val="VerbatimChar"/>
+              </w:rPr>
+              <w:t xml:space="preserve">src-inssar</w:t>
+            </w:r>
+          </w:p>
+        </w:tc>
+        <w:tc>
+          <w:tcPr/>
+          <w:p>
+            <w:pPr>
+              <w:pStyle w:val="Compact"/>
+            </w:pPr>
+            <w:r>
+              <w:t xml:space="preserve">Instrument</w:t>
+            </w:r>
+          </w:p>
+        </w:tc>
+        <w:tc>
+          <w:tcPr/>
+          <w:p>
+            <w:pPr>
+              <w:pStyle w:val="Compact"/>
+            </w:pPr>
+          </w:p>
+        </w:tc>
+        <w:tc>
+          <w:tcPr/>
+          <w:p>
+            <w:pPr>
+              <w:pStyle w:val="Compact"/>
+            </w:pPr>
+          </w:p>
+        </w:tc>
+      </w:tr>
+      <w:tr>
+        <w:tc>
+          <w:tcPr/>
+          <w:p>
+            <w:pPr>
+              <w:pStyle w:val="Compact"/>
+            </w:pPr>
+            <w:r>
+              <w:rPr>
+                <w:rStyle w:val="VerbatimChar"/>
+              </w:rPr>
+              <w:t xml:space="preserve">src-timsrc</w:t>
+            </w:r>
+          </w:p>
+        </w:tc>
+        <w:tc>
+          <w:tcPr/>
+          <w:p>
+            <w:pPr>
+              <w:pStyle w:val="Compact"/>
+            </w:pPr>
+            <w:r>
+              <w:t xml:space="preserve">Source Data Acquisition Time</w:t>
+            </w:r>
+          </w:p>
+        </w:tc>
+        <w:tc>
+          <w:tcPr/>
+          <w:p>
+            <w:pPr>
+              <w:pStyle w:val="Compact"/>
+            </w:pPr>
+          </w:p>
+        </w:tc>
+        <w:tc>
+          <w:tcPr/>
+          <w:p>
+            <w:pPr>
+              <w:pStyle w:val="Compact"/>
+              <w:jc w:val="center"/>
+            </w:pPr>
+            <w:r>
+              <w:rPr>
+                <w:i/>
+                <w:iCs/>
+              </w:rPr>
+              <w:t xml:space="preserve">as threshold</w:t>
+            </w:r>
+          </w:p>
+        </w:tc>
+      </w:tr>
+      <w:tr>
+        <w:tc>
+          <w:tcPr/>
+          <w:p>
+            <w:pPr>
+              <w:pStyle w:val="Compact"/>
+            </w:pPr>
+            <w:r>
+              <w:rPr>
+                <w:rStyle w:val="VerbatimChar"/>
+              </w:rPr>
+              <w:t xml:space="preserve">src-acqpar</w:t>
+            </w:r>
+          </w:p>
+        </w:tc>
+        <w:tc>
+          <w:tcPr/>
+          <w:p>
+            <w:pPr>
+              <w:pStyle w:val="Compact"/>
+            </w:pPr>
+            <w:r>
+              <w:t xml:space="preserve">Source Data Acquisition Parameters</w:t>
+            </w:r>
+          </w:p>
+        </w:tc>
+        <w:tc>
+          <w:tcPr/>
+          <w:p>
+            <w:pPr>
+              <w:pStyle w:val="Compact"/>
+            </w:pPr>
+          </w:p>
+        </w:tc>
+        <w:tc>
+          <w:tcPr/>
+          <w:p>
+            <w:pPr>
+              <w:pStyle w:val="Compact"/>
+              <w:jc w:val="center"/>
+            </w:pPr>
+            <w:r>
+              <w:rPr>
+                <w:i/>
+                <w:iCs/>
+              </w:rPr>
+              <w:t xml:space="preserve">as threshold</w:t>
+            </w:r>
+          </w:p>
+        </w:tc>
+      </w:tr>
+      <w:tr>
+        <w:tc>
+          <w:tcPr/>
+          <w:p>
+            <w:pPr>
+              <w:pStyle w:val="Compact"/>
+            </w:pPr>
+            <w:r>
+              <w:rPr>
+                <w:rStyle w:val="VerbatimChar"/>
+              </w:rPr>
+              <w:t xml:space="preserve">src-orbit</w:t>
+            </w:r>
+          </w:p>
+        </w:tc>
+        <w:tc>
+          <w:tcPr/>
+          <w:p>
+            <w:pPr>
+              <w:pStyle w:val="Compact"/>
+            </w:pPr>
+            <w:r>
+              <w:t xml:space="preserve">Source Data Orbit Information</w:t>
+            </w:r>
+          </w:p>
+        </w:tc>
+        <w:tc>
+          <w:tcPr/>
+          <w:p>
+            <w:pPr>
+              <w:pStyle w:val="Compact"/>
+            </w:pPr>
+          </w:p>
+        </w:tc>
+        <w:tc>
+          <w:tcPr/>
+          <w:p>
+            <w:pPr>
+              <w:pStyle w:val="Compact"/>
+            </w:pPr>
+          </w:p>
+        </w:tc>
+      </w:tr>
+      <w:tr>
+        <w:tc>
+          <w:tcPr/>
+          <w:p>
+            <w:pPr>
+              <w:pStyle w:val="Compact"/>
+            </w:pPr>
+            <w:r>
+              <w:rPr>
+                <w:rStyle w:val="VerbatimChar"/>
+              </w:rPr>
+              <w:t xml:space="preserve">src-prcpar</w:t>
+            </w:r>
+          </w:p>
+        </w:tc>
+        <w:tc>
+          <w:tcPr/>
+          <w:p>
+            <w:pPr>
+              <w:pStyle w:val="Compact"/>
+            </w:pPr>
+            <w:r>
+              <w:t xml:space="preserve">Source Data Processing Parameters</w:t>
+            </w:r>
+          </w:p>
+        </w:tc>
+        <w:tc>
+          <w:tcPr/>
+          <w:p>
+            <w:pPr>
+              <w:pStyle w:val="Compact"/>
+            </w:pPr>
+          </w:p>
+        </w:tc>
+        <w:tc>
+          <w:tcPr/>
+          <w:p>
+            <w:pPr>
+              <w:pStyle w:val="Compact"/>
+            </w:pPr>
+          </w:p>
+        </w:tc>
+      </w:tr>
+      <w:tr>
+        <w:tc>
+          <w:tcPr/>
+          <w:p>
+            <w:pPr>
+              <w:pStyle w:val="Compact"/>
+            </w:pPr>
+            <w:r>
+              <w:rPr>
+                <w:rStyle w:val="VerbatimChar"/>
+              </w:rPr>
+              <w:t xml:space="preserve">src-imgatt</w:t>
+            </w:r>
+          </w:p>
+        </w:tc>
+        <w:tc>
+          <w:tcPr/>
+          <w:p>
+            <w:pPr>
+              <w:pStyle w:val="Compact"/>
+            </w:pPr>
+            <w:r>
+              <w:t xml:space="preserve">Source Data Image Attributes</w:t>
+            </w:r>
+          </w:p>
+        </w:tc>
+        <w:tc>
+          <w:tcPr/>
+          <w:p>
+            <w:pPr>
+              <w:pStyle w:val="Compact"/>
+            </w:pPr>
+          </w:p>
+        </w:tc>
+        <w:tc>
+          <w:tcPr/>
+          <w:p>
+            <w:pPr>
+              <w:pStyle w:val="Compact"/>
+            </w:pPr>
+          </w:p>
+        </w:tc>
+      </w:tr>
+      <w:tr>
+        <w:tc>
+          <w:tcPr/>
+          <w:p>
+            <w:pPr>
+              <w:pStyle w:val="Compact"/>
+            </w:pPr>
+            <w:r>
+              <w:rPr>
+                <w:rStyle w:val="VerbatimChar"/>
+              </w:rPr>
+              <w:t xml:space="preserve">src-scasar</w:t>
+            </w:r>
+          </w:p>
+        </w:tc>
+        <w:tc>
+          <w:tcPr/>
+          <w:p>
+            <w:pPr>
+              <w:pStyle w:val="Compact"/>
+            </w:pPr>
+            <w:r>
+              <w:t xml:space="preserve">Sensor Calibration</w:t>
             </w:r>
           </w:p>
         </w:tc>
@@ -12466,7 +13203,7 @@
               <w:rPr>
                 <w:rStyle w:val="VerbatimChar"/>
               </w:rPr>
-              <w:t xml:space="preserve">meta.metadata-machine-readability-sar</w:t>
+              <w:t xml:space="preserve">src-prfind</w:t>
             </w:r>
           </w:p>
         </w:tc>
@@ -12477,7 +13214,7 @@
               <w:pStyle w:val="Compact"/>
             </w:pPr>
             <w:r>
-              <w:t xml:space="preserve">Metadata Machine Readability</w:t>
+              <w:t xml:space="preserve">Performance Indicators</w:t>
             </w:r>
           </w:p>
         </w:tc>
@@ -12509,7 +13246,7 @@
               <w:rPr>
                 <w:rStyle w:val="VerbatimChar"/>
               </w:rPr>
-              <w:t xml:space="preserve">meta.metadata-product-type-sar</w:t>
+              <w:t xml:space="preserve">src-polcal</w:t>
             </w:r>
           </w:p>
         </w:tc>
@@ -12520,16 +13257,8 @@
               <w:pStyle w:val="Compact"/>
             </w:pPr>
             <w:r>
-              <w:t xml:space="preserve">Product Type</w:t>
+              <w:t xml:space="preserve">Polarimetric Calibration Matrices</w:t>
             </w:r>
-          </w:p>
-        </w:tc>
-        <w:tc>
-          <w:tcPr/>
-          <w:p>
-            <w:pPr>
-              <w:pStyle w:val="Compact"/>
-            </w:pPr>
           </w:p>
         </w:tc>
         <w:tc>
@@ -12544,8 +13273,16 @@
                 <w:i/>
                 <w:iCs/>
               </w:rPr>
-              <w:t xml:space="preserve">as threshold</w:t>
+              <w:t xml:space="preserve">not required</w:t>
             </w:r>
+          </w:p>
+        </w:tc>
+        <w:tc>
+          <w:tcPr/>
+          <w:p>
+            <w:pPr>
+              <w:pStyle w:val="Compact"/>
+            </w:pPr>
           </w:p>
         </w:tc>
       </w:tr>
@@ -12560,7 +13297,7 @@
               <w:rPr>
                 <w:rStyle w:val="VerbatimChar"/>
               </w:rPr>
-              <w:t xml:space="preserve">meta.metadata-pfs-url</w:t>
+              <w:t xml:space="preserve">src-mfrang</w:t>
             </w:r>
           </w:p>
         </w:tc>
@@ -12571,16 +13308,8 @@
               <w:pStyle w:val="Compact"/>
             </w:pPr>
             <w:r>
-              <w:t xml:space="preserve">Document Identifier</w:t>
+              <w:t xml:space="preserve">Mean Faraday Rotation Angle</w:t>
             </w:r>
-          </w:p>
-        </w:tc>
-        <w:tc>
-          <w:tcPr/>
-          <w:p>
-            <w:pPr>
-              <w:pStyle w:val="Compact"/>
-            </w:pPr>
           </w:p>
         </w:tc>
         <w:tc>
@@ -12595,8 +13324,16 @@
                 <w:i/>
                 <w:iCs/>
               </w:rPr>
-              <w:t xml:space="preserve">as threshold</w:t>
+              <w:t xml:space="preserve">not required</w:t>
             </w:r>
+          </w:p>
+        </w:tc>
+        <w:tc>
+          <w:tcPr/>
+          <w:p>
+            <w:pPr>
+              <w:pStyle w:val="Compact"/>
+            </w:pPr>
           </w:p>
         </w:tc>
       </w:tr>
@@ -12611,7 +13348,7 @@
               <w:rPr>
                 <w:rStyle w:val="VerbatimChar"/>
               </w:rPr>
-              <w:t xml:space="preserve">meta.metadata-time-sar</w:t>
+              <w:t xml:space="preserve">src-ionind</w:t>
             </w:r>
           </w:p>
         </w:tc>
@@ -12622,16 +13359,8 @@
               <w:pStyle w:val="Compact"/>
             </w:pPr>
             <w:r>
-              <w:t xml:space="preserve">Data Collection Time</w:t>
+              <w:t xml:space="preserve">Ionosphere Indicator</w:t>
             </w:r>
-          </w:p>
-        </w:tc>
-        <w:tc>
-          <w:tcPr/>
-          <w:p>
-            <w:pPr>
-              <w:pStyle w:val="Compact"/>
-            </w:pPr>
           </w:p>
         </w:tc>
         <w:tc>
@@ -12646,20 +13375,28 @@
                 <w:i/>
                 <w:iCs/>
               </w:rPr>
-              <w:t xml:space="preserve">as threshold</w:t>
+              <w:t xml:space="preserve">not required</w:t>
             </w:r>
+          </w:p>
+        </w:tc>
+        <w:tc>
+          <w:tcPr/>
+          <w:p>
+            <w:pPr>
+              <w:pStyle w:val="Compact"/>
+            </w:pPr>
           </w:p>
         </w:tc>
       </w:tr>
     </w:tbl>
-    <w:bookmarkEnd w:id="264"/>
-    <w:bookmarkStart w:id="265" w:name="source-metadata"/>
+    <w:bookmarkEnd w:id="265"/>
+    <w:bookmarkStart w:id="266" w:name="product-metadata"/>
     <w:p>
       <w:pPr>
         <w:pStyle w:val="berschrift3"/>
       </w:pPr>
       <w:r>
-        <w:t xml:space="preserve">Source Metadata</w:t>
+        <w:t xml:space="preserve">Product Metadata</w:t>
       </w:r>
     </w:p>
     <w:tbl>
@@ -12737,7 +13474,7 @@
               <w:rPr>
                 <w:rStyle w:val="VerbatimChar"/>
               </w:rPr>
-              <w:t xml:space="preserve">src.metadata-acquisition-id</w:t>
+              <w:t xml:space="preserve">prd-dacprd</w:t>
             </w:r>
           </w:p>
         </w:tc>
@@ -12748,7 +13485,101 @@
               <w:pStyle w:val="Compact"/>
             </w:pPr>
             <w:r>
-              <w:t xml:space="preserve">Acquisition ID</w:t>
+              <w:t xml:space="preserve">Product Data Access</w:t>
+            </w:r>
+          </w:p>
+        </w:tc>
+        <w:tc>
+          <w:tcPr/>
+          <w:p>
+            <w:pPr>
+              <w:pStyle w:val="Compact"/>
+            </w:pPr>
+          </w:p>
+        </w:tc>
+        <w:tc>
+          <w:tcPr/>
+          <w:p>
+            <w:pPr>
+              <w:pStyle w:val="Compact"/>
+            </w:pPr>
+          </w:p>
+        </w:tc>
+      </w:tr>
+      <w:tr>
+        <w:tc>
+          <w:tcPr/>
+          <w:p>
+            <w:pPr>
+              <w:pStyle w:val="Compact"/>
+            </w:pPr>
+            <w:r>
+              <w:rPr>
+                <w:rStyle w:val="VerbatimChar"/>
+              </w:rPr>
+              <w:t xml:space="preserve">prd-auxdat</w:t>
+            </w:r>
+          </w:p>
+        </w:tc>
+        <w:tc>
+          <w:tcPr/>
+          <w:p>
+            <w:pPr>
+              <w:pStyle w:val="Compact"/>
+            </w:pPr>
+            <w:r>
+              <w:t xml:space="preserve">Auxiliary Data</w:t>
+            </w:r>
+          </w:p>
+        </w:tc>
+        <w:tc>
+          <w:tcPr/>
+          <w:p>
+            <w:pPr>
+              <w:pStyle w:val="Compact"/>
+              <w:jc w:val="center"/>
+            </w:pPr>
+            <w:r>
+              <w:rPr>
+                <w:i/>
+                <w:iCs/>
+              </w:rPr>
+              <w:t xml:space="preserve">not required</w:t>
+            </w:r>
+          </w:p>
+        </w:tc>
+        <w:tc>
+          <w:tcPr/>
+          <w:p>
+            <w:pPr>
+              <w:pStyle w:val="Compact"/>
+            </w:pPr>
+          </w:p>
+        </w:tc>
+      </w:tr>
+      <w:tr>
+        <w:tc>
+          <w:tcPr/>
+          <w:p>
+            <w:pPr>
+              <w:pStyle w:val="Compact"/>
+            </w:pPr>
+            <w:r>
+              <w:rPr>
+                <w:rStyle w:val="VerbatimChar"/>
+              </w:rPr>
+              <w:t xml:space="preserve">prd-smpspc</w:t>
+            </w:r>
+          </w:p>
+        </w:tc>
+        <w:tc>
+          <w:tcPr/>
+          <w:p>
+            <w:pPr>
+              <w:pStyle w:val="Compact"/>
+            </w:pPr>
+            <w:r>
+              <w:t xml:space="preserve">Product Sample Spacing</w:t>
             </w:r>
           </w:p>
         </w:tc>
@@ -12788,7 +13619,7 @@
               <w:rPr>
                 <w:rStyle w:val="VerbatimChar"/>
               </w:rPr>
-              <w:t xml:space="preserve">src.metadata-data-access-source</w:t>
+              <w:t xml:space="preserve">prd-resol</w:t>
             </w:r>
           </w:p>
         </w:tc>
@@ -12799,7 +13630,7 @@
               <w:pStyle w:val="Compact"/>
             </w:pPr>
             <w:r>
-              <w:t xml:space="preserve">Source Data Access</w:t>
+              <w:t xml:space="preserve">Product Resolution</w:t>
             </w:r>
           </w:p>
         </w:tc>
@@ -12808,7 +13639,15 @@
           <w:p>
             <w:pPr>
               <w:pStyle w:val="Compact"/>
+              <w:jc w:val="center"/>
             </w:pPr>
+            <w:r>
+              <w:rPr>
+                <w:i/>
+                <w:iCs/>
+              </w:rPr>
+              <w:t xml:space="preserve">not required</w:t>
+            </w:r>
           </w:p>
         </w:tc>
         <w:tc>
@@ -12831,7 +13670,7 @@
               <w:rPr>
                 <w:rStyle w:val="VerbatimChar"/>
               </w:rPr>
-              <w:t xml:space="preserve">src.metadata-instrument-sar</w:t>
+              <w:t xml:space="preserve">prd-geobx</w:t>
             </w:r>
           </w:p>
         </w:tc>
@@ -12842,50 +13681,7 @@
               <w:pStyle w:val="Compact"/>
             </w:pPr>
             <w:r>
-              <w:t xml:space="preserve">Instrument</w:t>
-            </w:r>
-          </w:p>
-        </w:tc>
-        <w:tc>
-          <w:tcPr/>
-          <w:p>
-            <w:pPr>
-              <w:pStyle w:val="Compact"/>
-            </w:pPr>
-          </w:p>
-        </w:tc>
-        <w:tc>
-          <w:tcPr/>
-          <w:p>
-            <w:pPr>
-              <w:pStyle w:val="Compact"/>
-            </w:pPr>
-          </w:p>
-        </w:tc>
-      </w:tr>
-      <w:tr>
-        <w:tc>
-          <w:tcPr/>
-          <w:p>
-            <w:pPr>
-              <w:pStyle w:val="Compact"/>
-            </w:pPr>
-            <w:r>
-              <w:rPr>
-                <w:rStyle w:val="VerbatimChar"/>
-              </w:rPr>
-              <w:t xml:space="preserve">src.metadata-time-source</w:t>
-            </w:r>
-          </w:p>
-        </w:tc>
-        <w:tc>
-          <w:tcPr/>
-          <w:p>
-            <w:pPr>
-              <w:pStyle w:val="Compact"/>
-            </w:pPr>
-            <w:r>
-              <w:t xml:space="preserve">Source Data Acquisition Time</w:t>
+              <w:t xml:space="preserve">Product Bounding Box</w:t>
             </w:r>
           </w:p>
         </w:tc>
@@ -12925,7 +13721,7 @@
               <w:rPr>
                 <w:rStyle w:val="VerbatimChar"/>
               </w:rPr>
-              <w:t xml:space="preserve">src.metadata-acquisition-parameters-sar</w:t>
+              <w:t xml:space="preserve">prd-geoare</w:t>
             </w:r>
           </w:p>
         </w:tc>
@@ -12936,7 +13732,7 @@
               <w:pStyle w:val="Compact"/>
             </w:pPr>
             <w:r>
-              <w:t xml:space="preserve">Source Data Acquisition Parameters</w:t>
+              <w:t xml:space="preserve">Product Geographical Extent</w:t>
             </w:r>
           </w:p>
         </w:tc>
@@ -12976,7 +13772,7 @@
               <w:rPr>
                 <w:rStyle w:val="VerbatimChar"/>
               </w:rPr>
-              <w:t xml:space="preserve">src.metadata-orbit</w:t>
+              <w:t xml:space="preserve">prd-imgsiz</w:t>
             </w:r>
           </w:p>
         </w:tc>
@@ -12987,7 +13783,7 @@
               <w:pStyle w:val="Compact"/>
             </w:pPr>
             <w:r>
-              <w:t xml:space="preserve">Source Data Orbit Information</w:t>
+              <w:t xml:space="preserve">Product Image Size</w:t>
             </w:r>
           </w:p>
         </w:tc>
@@ -13004,7 +13800,15 @@
           <w:p>
             <w:pPr>
               <w:pStyle w:val="Compact"/>
+              <w:jc w:val="center"/>
             </w:pPr>
+            <w:r>
+              <w:rPr>
+                <w:i/>
+                <w:iCs/>
+              </w:rPr>
+              <w:t xml:space="preserve">as threshold</w:t>
+            </w:r>
           </w:p>
         </w:tc>
       </w:tr>
@@ -13019,7 +13823,7 @@
               <w:rPr>
                 <w:rStyle w:val="VerbatimChar"/>
               </w:rPr>
-              <w:t xml:space="preserve">src.metadata-processing-parameters</w:t>
+              <w:t xml:space="preserve">prd-pxconv</w:t>
             </w:r>
           </w:p>
         </w:tc>
@@ -13030,7 +13834,7 @@
               <w:pStyle w:val="Compact"/>
             </w:pPr>
             <w:r>
-              <w:t xml:space="preserve">Source Data Processing Parameters</w:t>
+              <w:t xml:space="preserve">Product Pixel Coordinate Convention</w:t>
             </w:r>
           </w:p>
         </w:tc>
@@ -13047,7 +13851,15 @@
           <w:p>
             <w:pPr>
               <w:pStyle w:val="Compact"/>
+              <w:jc w:val="center"/>
             </w:pPr>
+            <w:r>
+              <w:rPr>
+                <w:i/>
+                <w:iCs/>
+              </w:rPr>
+              <w:t xml:space="preserve">as threshold</w:t>
+            </w:r>
           </w:p>
         </w:tc>
       </w:tr>
@@ -13062,7 +13874,7 @@
               <w:rPr>
                 <w:rStyle w:val="VerbatimChar"/>
               </w:rPr>
-              <w:t xml:space="preserve">src.metadata-image-attributes-sar</w:t>
+              <w:t xml:space="preserve">prd-crs</w:t>
             </w:r>
           </w:p>
         </w:tc>
@@ -13073,7 +13885,7 @@
               <w:pStyle w:val="Compact"/>
             </w:pPr>
             <w:r>
-              <w:t xml:space="preserve">Source Data Image Attributes</w:t>
+              <w:t xml:space="preserve">Product Coordinate Reference System</w:t>
             </w:r>
           </w:p>
         </w:tc>
@@ -13090,7 +13902,15 @@
           <w:p>
             <w:pPr>
               <w:pStyle w:val="Compact"/>
+              <w:jc w:val="center"/>
             </w:pPr>
+            <w:r>
+              <w:rPr>
+                <w:i/>
+                <w:iCs/>
+              </w:rPr>
+              <w:t xml:space="preserve">as threshold</w:t>
+            </w:r>
           </w:p>
         </w:tc>
       </w:tr>
@@ -13105,7 +13925,7 @@
               <w:rPr>
                 <w:rStyle w:val="VerbatimChar"/>
               </w:rPr>
-              <w:t xml:space="preserve">src.metadata-sensor-calibration-sar</w:t>
+              <w:t xml:space="preserve">prd-rulvec</w:t>
             </w:r>
           </w:p>
         </w:tc>
@@ -13116,58 +13936,7 @@
               <w:pStyle w:val="Compact"/>
             </w:pPr>
             <w:r>
-              <w:t xml:space="preserve">Sensor Calibration</w:t>
-            </w:r>
-          </w:p>
-        </w:tc>
-        <w:tc>
-          <w:tcPr/>
-          <w:p>
-            <w:pPr>
-              <w:pStyle w:val="Compact"/>
-              <w:jc w:val="center"/>
-            </w:pPr>
-            <w:r>
-              <w:rPr>
-                <w:i/>
-                <w:iCs/>
-              </w:rPr>
-              <w:t xml:space="preserve">not required</w:t>
-            </w:r>
-          </w:p>
-        </w:tc>
-        <w:tc>
-          <w:tcPr/>
-          <w:p>
-            <w:pPr>
-              <w:pStyle w:val="Compact"/>
-            </w:pPr>
-          </w:p>
-        </w:tc>
-      </w:tr>
-      <w:tr>
-        <w:tc>
-          <w:tcPr/>
-          <w:p>
-            <w:pPr>
-              <w:pStyle w:val="Compact"/>
-            </w:pPr>
-            <w:r>
-              <w:rPr>
-                <w:rStyle w:val="VerbatimChar"/>
-              </w:rPr>
-              <w:t xml:space="preserve">src.metadata-performance-indicators</w:t>
-            </w:r>
-          </w:p>
-        </w:tc>
-        <w:tc>
-          <w:tcPr/>
-          <w:p>
-            <w:pPr>
-              <w:pStyle w:val="Compact"/>
-            </w:pPr>
-            <w:r>
-              <w:t xml:space="preserve">Performance Indicators</w:t>
+              <w:t xml:space="preserve">Radar Unit Look Vector</w:t>
             </w:r>
           </w:p>
         </w:tc>
@@ -13184,7 +13953,15 @@
           <w:p>
             <w:pPr>
               <w:pStyle w:val="Compact"/>
+              <w:jc w:val="center"/>
             </w:pPr>
+            <w:r>
+              <w:rPr>
+                <w:i/>
+                <w:iCs/>
+              </w:rPr>
+              <w:t xml:space="preserve">as threshold</w:t>
+            </w:r>
           </w:p>
         </w:tc>
       </w:tr>
@@ -13199,7 +13976,7 @@
               <w:rPr>
                 <w:rStyle w:val="VerbatimChar"/>
               </w:rPr>
-              <w:t xml:space="preserve">src.metadata-polarimetric-calibration-matrices</w:t>
+              <w:t xml:space="preserve">prd-sltrng</w:t>
             </w:r>
           </w:p>
         </w:tc>
@@ -13210,8 +13987,16 @@
               <w:pStyle w:val="Compact"/>
             </w:pPr>
             <w:r>
-              <w:t xml:space="preserve">Polarimetric Calibration Matrices</w:t>
+              <w:t xml:space="preserve">Slant Range Sensor to Surface</w:t>
             </w:r>
+          </w:p>
+        </w:tc>
+        <w:tc>
+          <w:tcPr/>
+          <w:p>
+            <w:pPr>
+              <w:pStyle w:val="Compact"/>
+            </w:pPr>
           </w:p>
         </w:tc>
         <w:tc>
@@ -13226,16 +14011,8 @@
                 <w:i/>
                 <w:iCs/>
               </w:rPr>
-              <w:t xml:space="preserve">not required</w:t>
+              <w:t xml:space="preserve">as threshold</w:t>
             </w:r>
-          </w:p>
-        </w:tc>
-        <w:tc>
-          <w:tcPr/>
-          <w:p>
-            <w:pPr>
-              <w:pStyle w:val="Compact"/>
-            </w:pPr>
           </w:p>
         </w:tc>
       </w:tr>
@@ -13250,7 +14027,7 @@
               <w:rPr>
                 <w:rStyle w:val="VerbatimChar"/>
               </w:rPr>
-              <w:t xml:space="preserve">src.metadata-mean-faraday-rotation-angle</w:t>
+              <w:t xml:space="preserve">prd-orbgsl</w:t>
             </w:r>
           </w:p>
         </w:tc>
@@ -13261,58 +14038,7 @@
               <w:pStyle w:val="Compact"/>
             </w:pPr>
             <w:r>
-              <w:t xml:space="preserve">Mean Faraday Rotation Angle</w:t>
-            </w:r>
-          </w:p>
-        </w:tc>
-        <w:tc>
-          <w:tcPr/>
-          <w:p>
-            <w:pPr>
-              <w:pStyle w:val="Compact"/>
-              <w:jc w:val="center"/>
-            </w:pPr>
-            <w:r>
-              <w:rPr>
-                <w:i/>
-                <w:iCs/>
-              </w:rPr>
-              <w:t xml:space="preserve">not required</w:t>
-            </w:r>
-          </w:p>
-        </w:tc>
-        <w:tc>
-          <w:tcPr/>
-          <w:p>
-            <w:pPr>
-              <w:pStyle w:val="Compact"/>
-            </w:pPr>
-          </w:p>
-        </w:tc>
-      </w:tr>
-      <w:tr>
-        <w:tc>
-          <w:tcPr/>
-          <w:p>
-            <w:pPr>
-              <w:pStyle w:val="Compact"/>
-            </w:pPr>
-            <w:r>
-              <w:rPr>
-                <w:rStyle w:val="VerbatimChar"/>
-              </w:rPr>
-              <w:t xml:space="preserve">src.metadata-ionosphere-indicator</w:t>
-            </w:r>
-          </w:p>
-        </w:tc>
-        <w:tc>
-          <w:tcPr/>
-          <w:p>
-            <w:pPr>
-              <w:pStyle w:val="Compact"/>
-            </w:pPr>
-            <w:r>
-              <w:t xml:space="preserve">Ionosphere Indicator</w:t>
+              <w:t xml:space="preserve">Reference Orbit</w:t>
             </w:r>
           </w:p>
         </w:tc>
@@ -13342,14 +14068,14 @@
         </w:tc>
       </w:tr>
     </w:tbl>
-    <w:bookmarkEnd w:id="265"/>
-    <w:bookmarkStart w:id="266" w:name="product-metadata"/>
+    <w:bookmarkEnd w:id="266"/>
+    <w:bookmarkStart w:id="267" w:name="per-pixel-metadata"/>
     <w:p>
       <w:pPr>
         <w:pStyle w:val="berschrift3"/>
       </w:pPr>
       <w:r>
-        <w:t xml:space="preserve">Product Metadata</w:t>
+        <w:t xml:space="preserve">Per-Pixel Metadata</w:t>
       </w:r>
     </w:p>
     <w:tbl>
@@ -13427,7 +14153,7 @@
               <w:rPr>
                 <w:rStyle w:val="VerbatimChar"/>
               </w:rPr>
-              <w:t xml:space="preserve">prd.metadata-data-access-product</w:t>
+              <w:t xml:space="preserve">pxl-cldopt</w:t>
             </w:r>
           </w:p>
         </w:tc>
@@ -13438,50 +14164,7 @@
               <w:pStyle w:val="Compact"/>
             </w:pPr>
             <w:r>
-              <w:t xml:space="preserve">Product Data Access</w:t>
-            </w:r>
-          </w:p>
-        </w:tc>
-        <w:tc>
-          <w:tcPr/>
-          <w:p>
-            <w:pPr>
-              <w:pStyle w:val="Compact"/>
-            </w:pPr>
-          </w:p>
-        </w:tc>
-        <w:tc>
-          <w:tcPr/>
-          <w:p>
-            <w:pPr>
-              <w:pStyle w:val="Compact"/>
-            </w:pPr>
-          </w:p>
-        </w:tc>
-      </w:tr>
-      <w:tr>
-        <w:tc>
-          <w:tcPr/>
-          <w:p>
-            <w:pPr>
-              <w:pStyle w:val="Compact"/>
-            </w:pPr>
-            <w:r>
-              <w:rPr>
-                <w:rStyle w:val="VerbatimChar"/>
-              </w:rPr>
-              <w:t xml:space="preserve">prd.metadata-auxiliary-data</w:t>
-            </w:r>
-          </w:p>
-        </w:tc>
-        <w:tc>
-          <w:tcPr/>
-          <w:p>
-            <w:pPr>
-              <w:pStyle w:val="Compact"/>
-            </w:pPr>
-            <w:r>
-              <w:t xml:space="preserve">Auxiliary Data</w:t>
+              <w:t xml:space="preserve">Cloud Optimized Formats</w:t>
             </w:r>
           </w:p>
         </w:tc>
@@ -13521,7 +14204,7 @@
               <w:rPr>
                 <w:rStyle w:val="VerbatimChar"/>
               </w:rPr>
-              <w:t xml:space="preserve">prd.metadata-sample-spacing</w:t>
+              <w:t xml:space="preserve">pxl-mrdsar</w:t>
             </w:r>
           </w:p>
         </w:tc>
@@ -13532,7 +14215,144 @@
               <w:pStyle w:val="Compact"/>
             </w:pPr>
             <w:r>
-              <w:t xml:space="preserve">Product Sample Spacing</w:t>
+              <w:t xml:space="preserve">Metadata Machine Readability</w:t>
+            </w:r>
+          </w:p>
+        </w:tc>
+        <w:tc>
+          <w:tcPr/>
+          <w:p>
+            <w:pPr>
+              <w:pStyle w:val="Compact"/>
+            </w:pPr>
+          </w:p>
+        </w:tc>
+        <w:tc>
+          <w:tcPr/>
+          <w:p>
+            <w:pPr>
+              <w:pStyle w:val="Compact"/>
+            </w:pPr>
+          </w:p>
+        </w:tc>
+      </w:tr>
+      <w:tr>
+        <w:tc>
+          <w:tcPr/>
+          <w:p>
+            <w:pPr>
+              <w:pStyle w:val="Compact"/>
+            </w:pPr>
+            <w:r>
+              <w:rPr>
+                <w:rStyle w:val="VerbatimChar"/>
+              </w:rPr>
+              <w:t xml:space="preserve">pxl-ppmask</w:t>
+            </w:r>
+          </w:p>
+        </w:tc>
+        <w:tc>
+          <w:tcPr/>
+          <w:p>
+            <w:pPr>
+              <w:pStyle w:val="Compact"/>
+            </w:pPr>
+            <w:r>
+              <w:t xml:space="preserve">Data Mask Image</w:t>
+            </w:r>
+          </w:p>
+        </w:tc>
+        <w:tc>
+          <w:tcPr/>
+          <w:p>
+            <w:pPr>
+              <w:pStyle w:val="Compact"/>
+            </w:pPr>
+          </w:p>
+        </w:tc>
+        <w:tc>
+          <w:tcPr/>
+          <w:p>
+            <w:pPr>
+              <w:pStyle w:val="Compact"/>
+            </w:pPr>
+          </w:p>
+        </w:tc>
+      </w:tr>
+      <w:tr>
+        <w:tc>
+          <w:tcPr/>
+          <w:p>
+            <w:pPr>
+              <w:pStyle w:val="Compact"/>
+            </w:pPr>
+            <w:r>
+              <w:rPr>
+                <w:rStyle w:val="VerbatimChar"/>
+              </w:rPr>
+              <w:t xml:space="preserve">pxl-ppscta</w:t>
+            </w:r>
+          </w:p>
+        </w:tc>
+        <w:tc>
+          <w:tcPr/>
+          <w:p>
+            <w:pPr>
+              <w:pStyle w:val="Compact"/>
+            </w:pPr>
+            <w:r>
+              <w:t xml:space="preserve">Scattering Area Image</w:t>
+            </w:r>
+          </w:p>
+        </w:tc>
+        <w:tc>
+          <w:tcPr/>
+          <w:p>
+            <w:pPr>
+              <w:pStyle w:val="Compact"/>
+              <w:jc w:val="center"/>
+            </w:pPr>
+            <w:r>
+              <w:rPr>
+                <w:i/>
+                <w:iCs/>
+              </w:rPr>
+              <w:t xml:space="preserve">not required</w:t>
+            </w:r>
+          </w:p>
+        </w:tc>
+        <w:tc>
+          <w:tcPr/>
+          <w:p>
+            <w:pPr>
+              <w:pStyle w:val="Compact"/>
+            </w:pPr>
+          </w:p>
+        </w:tc>
+      </w:tr>
+      <w:tr>
+        <w:tc>
+          <w:tcPr/>
+          <w:p>
+            <w:pPr>
+              <w:pStyle w:val="Compact"/>
+            </w:pPr>
+            <w:r>
+              <w:rPr>
+                <w:rStyle w:val="VerbatimChar"/>
+              </w:rPr>
+              <w:t xml:space="preserve">pxl-pplia</w:t>
+            </w:r>
+          </w:p>
+        </w:tc>
+        <w:tc>
+          <w:tcPr/>
+          <w:p>
+            <w:pPr>
+              <w:pStyle w:val="Compact"/>
+            </w:pPr>
+            <w:r>
+              <w:t xml:space="preserve">Local Incident Angle Image</w:t>
             </w:r>
           </w:p>
         </w:tc>
@@ -13572,7 +14392,7 @@
               <w:rPr>
                 <w:rStyle w:val="VerbatimChar"/>
               </w:rPr>
-              <w:t xml:space="preserve">prd.metadata-resolution</w:t>
+              <w:t xml:space="preserve">pxl-ppelia</w:t>
             </w:r>
           </w:p>
         </w:tc>
@@ -13583,7 +14403,7 @@
               <w:pStyle w:val="Compact"/>
             </w:pPr>
             <w:r>
-              <w:t xml:space="preserve">Product Resolution</w:t>
+              <w:t xml:space="preserve">Ellipsoidal Incident Angle Image</w:t>
             </w:r>
           </w:p>
         </w:tc>
@@ -13623,7 +14443,7 @@
               <w:rPr>
                 <w:rStyle w:val="VerbatimChar"/>
               </w:rPr>
-              <w:t xml:space="preserve">prd.metadata-geo-bbox</w:t>
+              <w:t xml:space="preserve">pxl-ppnspw</w:t>
             </w:r>
           </w:p>
         </w:tc>
@@ -13634,7 +14454,109 @@
               <w:pStyle w:val="Compact"/>
             </w:pPr>
             <w:r>
-              <w:t xml:space="preserve">Product Bounding Box</w:t>
+              <w:t xml:space="preserve">Noise Power Image</w:t>
+            </w:r>
+          </w:p>
+        </w:tc>
+        <w:tc>
+          <w:tcPr/>
+          <w:p>
+            <w:pPr>
+              <w:pStyle w:val="Compact"/>
+              <w:jc w:val="center"/>
+            </w:pPr>
+            <w:r>
+              <w:rPr>
+                <w:i/>
+                <w:iCs/>
+              </w:rPr>
+              <w:t xml:space="preserve">not required</w:t>
+            </w:r>
+          </w:p>
+        </w:tc>
+        <w:tc>
+          <w:tcPr/>
+          <w:p>
+            <w:pPr>
+              <w:pStyle w:val="Compact"/>
+            </w:pPr>
+          </w:p>
+        </w:tc>
+      </w:tr>
+      <w:tr>
+        <w:tc>
+          <w:tcPr/>
+          <w:p>
+            <w:pPr>
+              <w:pStyle w:val="Compact"/>
+            </w:pPr>
+            <w:r>
+              <w:rPr>
+                <w:rStyle w:val="VerbatimChar"/>
+              </w:rPr>
+              <w:t xml:space="preserve">pxl-ppgmsg</w:t>
+            </w:r>
+          </w:p>
+        </w:tc>
+        <w:tc>
+          <w:tcPr/>
+          <w:p>
+            <w:pPr>
+              <w:pStyle w:val="Compact"/>
+            </w:pPr>
+            <w:r>
+              <w:t xml:space="preserve">Gamma-to-Sigma Ratio Image</w:t>
+            </w:r>
+          </w:p>
+        </w:tc>
+        <w:tc>
+          <w:tcPr/>
+          <w:p>
+            <w:pPr>
+              <w:pStyle w:val="Compact"/>
+              <w:jc w:val="center"/>
+            </w:pPr>
+            <w:r>
+              <w:rPr>
+                <w:i/>
+                <w:iCs/>
+              </w:rPr>
+              <w:t xml:space="preserve">not required</w:t>
+            </w:r>
+          </w:p>
+        </w:tc>
+        <w:tc>
+          <w:tcPr/>
+          <w:p>
+            <w:pPr>
+              <w:pStyle w:val="Compact"/>
+            </w:pPr>
+          </w:p>
+        </w:tc>
+      </w:tr>
+      <w:tr>
+        <w:tc>
+          <w:tcPr/>
+          <w:p>
+            <w:pPr>
+              <w:pStyle w:val="Compact"/>
+            </w:pPr>
+            <w:r>
+              <w:rPr>
+                <w:rStyle w:val="VerbatimChar"/>
+              </w:rPr>
+              <w:t xml:space="preserve">pxl-ppacqd</w:t>
+            </w:r>
+          </w:p>
+        </w:tc>
+        <w:tc>
+          <w:tcPr/>
+          <w:p>
+            <w:pPr>
+              <w:pStyle w:val="Compact"/>
+            </w:pPr>
+            <w:r>
+              <w:t xml:space="preserve">Acquisition ID Image</w:t>
             </w:r>
           </w:p>
         </w:tc>
@@ -13651,15 +14573,7 @@
           <w:p>
             <w:pPr>
               <w:pStyle w:val="Compact"/>
-              <w:jc w:val="center"/>
             </w:pPr>
-            <w:r>
-              <w:rPr>
-                <w:i/>
-                <w:iCs/>
-              </w:rPr>
-              <w:t xml:space="preserve">as threshold</w:t>
-            </w:r>
           </w:p>
         </w:tc>
       </w:tr>
@@ -13674,7 +14588,7 @@
               <w:rPr>
                 <w:rStyle w:val="VerbatimChar"/>
               </w:rPr>
-              <w:t xml:space="preserve">prd.metadata-geo-area</w:t>
+              <w:t xml:space="preserve">pxl-ppdem</w:t>
             </w:r>
           </w:p>
         </w:tc>
@@ -13685,16 +14599,8 @@
               <w:pStyle w:val="Compact"/>
             </w:pPr>
             <w:r>
-              <w:t xml:space="preserve">Product Geographical Extent</w:t>
+              <w:t xml:space="preserve">Per-Pixel DEM</w:t>
             </w:r>
-          </w:p>
-        </w:tc>
-        <w:tc>
-          <w:tcPr/>
-          <w:p>
-            <w:pPr>
-              <w:pStyle w:val="Compact"/>
-            </w:pPr>
           </w:p>
         </w:tc>
         <w:tc>
@@ -13709,8 +14615,16 @@
                 <w:i/>
                 <w:iCs/>
               </w:rPr>
-              <w:t xml:space="preserve">as threshold</w:t>
+              <w:t xml:space="preserve">not required</w:t>
             </w:r>
+          </w:p>
+        </w:tc>
+        <w:tc>
+          <w:tcPr/>
+          <w:p>
+            <w:pPr>
+              <w:pStyle w:val="Compact"/>
+            </w:pPr>
           </w:p>
         </w:tc>
       </w:tr>
@@ -13725,7 +14639,7 @@
               <w:rPr>
                 <w:rStyle w:val="VerbatimChar"/>
               </w:rPr>
-              <w:t xml:space="preserve">prd.metadata-image-size</w:t>
+              <w:t xml:space="preserve">pxl-pprulv</w:t>
             </w:r>
           </w:p>
         </w:tc>
@@ -13736,16 +14650,8 @@
               <w:pStyle w:val="Compact"/>
             </w:pPr>
             <w:r>
-              <w:t xml:space="preserve">Product Image Size</w:t>
+              <w:t xml:space="preserve">Radar Unit Look Vector Grid Image</w:t>
             </w:r>
-          </w:p>
-        </w:tc>
-        <w:tc>
-          <w:tcPr/>
-          <w:p>
-            <w:pPr>
-              <w:pStyle w:val="Compact"/>
-            </w:pPr>
           </w:p>
         </w:tc>
         <w:tc>
@@ -13760,8 +14666,16 @@
                 <w:i/>
                 <w:iCs/>
               </w:rPr>
-              <w:t xml:space="preserve">as threshold</w:t>
+              <w:t xml:space="preserve">not required</w:t>
             </w:r>
+          </w:p>
+        </w:tc>
+        <w:tc>
+          <w:tcPr/>
+          <w:p>
+            <w:pPr>
+              <w:pStyle w:val="Compact"/>
+            </w:pPr>
           </w:p>
         </w:tc>
       </w:tr>
@@ -13776,7 +14690,7 @@
               <w:rPr>
                 <w:rStyle w:val="VerbatimChar"/>
               </w:rPr>
-              <w:t xml:space="preserve">prd.metadata-pixel-coordinate-convention</w:t>
+              <w:t xml:space="preserve">pxl-ppslrg</w:t>
             </w:r>
           </w:p>
         </w:tc>
@@ -13787,16 +14701,8 @@
               <w:pStyle w:val="Compact"/>
             </w:pPr>
             <w:r>
-              <w:t xml:space="preserve">Product Pixel Coordinate Convention</w:t>
+              <w:t xml:space="preserve">Slant Range Sensor to Surface Image</w:t>
             </w:r>
-          </w:p>
-        </w:tc>
-        <w:tc>
-          <w:tcPr/>
-          <w:p>
-            <w:pPr>
-              <w:pStyle w:val="Compact"/>
-            </w:pPr>
           </w:p>
         </w:tc>
         <w:tc>
@@ -13811,8 +14717,16 @@
                 <w:i/>
                 <w:iCs/>
               </w:rPr>
-              <w:t xml:space="preserve">as threshold</w:t>
+              <w:t xml:space="preserve">not required</w:t>
             </w:r>
+          </w:p>
+        </w:tc>
+        <w:tc>
+          <w:tcPr/>
+          <w:p>
+            <w:pPr>
+              <w:pStyle w:val="Compact"/>
+            </w:pPr>
           </w:p>
         </w:tc>
       </w:tr>
@@ -13827,7 +14741,7 @@
               <w:rPr>
                 <w:rStyle w:val="VerbatimChar"/>
               </w:rPr>
-              <w:t xml:space="preserve">prd.metadata-crs</w:t>
+              <w:t xml:space="preserve">pxl-ppiphu</w:t>
             </w:r>
           </w:p>
         </w:tc>
@@ -13838,16 +14752,8 @@
               <w:pStyle w:val="Compact"/>
             </w:pPr>
             <w:r>
-              <w:t xml:space="preserve">Product Coordinate Reference System</w:t>
+              <w:t xml:space="preserve">InSAR Phase Uncertainty Image</w:t>
             </w:r>
-          </w:p>
-        </w:tc>
-        <w:tc>
-          <w:tcPr/>
-          <w:p>
-            <w:pPr>
-              <w:pStyle w:val="Compact"/>
-            </w:pPr>
           </w:p>
         </w:tc>
         <w:tc>
@@ -13862,8 +14768,16 @@
                 <w:i/>
                 <w:iCs/>
               </w:rPr>
-              <w:t xml:space="preserve">as threshold</w:t>
+              <w:t xml:space="preserve">not required</w:t>
             </w:r>
+          </w:p>
+        </w:tc>
+        <w:tc>
+          <w:tcPr/>
+          <w:p>
+            <w:pPr>
+              <w:pStyle w:val="Compact"/>
+            </w:pPr>
           </w:p>
         </w:tc>
       </w:tr>
@@ -13878,7 +14792,7 @@
               <w:rPr>
                 <w:rStyle w:val="VerbatimChar"/>
               </w:rPr>
-              <w:t xml:space="preserve">prd.metadata-radar-unit-look-vector</w:t>
+              <w:t xml:space="preserve">pxl-ppatpc</w:t>
             </w:r>
           </w:p>
         </w:tc>
@@ -13889,16 +14803,8 @@
               <w:pStyle w:val="Compact"/>
             </w:pPr>
             <w:r>
-              <w:t xml:space="preserve">Radar Unit Look Vector</w:t>
+              <w:t xml:space="preserve">Atmospheric Phase Correction Image</w:t>
             </w:r>
-          </w:p>
-        </w:tc>
-        <w:tc>
-          <w:tcPr/>
-          <w:p>
-            <w:pPr>
-              <w:pStyle w:val="Compact"/>
-            </w:pPr>
           </w:p>
         </w:tc>
         <w:tc>
@@ -13913,8 +14819,16 @@
                 <w:i/>
                 <w:iCs/>
               </w:rPr>
-              <w:t xml:space="preserve">as threshold</w:t>
+              <w:t xml:space="preserve">not required</w:t>
             </w:r>
+          </w:p>
+        </w:tc>
+        <w:tc>
+          <w:tcPr/>
+          <w:p>
+            <w:pPr>
+              <w:pStyle w:val="Compact"/>
+            </w:pPr>
           </w:p>
         </w:tc>
       </w:tr>
@@ -13929,7 +14843,7 @@
               <w:rPr>
                 <w:rStyle w:val="VerbatimChar"/>
               </w:rPr>
-              <w:t xml:space="preserve">prd.metadata-slant-range</w:t>
+              <w:t xml:space="preserve">pxl-ppionc</w:t>
             </w:r>
           </w:p>
         </w:tc>
@@ -13940,58 +14854,7 @@
               <w:pStyle w:val="Compact"/>
             </w:pPr>
             <w:r>
-              <w:t xml:space="preserve">Slant Range Sensor to Surface</w:t>
-            </w:r>
-          </w:p>
-        </w:tc>
-        <w:tc>
-          <w:tcPr/>
-          <w:p>
-            <w:pPr>
-              <w:pStyle w:val="Compact"/>
-            </w:pPr>
-          </w:p>
-        </w:tc>
-        <w:tc>
-          <w:tcPr/>
-          <w:p>
-            <w:pPr>
-              <w:pStyle w:val="Compact"/>
-              <w:jc w:val="center"/>
-            </w:pPr>
-            <w:r>
-              <w:rPr>
-                <w:i/>
-                <w:iCs/>
-              </w:rPr>
-              <w:t xml:space="preserve">as threshold</w:t>
-            </w:r>
-          </w:p>
-        </w:tc>
-      </w:tr>
-      <w:tr>
-        <w:tc>
-          <w:tcPr/>
-          <w:p>
-            <w:pPr>
-              <w:pStyle w:val="Compact"/>
-            </w:pPr>
-            <w:r>
-              <w:rPr>
-                <w:rStyle w:val="VerbatimChar"/>
-              </w:rPr>
-              <w:t xml:space="preserve">prd.metadata-orbit-reference-gslc</w:t>
-            </w:r>
-          </w:p>
-        </w:tc>
-        <w:tc>
-          <w:tcPr/>
-          <w:p>
-            <w:pPr>
-              <w:pStyle w:val="Compact"/>
-            </w:pPr>
-            <w:r>
-              <w:t xml:space="preserve">Reference Orbit</w:t>
+              <w:t xml:space="preserve">Ionospheric Phase Correction Image</w:t>
             </w:r>
           </w:p>
         </w:tc>
@@ -14021,14 +14884,14 @@
         </w:tc>
       </w:tr>
     </w:tbl>
-    <w:bookmarkEnd w:id="266"/>
-    <w:bookmarkStart w:id="267" w:name="per-pixel-metadata"/>
+    <w:bookmarkEnd w:id="267"/>
+    <w:bookmarkStart w:id="268" w:name="radiometrically-corrected-measurements"/>
     <w:p>
       <w:pPr>
         <w:pStyle w:val="berschrift3"/>
       </w:pPr>
       <w:r>
-        <w:t xml:space="preserve">Per-Pixel Metadata</w:t>
+        <w:t xml:space="preserve">Radiometrically Corrected Measurements</w:t>
       </w:r>
     </w:p>
     <w:tbl>
@@ -14106,7 +14969,7 @@
               <w:rPr>
                 <w:rStyle w:val="VerbatimChar"/>
               </w:rPr>
-              <w:t xml:space="preserve">pxl.cloud-optimized-formats</w:t>
+              <w:t xml:space="preserve">rcm-cldopt</w:t>
             </w:r>
           </w:p>
         </w:tc>
@@ -14157,7 +15020,7 @@
               <w:rPr>
                 <w:rStyle w:val="VerbatimChar"/>
               </w:rPr>
-              <w:t xml:space="preserve">pxl.metadata-machine-readability-sar</w:t>
+              <w:t xml:space="preserve">rcm-bsgslc</w:t>
             </w:r>
           </w:p>
         </w:tc>
@@ -14168,7 +15031,58 @@
               <w:pStyle w:val="Compact"/>
             </w:pPr>
             <w:r>
-              <w:t xml:space="preserve">Metadata Machine Readability</w:t>
+              <w:t xml:space="preserve">Backscatter Measurements (GSLC)</w:t>
+            </w:r>
+          </w:p>
+        </w:tc>
+        <w:tc>
+          <w:tcPr/>
+          <w:p>
+            <w:pPr>
+              <w:pStyle w:val="Compact"/>
+            </w:pPr>
+          </w:p>
+        </w:tc>
+        <w:tc>
+          <w:tcPr/>
+          <w:p>
+            <w:pPr>
+              <w:pStyle w:val="Compact"/>
+              <w:jc w:val="center"/>
+            </w:pPr>
+            <w:r>
+              <w:rPr>
+                <w:i/>
+                <w:iCs/>
+              </w:rPr>
+              <w:t xml:space="preserve">as threshold</w:t>
+            </w:r>
+          </w:p>
+        </w:tc>
+      </w:tr>
+      <w:tr>
+        <w:tc>
+          <w:tcPr/>
+          <w:p>
+            <w:pPr>
+              <w:pStyle w:val="Compact"/>
+            </w:pPr>
+            <w:r>
+              <w:rPr>
+                <w:rStyle w:val="VerbatimChar"/>
+              </w:rPr>
+              <w:t xml:space="preserve">rcm-sclcnv</w:t>
+            </w:r>
+          </w:p>
+        </w:tc>
+        <w:tc>
+          <w:tcPr/>
+          <w:p>
+            <w:pPr>
+              <w:pStyle w:val="Compact"/>
+            </w:pPr>
+            <w:r>
+              <w:t xml:space="preserve">Scaling Conversion</w:t>
             </w:r>
           </w:p>
         </w:tc>
@@ -14200,7 +15114,7 @@
               <w:rPr>
                 <w:rStyle w:val="VerbatimChar"/>
               </w:rPr>
-              <w:t xml:space="preserve">pxl.per-pixel-data-mask</w:t>
+              <w:t xml:space="preserve">rcm-nzrmvl</w:t>
             </w:r>
           </w:p>
         </w:tc>
@@ -14211,7 +15125,7 @@
               <w:pStyle w:val="Compact"/>
             </w:pPr>
             <w:r>
-              <w:t xml:space="preserve">Data Mask Image</w:t>
+              <w:t xml:space="preserve">Noise Removal</w:t>
             </w:r>
           </w:p>
         </w:tc>
@@ -14228,7 +15142,15 @@
           <w:p>
             <w:pPr>
               <w:pStyle w:val="Compact"/>
+              <w:jc w:val="center"/>
             </w:pPr>
+            <w:r>
+              <w:rPr>
+                <w:i/>
+                <w:iCs/>
+              </w:rPr>
+              <w:t xml:space="preserve">as threshold</w:t>
+            </w:r>
           </w:p>
         </w:tc>
       </w:tr>
@@ -14243,7 +15165,7 @@
               <w:rPr>
                 <w:rStyle w:val="VerbatimChar"/>
               </w:rPr>
-              <w:t xml:space="preserve">pxl.per-pixel-scattering-area</w:t>
+              <w:t xml:space="preserve">rcm-rtagsl</w:t>
             </w:r>
           </w:p>
         </w:tc>
@@ -14254,7 +15176,7 @@
               <w:pStyle w:val="Compact"/>
             </w:pPr>
             <w:r>
-              <w:t xml:space="preserve">Scattering Area Image</w:t>
+              <w:t xml:space="preserve">Radiometric Terrain Correction Algorithm</w:t>
             </w:r>
           </w:p>
         </w:tc>
@@ -14294,7 +15216,7 @@
               <w:rPr>
                 <w:rStyle w:val="VerbatimChar"/>
               </w:rPr>
-              <w:t xml:space="preserve">pxl.per-pixel-local-incident-angle</w:t>
+              <w:t xml:space="preserve">rcm-rmasar</w:t>
             </w:r>
           </w:p>
         </w:tc>
@@ -14305,509 +15227,7 @@
               <w:pStyle w:val="Compact"/>
             </w:pPr>
             <w:r>
-              <w:t xml:space="preserve">Local Incident Angle Image</w:t>
-            </w:r>
-          </w:p>
-        </w:tc>
-        <w:tc>
-          <w:tcPr/>
-          <w:p>
-            <w:pPr>
-              <w:pStyle w:val="Compact"/>
-            </w:pPr>
-          </w:p>
-        </w:tc>
-        <w:tc>
-          <w:tcPr/>
-          <w:p>
-            <w:pPr>
-              <w:pStyle w:val="Compact"/>
-              <w:jc w:val="center"/>
-            </w:pPr>
-            <w:r>
-              <w:rPr>
-                <w:i/>
-                <w:iCs/>
-              </w:rPr>
-              <w:t xml:space="preserve">as threshold</w:t>
-            </w:r>
-          </w:p>
-        </w:tc>
-      </w:tr>
-      <w:tr>
-        <w:tc>
-          <w:tcPr/>
-          <w:p>
-            <w:pPr>
-              <w:pStyle w:val="Compact"/>
-            </w:pPr>
-            <w:r>
-              <w:rPr>
-                <w:rStyle w:val="VerbatimChar"/>
-              </w:rPr>
-              <w:t xml:space="preserve">pxl.per-pixel-ellipsoidal-incident-angle</w:t>
-            </w:r>
-          </w:p>
-        </w:tc>
-        <w:tc>
-          <w:tcPr/>
-          <w:p>
-            <w:pPr>
-              <w:pStyle w:val="Compact"/>
-            </w:pPr>
-            <w:r>
-              <w:t xml:space="preserve">Ellipsoidal Incident Angle Image</w:t>
-            </w:r>
-          </w:p>
-        </w:tc>
-        <w:tc>
-          <w:tcPr/>
-          <w:p>
-            <w:pPr>
-              <w:pStyle w:val="Compact"/>
-              <w:jc w:val="center"/>
-            </w:pPr>
-            <w:r>
-              <w:rPr>
-                <w:i/>
-                <w:iCs/>
-              </w:rPr>
-              <w:t xml:space="preserve">not required</w:t>
-            </w:r>
-          </w:p>
-        </w:tc>
-        <w:tc>
-          <w:tcPr/>
-          <w:p>
-            <w:pPr>
-              <w:pStyle w:val="Compact"/>
-            </w:pPr>
-          </w:p>
-        </w:tc>
-      </w:tr>
-      <w:tr>
-        <w:tc>
-          <w:tcPr/>
-          <w:p>
-            <w:pPr>
-              <w:pStyle w:val="Compact"/>
-            </w:pPr>
-            <w:r>
-              <w:rPr>
-                <w:rStyle w:val="VerbatimChar"/>
-              </w:rPr>
-              <w:t xml:space="preserve">pxl.per-pixel-noise-power</w:t>
-            </w:r>
-          </w:p>
-        </w:tc>
-        <w:tc>
-          <w:tcPr/>
-          <w:p>
-            <w:pPr>
-              <w:pStyle w:val="Compact"/>
-            </w:pPr>
-            <w:r>
-              <w:t xml:space="preserve">Noise Power Image</w:t>
-            </w:r>
-          </w:p>
-        </w:tc>
-        <w:tc>
-          <w:tcPr/>
-          <w:p>
-            <w:pPr>
-              <w:pStyle w:val="Compact"/>
-              <w:jc w:val="center"/>
-            </w:pPr>
-            <w:r>
-              <w:rPr>
-                <w:i/>
-                <w:iCs/>
-              </w:rPr>
-              <w:t xml:space="preserve">not required</w:t>
-            </w:r>
-          </w:p>
-        </w:tc>
-        <w:tc>
-          <w:tcPr/>
-          <w:p>
-            <w:pPr>
-              <w:pStyle w:val="Compact"/>
-            </w:pPr>
-          </w:p>
-        </w:tc>
-      </w:tr>
-      <w:tr>
-        <w:tc>
-          <w:tcPr/>
-          <w:p>
-            <w:pPr>
-              <w:pStyle w:val="Compact"/>
-            </w:pPr>
-            <w:r>
-              <w:rPr>
-                <w:rStyle w:val="VerbatimChar"/>
-              </w:rPr>
-              <w:t xml:space="preserve">pxl.per-pixel-gamma-sigma-ratio</w:t>
-            </w:r>
-          </w:p>
-        </w:tc>
-        <w:tc>
-          <w:tcPr/>
-          <w:p>
-            <w:pPr>
-              <w:pStyle w:val="Compact"/>
-            </w:pPr>
-            <w:r>
-              <w:t xml:space="preserve">Gamma-to-Sigma Ratio Image</w:t>
-            </w:r>
-          </w:p>
-        </w:tc>
-        <w:tc>
-          <w:tcPr/>
-          <w:p>
-            <w:pPr>
-              <w:pStyle w:val="Compact"/>
-              <w:jc w:val="center"/>
-            </w:pPr>
-            <w:r>
-              <w:rPr>
-                <w:i/>
-                <w:iCs/>
-              </w:rPr>
-              <w:t xml:space="preserve">not required</w:t>
-            </w:r>
-          </w:p>
-        </w:tc>
-        <w:tc>
-          <w:tcPr/>
-          <w:p>
-            <w:pPr>
-              <w:pStyle w:val="Compact"/>
-            </w:pPr>
-          </w:p>
-        </w:tc>
-      </w:tr>
-      <w:tr>
-        <w:tc>
-          <w:tcPr/>
-          <w:p>
-            <w:pPr>
-              <w:pStyle w:val="Compact"/>
-            </w:pPr>
-            <w:r>
-              <w:rPr>
-                <w:rStyle w:val="VerbatimChar"/>
-              </w:rPr>
-              <w:t xml:space="preserve">pxl.per-pixel-acquisition-id</w:t>
-            </w:r>
-          </w:p>
-        </w:tc>
-        <w:tc>
-          <w:tcPr/>
-          <w:p>
-            <w:pPr>
-              <w:pStyle w:val="Compact"/>
-            </w:pPr>
-            <w:r>
-              <w:t xml:space="preserve">Acquisition ID Image</w:t>
-            </w:r>
-          </w:p>
-        </w:tc>
-        <w:tc>
-          <w:tcPr/>
-          <w:p>
-            <w:pPr>
-              <w:pStyle w:val="Compact"/>
-            </w:pPr>
-          </w:p>
-        </w:tc>
-        <w:tc>
-          <w:tcPr/>
-          <w:p>
-            <w:pPr>
-              <w:pStyle w:val="Compact"/>
-            </w:pPr>
-          </w:p>
-        </w:tc>
-      </w:tr>
-      <w:tr>
-        <w:tc>
-          <w:tcPr/>
-          <w:p>
-            <w:pPr>
-              <w:pStyle w:val="Compact"/>
-            </w:pPr>
-            <w:r>
-              <w:rPr>
-                <w:rStyle w:val="VerbatimChar"/>
-              </w:rPr>
-              <w:t xml:space="preserve">pxl.per-pixel-dem</w:t>
-            </w:r>
-          </w:p>
-        </w:tc>
-        <w:tc>
-          <w:tcPr/>
-          <w:p>
-            <w:pPr>
-              <w:pStyle w:val="Compact"/>
-            </w:pPr>
-            <w:r>
-              <w:t xml:space="preserve">Per-Pixel DEM</w:t>
-            </w:r>
-          </w:p>
-        </w:tc>
-        <w:tc>
-          <w:tcPr/>
-          <w:p>
-            <w:pPr>
-              <w:pStyle w:val="Compact"/>
-              <w:jc w:val="center"/>
-            </w:pPr>
-            <w:r>
-              <w:rPr>
-                <w:i/>
-                <w:iCs/>
-              </w:rPr>
-              <w:t xml:space="preserve">not required</w:t>
-            </w:r>
-          </w:p>
-        </w:tc>
-        <w:tc>
-          <w:tcPr/>
-          <w:p>
-            <w:pPr>
-              <w:pStyle w:val="Compact"/>
-            </w:pPr>
-          </w:p>
-        </w:tc>
-      </w:tr>
-      <w:tr>
-        <w:tc>
-          <w:tcPr/>
-          <w:p>
-            <w:pPr>
-              <w:pStyle w:val="Compact"/>
-            </w:pPr>
-            <w:r>
-              <w:rPr>
-                <w:rStyle w:val="VerbatimChar"/>
-              </w:rPr>
-              <w:t xml:space="preserve">pxl.per-pixel-radar-unit-look-vector-grid</w:t>
-            </w:r>
-          </w:p>
-        </w:tc>
-        <w:tc>
-          <w:tcPr/>
-          <w:p>
-            <w:pPr>
-              <w:pStyle w:val="Compact"/>
-            </w:pPr>
-            <w:r>
-              <w:t xml:space="preserve">Radar Unit Look Vector Grid Image</w:t>
-            </w:r>
-          </w:p>
-        </w:tc>
-        <w:tc>
-          <w:tcPr/>
-          <w:p>
-            <w:pPr>
-              <w:pStyle w:val="Compact"/>
-              <w:jc w:val="center"/>
-            </w:pPr>
-            <w:r>
-              <w:rPr>
-                <w:i/>
-                <w:iCs/>
-              </w:rPr>
-              <w:t xml:space="preserve">not required</w:t>
-            </w:r>
-          </w:p>
-        </w:tc>
-        <w:tc>
-          <w:tcPr/>
-          <w:p>
-            <w:pPr>
-              <w:pStyle w:val="Compact"/>
-            </w:pPr>
-          </w:p>
-        </w:tc>
-      </w:tr>
-      <w:tr>
-        <w:tc>
-          <w:tcPr/>
-          <w:p>
-            <w:pPr>
-              <w:pStyle w:val="Compact"/>
-            </w:pPr>
-            <w:r>
-              <w:rPr>
-                <w:rStyle w:val="VerbatimChar"/>
-              </w:rPr>
-              <w:t xml:space="preserve">pxl.per-pixel-slant-range</w:t>
-            </w:r>
-          </w:p>
-        </w:tc>
-        <w:tc>
-          <w:tcPr/>
-          <w:p>
-            <w:pPr>
-              <w:pStyle w:val="Compact"/>
-            </w:pPr>
-            <w:r>
-              <w:t xml:space="preserve">Slant Range Sensor to Surface Image</w:t>
-            </w:r>
-          </w:p>
-        </w:tc>
-        <w:tc>
-          <w:tcPr/>
-          <w:p>
-            <w:pPr>
-              <w:pStyle w:val="Compact"/>
-              <w:jc w:val="center"/>
-            </w:pPr>
-            <w:r>
-              <w:rPr>
-                <w:i/>
-                <w:iCs/>
-              </w:rPr>
-              <w:t xml:space="preserve">not required</w:t>
-            </w:r>
-          </w:p>
-        </w:tc>
-        <w:tc>
-          <w:tcPr/>
-          <w:p>
-            <w:pPr>
-              <w:pStyle w:val="Compact"/>
-            </w:pPr>
-          </w:p>
-        </w:tc>
-      </w:tr>
-      <w:tr>
-        <w:tc>
-          <w:tcPr/>
-          <w:p>
-            <w:pPr>
-              <w:pStyle w:val="Compact"/>
-            </w:pPr>
-            <w:r>
-              <w:rPr>
-                <w:rStyle w:val="VerbatimChar"/>
-              </w:rPr>
-              <w:t xml:space="preserve">pxl.per-pixel-insar-phase-uncertainty</w:t>
-            </w:r>
-          </w:p>
-        </w:tc>
-        <w:tc>
-          <w:tcPr/>
-          <w:p>
-            <w:pPr>
-              <w:pStyle w:val="Compact"/>
-            </w:pPr>
-            <w:r>
-              <w:t xml:space="preserve">InSAR Phase Uncertainty Image</w:t>
-            </w:r>
-          </w:p>
-        </w:tc>
-        <w:tc>
-          <w:tcPr/>
-          <w:p>
-            <w:pPr>
-              <w:pStyle w:val="Compact"/>
-              <w:jc w:val="center"/>
-            </w:pPr>
-            <w:r>
-              <w:rPr>
-                <w:i/>
-                <w:iCs/>
-              </w:rPr>
-              <w:t xml:space="preserve">not required</w:t>
-            </w:r>
-          </w:p>
-        </w:tc>
-        <w:tc>
-          <w:tcPr/>
-          <w:p>
-            <w:pPr>
-              <w:pStyle w:val="Compact"/>
-            </w:pPr>
-          </w:p>
-        </w:tc>
-      </w:tr>
-      <w:tr>
-        <w:tc>
-          <w:tcPr/>
-          <w:p>
-            <w:pPr>
-              <w:pStyle w:val="Compact"/>
-            </w:pPr>
-            <w:r>
-              <w:rPr>
-                <w:rStyle w:val="VerbatimChar"/>
-              </w:rPr>
-              <w:t xml:space="preserve">pxl.per-pixel-atmospheric-phase-correction</w:t>
-            </w:r>
-          </w:p>
-        </w:tc>
-        <w:tc>
-          <w:tcPr/>
-          <w:p>
-            <w:pPr>
-              <w:pStyle w:val="Compact"/>
-            </w:pPr>
-            <w:r>
-              <w:t xml:space="preserve">Atmospheric Phase Correction Image</w:t>
-            </w:r>
-          </w:p>
-        </w:tc>
-        <w:tc>
-          <w:tcPr/>
-          <w:p>
-            <w:pPr>
-              <w:pStyle w:val="Compact"/>
-              <w:jc w:val="center"/>
-            </w:pPr>
-            <w:r>
-              <w:rPr>
-                <w:i/>
-                <w:iCs/>
-              </w:rPr>
-              <w:t xml:space="preserve">not required</w:t>
-            </w:r>
-          </w:p>
-        </w:tc>
-        <w:tc>
-          <w:tcPr/>
-          <w:p>
-            <w:pPr>
-              <w:pStyle w:val="Compact"/>
-            </w:pPr>
-          </w:p>
-        </w:tc>
-      </w:tr>
-      <w:tr>
-        <w:tc>
-          <w:tcPr/>
-          <w:p>
-            <w:pPr>
-              <w:pStyle w:val="Compact"/>
-            </w:pPr>
-            <w:r>
-              <w:rPr>
-                <w:rStyle w:val="VerbatimChar"/>
-              </w:rPr>
-              <w:t xml:space="preserve">pxl.per-pixel-ionospheric-phase-correction</w:t>
-            </w:r>
-          </w:p>
-        </w:tc>
-        <w:tc>
-          <w:tcPr/>
-          <w:p>
-            <w:pPr>
-              <w:pStyle w:val="Compact"/>
-            </w:pPr>
-            <w:r>
-              <w:t xml:space="preserve">Ionospheric Phase Correction Image</w:t>
+              <w:t xml:space="preserve">Radiometric Accuracy</w:t>
             </w:r>
           </w:p>
         </w:tc>
@@ -14837,28 +15257,27 @@
         </w:tc>
       </w:tr>
     </w:tbl>
-    <w:bookmarkEnd w:id="267"/>
-    <w:bookmarkStart w:id="268" w:name="radiometrically-corrected-measurements"/>
+    <w:bookmarkEnd w:id="268"/>
+    <w:bookmarkStart w:id="269" w:name="geometric-corrections"/>
     <w:p>
       <w:pPr>
         <w:pStyle w:val="berschrift3"/>
       </w:pPr>
       <w:r>
-        <w:t xml:space="preserve">Radiometrically Corrected Measurements</w:t>
+        <w:t xml:space="preserve">Geometric Corrections</w:t>
       </w:r>
     </w:p>
     <w:tbl>
       <w:tblPr>
         <w:tblStyle w:val="Table"/>
-        <w:tblW w:type="pct" w:w="5000"/>
-        <w:tblLayout w:type="fixed"/>
+        <w:tblW w:type="auto" w:w="0"/>
         <w:tblLook w:firstRow="1" w:lastRow="0" w:firstColumn="0" w:lastColumn="0" w:noHBand="0" w:noVBand="0" w:val="0020"/>
       </w:tblPr>
       <w:tblGrid>
-        <w:gridCol w:w="2520"/>
-        <w:gridCol w:w="3060"/>
-        <w:gridCol w:w="1620"/>
-        <w:gridCol w:w="720"/>
+        <w:gridCol w:w="1980"/>
+        <w:gridCol w:w="1980"/>
+        <w:gridCol w:w="1980"/>
+        <w:gridCol w:w="1980"/>
       </w:tblGrid>
       <w:tr>
         <w:trPr>
@@ -14922,380 +15341,7 @@
               <w:rPr>
                 <w:rStyle w:val="VerbatimChar"/>
               </w:rPr>
-              <w:t xml:space="preserve">rcm.cloud-optimized-formats</w:t>
-            </w:r>
-          </w:p>
-        </w:tc>
-        <w:tc>
-          <w:tcPr/>
-          <w:p>
-            <w:pPr>
-              <w:pStyle w:val="Compact"/>
-            </w:pPr>
-            <w:r>
-              <w:t xml:space="preserve">Cloud Optimized Formats</w:t>
-            </w:r>
-          </w:p>
-        </w:tc>
-        <w:tc>
-          <w:tcPr/>
-          <w:p>
-            <w:pPr>
-              <w:pStyle w:val="Compact"/>
-              <w:jc w:val="center"/>
-            </w:pPr>
-            <w:r>
-              <w:rPr>
-                <w:i/>
-                <w:iCs/>
-              </w:rPr>
-              <w:t xml:space="preserve">not required</w:t>
-            </w:r>
-          </w:p>
-        </w:tc>
-        <w:tc>
-          <w:tcPr/>
-          <w:p>
-            <w:pPr>
-              <w:pStyle w:val="Compact"/>
-            </w:pPr>
-          </w:p>
-        </w:tc>
-      </w:tr>
-      <w:tr>
-        <w:tc>
-          <w:tcPr/>
-          <w:p>
-            <w:pPr>
-              <w:pStyle w:val="Compact"/>
-            </w:pPr>
-            <w:r>
-              <w:rPr>
-                <w:rStyle w:val="VerbatimChar"/>
-              </w:rPr>
-              <w:t xml:space="preserve">rcm.measurements-backscatter-gslc</w:t>
-            </w:r>
-          </w:p>
-        </w:tc>
-        <w:tc>
-          <w:tcPr/>
-          <w:p>
-            <w:pPr>
-              <w:pStyle w:val="Compact"/>
-            </w:pPr>
-            <w:r>
-              <w:t xml:space="preserve">Backscatter Measurements (GSLC)</w:t>
-            </w:r>
-          </w:p>
-        </w:tc>
-        <w:tc>
-          <w:tcPr/>
-          <w:p>
-            <w:pPr>
-              <w:pStyle w:val="Compact"/>
-            </w:pPr>
-          </w:p>
-        </w:tc>
-        <w:tc>
-          <w:tcPr/>
-          <w:p>
-            <w:pPr>
-              <w:pStyle w:val="Compact"/>
-              <w:jc w:val="center"/>
-            </w:pPr>
-            <w:r>
-              <w:rPr>
-                <w:i/>
-                <w:iCs/>
-              </w:rPr>
-              <w:t xml:space="preserve">as threshold</w:t>
-            </w:r>
-          </w:p>
-        </w:tc>
-      </w:tr>
-      <w:tr>
-        <w:tc>
-          <w:tcPr/>
-          <w:p>
-            <w:pPr>
-              <w:pStyle w:val="Compact"/>
-            </w:pPr>
-            <w:r>
-              <w:rPr>
-                <w:rStyle w:val="VerbatimChar"/>
-              </w:rPr>
-              <w:t xml:space="preserve">rcm.metadata-scaling-conversion</w:t>
-            </w:r>
-          </w:p>
-        </w:tc>
-        <w:tc>
-          <w:tcPr/>
-          <w:p>
-            <w:pPr>
-              <w:pStyle w:val="Compact"/>
-            </w:pPr>
-            <w:r>
-              <w:t xml:space="preserve">Scaling Conversion</w:t>
-            </w:r>
-          </w:p>
-        </w:tc>
-        <w:tc>
-          <w:tcPr/>
-          <w:p>
-            <w:pPr>
-              <w:pStyle w:val="Compact"/>
-            </w:pPr>
-          </w:p>
-        </w:tc>
-        <w:tc>
-          <w:tcPr/>
-          <w:p>
-            <w:pPr>
-              <w:pStyle w:val="Compact"/>
-            </w:pPr>
-          </w:p>
-        </w:tc>
-      </w:tr>
-      <w:tr>
-        <w:tc>
-          <w:tcPr/>
-          <w:p>
-            <w:pPr>
-              <w:pStyle w:val="Compact"/>
-            </w:pPr>
-            <w:r>
-              <w:rPr>
-                <w:rStyle w:val="VerbatimChar"/>
-              </w:rPr>
-              <w:t xml:space="preserve">rcm.metadata-noise-removal</w:t>
-            </w:r>
-          </w:p>
-        </w:tc>
-        <w:tc>
-          <w:tcPr/>
-          <w:p>
-            <w:pPr>
-              <w:pStyle w:val="Compact"/>
-            </w:pPr>
-            <w:r>
-              <w:t xml:space="preserve">Noise Removal</w:t>
-            </w:r>
-          </w:p>
-        </w:tc>
-        <w:tc>
-          <w:tcPr/>
-          <w:p>
-            <w:pPr>
-              <w:pStyle w:val="Compact"/>
-            </w:pPr>
-          </w:p>
-        </w:tc>
-        <w:tc>
-          <w:tcPr/>
-          <w:p>
-            <w:pPr>
-              <w:pStyle w:val="Compact"/>
-              <w:jc w:val="center"/>
-            </w:pPr>
-            <w:r>
-              <w:rPr>
-                <w:i/>
-                <w:iCs/>
-              </w:rPr>
-              <w:t xml:space="preserve">as threshold</w:t>
-            </w:r>
-          </w:p>
-        </w:tc>
-      </w:tr>
-      <w:tr>
-        <w:tc>
-          <w:tcPr/>
-          <w:p>
-            <w:pPr>
-              <w:pStyle w:val="Compact"/>
-            </w:pPr>
-            <w:r>
-              <w:rPr>
-                <w:rStyle w:val="VerbatimChar"/>
-              </w:rPr>
-              <w:t xml:space="preserve">rcm.corrections-radiometric-terrain-algo-gslc</w:t>
-            </w:r>
-          </w:p>
-        </w:tc>
-        <w:tc>
-          <w:tcPr/>
-          <w:p>
-            <w:pPr>
-              <w:pStyle w:val="Compact"/>
-            </w:pPr>
-            <w:r>
-              <w:t xml:space="preserve">Radiometric Terrain Correction Algorithm</w:t>
-            </w:r>
-          </w:p>
-        </w:tc>
-        <w:tc>
-          <w:tcPr/>
-          <w:p>
-            <w:pPr>
-              <w:pStyle w:val="Compact"/>
-              <w:jc w:val="center"/>
-            </w:pPr>
-            <w:r>
-              <w:rPr>
-                <w:i/>
-                <w:iCs/>
-              </w:rPr>
-              <w:t xml:space="preserve">not required</w:t>
-            </w:r>
-          </w:p>
-        </w:tc>
-        <w:tc>
-          <w:tcPr/>
-          <w:p>
-            <w:pPr>
-              <w:pStyle w:val="Compact"/>
-            </w:pPr>
-          </w:p>
-        </w:tc>
-      </w:tr>
-      <w:tr>
-        <w:tc>
-          <w:tcPr/>
-          <w:p>
-            <w:pPr>
-              <w:pStyle w:val="Compact"/>
-            </w:pPr>
-            <w:r>
-              <w:rPr>
-                <w:rStyle w:val="VerbatimChar"/>
-              </w:rPr>
-              <w:t xml:space="preserve">rcm.metadata-radiometric-accuracy-sar</w:t>
-            </w:r>
-          </w:p>
-        </w:tc>
-        <w:tc>
-          <w:tcPr/>
-          <w:p>
-            <w:pPr>
-              <w:pStyle w:val="Compact"/>
-            </w:pPr>
-            <w:r>
-              <w:t xml:space="preserve">Radiometric Accuracy</w:t>
-            </w:r>
-          </w:p>
-        </w:tc>
-        <w:tc>
-          <w:tcPr/>
-          <w:p>
-            <w:pPr>
-              <w:pStyle w:val="Compact"/>
-              <w:jc w:val="center"/>
-            </w:pPr>
-            <w:r>
-              <w:rPr>
-                <w:i/>
-                <w:iCs/>
-              </w:rPr>
-              <w:t xml:space="preserve">not required</w:t>
-            </w:r>
-          </w:p>
-        </w:tc>
-        <w:tc>
-          <w:tcPr/>
-          <w:p>
-            <w:pPr>
-              <w:pStyle w:val="Compact"/>
-            </w:pPr>
-          </w:p>
-        </w:tc>
-      </w:tr>
-    </w:tbl>
-    <w:bookmarkEnd w:id="268"/>
-    <w:bookmarkStart w:id="269" w:name="geometric-corrections"/>
-    <w:p>
-      <w:pPr>
-        <w:pStyle w:val="berschrift3"/>
-      </w:pPr>
-      <w:r>
-        <w:t xml:space="preserve">Geometric Corrections</w:t>
-      </w:r>
-    </w:p>
-    <w:tbl>
-      <w:tblPr>
-        <w:tblStyle w:val="Table"/>
-        <w:tblW w:type="pct" w:w="5000"/>
-        <w:tblLayout w:type="fixed"/>
-        <w:tblLook w:firstRow="1" w:lastRow="0" w:firstColumn="0" w:lastColumn="0" w:noHBand="0" w:noVBand="0" w:val="0020"/>
-      </w:tblPr>
-      <w:tblGrid>
-        <w:gridCol w:w="2520"/>
-        <w:gridCol w:w="3060"/>
-        <w:gridCol w:w="1620"/>
-        <w:gridCol w:w="720"/>
-      </w:tblGrid>
-      <w:tr>
-        <w:trPr>
-          <w:tblHeader w:val="on"/>
-        </w:trPr>
-        <w:tc>
-          <w:tcPr/>
-          <w:p>
-            <w:pPr>
-              <w:pStyle w:val="Compact"/>
-            </w:pPr>
-            <w:r>
-              <w:t xml:space="preserve">Requirement ID</w:t>
-            </w:r>
-          </w:p>
-        </w:tc>
-        <w:tc>
-          <w:tcPr/>
-          <w:p>
-            <w:pPr>
-              <w:pStyle w:val="Compact"/>
-            </w:pPr>
-            <w:r>
-              <w:t xml:space="preserve">Requirement Title</w:t>
-            </w:r>
-          </w:p>
-        </w:tc>
-        <w:tc>
-          <w:tcPr/>
-          <w:p>
-            <w:pPr>
-              <w:pStyle w:val="Compact"/>
-              <w:jc w:val="center"/>
-            </w:pPr>
-            <w:r>
-              <w:t xml:space="preserve">Threshold</w:t>
-            </w:r>
-          </w:p>
-        </w:tc>
-        <w:tc>
-          <w:tcPr/>
-          <w:p>
-            <w:pPr>
-              <w:pStyle w:val="Compact"/>
-              <w:jc w:val="center"/>
-            </w:pPr>
-            <w:r>
-              <w:t xml:space="preserve">Goal</w:t>
-            </w:r>
-          </w:p>
-        </w:tc>
-      </w:tr>
-      <w:tr>
-        <w:tc>
-          <w:tcPr/>
-          <w:p>
-            <w:pPr>
-              <w:pStyle w:val="Compact"/>
-            </w:pPr>
-            <w:r>
-              <w:rPr>
-                <w:rStyle w:val="VerbatimChar"/>
-              </w:rPr>
-              <w:t xml:space="preserve">gcor.metadata-geometric-correction-algorithm</w:t>
+              <w:t xml:space="preserve">gcor-gmcalg</w:t>
             </w:r>
           </w:p>
         </w:tc>
@@ -15346,7 +15392,7 @@
               <w:rPr>
                 <w:rStyle w:val="VerbatimChar"/>
               </w:rPr>
-              <w:t xml:space="preserve">gcor.corrections-dem</w:t>
+              <w:t xml:space="preserve">gcor-cordem</w:t>
             </w:r>
           </w:p>
         </w:tc>
@@ -15389,7 +15435,7 @@
               <w:rPr>
                 <w:rStyle w:val="VerbatimChar"/>
               </w:rPr>
-              <w:t xml:space="preserve">gcor.corrections-geometric-accuracy-radar</w:t>
+              <w:t xml:space="preserve">gcor-geoacr</w:t>
             </w:r>
           </w:p>
         </w:tc>
@@ -15432,7 +15478,7 @@
               <w:rPr>
                 <w:rStyle w:val="VerbatimChar"/>
               </w:rPr>
-              <w:t xml:space="preserve">gcor.corrections-geometric-refined-accuracy</w:t>
+              <w:t xml:space="preserve">gcor-georfa</w:t>
             </w:r>
           </w:p>
         </w:tc>
@@ -15483,7 +15529,7 @@
               <w:rPr>
                 <w:rStyle w:val="VerbatimChar"/>
               </w:rPr>
-              <w:t xml:space="preserve">gcor.corrections-gridding-convention</w:t>
+              <w:t xml:space="preserve">gcor-gridcv</w:t>
             </w:r>
           </w:p>
         </w:tc>
@@ -16842,23 +16888,7 @@
         <w:pStyle w:val="FirstParagraph"/>
       </w:pPr>
       <w:r>
-        <w:t xml:space="preserve">InSAR analysis capabilities from CEOS-ARD SAR products are enabled with GSLC products, which is also the case when the Flattened Phase per-pixel data (Section </w:t>
-      </w:r>
-      <w:r>
-        <w:t xml:space="preserve">“</w:t>
-      </w:r>
-      <w:r>
-        <w:rPr>
-          <w:b/>
-          <w:bCs/>
-        </w:rPr>
-        <w:t xml:space="preserve">¿sec:rcm.measurements-flattened-phase?</w:t>
-      </w:r>
-      <w:r>
-        <w:t xml:space="preserve">”</w:t>
-      </w:r>
-      <w:r>
-        <w:t xml:space="preserve">) are included in the NRB or POL products. This is made possible since the simulated topographic phase relative to a given reference orbit has been subtracted.</w:t>
+        <w:t xml:space="preserve">InSAR analysis capabilities from CEOS-ARD SAR products are enabled with GSLC products, which is also the case when the Flattened Phase per-pixel data are included in the NRB or POL products. This is made possible since the simulated topographic phase relative to a given reference orbit has been subtracted.</w:t>
       </w:r>
     </w:p>
     <w:p>
@@ -17920,23 +17950,7 @@
         <w:pStyle w:val="Textkrper"/>
       </w:pPr>
       <w:r>
-        <w:t xml:space="preserve">GSLC can also be saved as a NRB product by including the Flattened Phase per-pixel data (Section </w:t>
-      </w:r>
-      <w:r>
-        <w:t xml:space="preserve">“</w:t>
-      </w:r>
-      <w:r>
-        <w:rPr>
-          <w:b/>
-          <w:bCs/>
-        </w:rPr>
-        <w:t xml:space="preserve">¿sec:rcm.measurements-flattened-phase?</w:t>
-      </w:r>
-      <w:r>
-        <w:t xml:space="preserve">”</w:t>
-      </w:r>
-      <w:r>
-        <w:t xml:space="preserve">) as follows:</w:t>
+        <w:t xml:space="preserve">GSLC can also be saved as a NRB product by including the Flattened Phase per-pixel data as follows:</w:t>
       </w:r>
     </w:p>
     <w:p>
@@ -22807,23 +22821,7 @@
         <w:t xml:space="preserve"> </w:t>
       </w:r>
       <w:r>
-        <w:t xml:space="preserve">data (Section </w:t>
-      </w:r>
-      <w:r>
-        <w:t xml:space="preserve">“</w:t>
-      </w:r>
-      <w:r>
-        <w:rPr>
-          <w:b/>
-          <w:bCs/>
-        </w:rPr>
-        <w:t xml:space="preserve">¿sec:rcm.measurements-flattened-phase?</w:t>
-      </w:r>
-      <w:r>
-        <w:t xml:space="preserve">”</w:t>
-      </w:r>
-      <w:r>
-        <w:t xml:space="preserve">). This</w:t>
+        <w:t xml:space="preserve">data. This</w:t>
       </w:r>
       <w:r>
         <w:t xml:space="preserve"> </w:t>

</xml_diff>

<commit_message>
Deploy latest version of PFS documents b3cb1d77d5c125b0d69f8f66b3159722da640336
</commit_message>
<xml_diff>
--- a/latest/GSLC.docx
+++ b/latest/GSLC.docx
@@ -1315,6 +1315,22 @@
       </w:pPr>
       <w:r>
         <w:t xml:space="preserve">Ocean Radar Backscatter</w:t>
+      </w:r>
+    </w:p>
+    <w:p>
+      <w:pPr>
+        <w:pStyle w:val="DefinitionTerm"/>
+      </w:pPr>
+      <w:r>
+        <w:t xml:space="preserve">PFS</w:t>
+      </w:r>
+    </w:p>
+    <w:p>
+      <w:pPr>
+        <w:pStyle w:val="Definition"/>
+      </w:pPr>
+      <w:r>
+        <w:t xml:space="preserve">Product Family Specification</w:t>
       </w:r>
     </w:p>
     <w:p>

</xml_diff>

<commit_message>
Deploy latest version of PFS documents dd71122df284f0ba1f9bd635bb49c1a9e24e769d
</commit_message>
<xml_diff>
--- a/latest/GSLC.docx
+++ b/latest/GSLC.docx
@@ -154,7 +154,7 @@
         </w:numPr>
       </w:pPr>
       <w:r>
-        <w:t xml:space="preserve">Document history has ben reset. Check the previous versions for details</w:t>
+        <w:t xml:space="preserve">Document history has been reset. Check the previous versions for details</w:t>
       </w:r>
     </w:p>
     <w:p>
@@ -346,7 +346,7 @@
         <w:t xml:space="preserve"> </w:t>
       </w:r>
       <w:r>
-        <w:t xml:space="preserve">Migration to the new CEOS-ARD building block.</w:t>
+        <w:t xml:space="preserve">Migration to building blocks.</w:t>
       </w:r>
     </w:p>
     <w:p>
@@ -1678,7 +1678,7 @@
         <w:t xml:space="preserve">suitability of the dataset, and must meet the requirements listed below.</w:t>
       </w:r>
     </w:p>
-    <w:bookmarkStart w:id="35" w:name="sec:meta-trcsar"/>
+    <w:bookmarkStart w:id="35" w:name="sec:meta-trace-sar"/>
     <w:p>
       <w:pPr>
         <w:pStyle w:val="berschrift4"/>
@@ -1710,7 +1710,7 @@
         <w:rPr>
           <w:rStyle w:val="VerbatimChar"/>
         </w:rPr>
-        <w:t xml:space="preserve">meta-trcsar</w:t>
+        <w:t xml:space="preserve">meta-trace-sar</w:t>
       </w:r>
     </w:p>
     <w:bookmarkStart w:id="32" w:name="threshold-requirements"/>
@@ -1773,7 +1773,7 @@
       <w:r>
         <w:t xml:space="preserve">“</w:t>
       </w:r>
-      <w:hyperlink w:anchor="sec:rcm-rmasar">
+      <w:hyperlink w:anchor="sec:rcm-radacc-sar">
         <w:r>
           <w:rPr>
             <w:rStyle w:val="Hyperlink"/>
@@ -1867,7 +1867,7 @@
     </w:p>
     <w:bookmarkEnd w:id="34"/>
     <w:bookmarkEnd w:id="35"/>
-    <w:bookmarkStart w:id="39" w:name="sec:meta-mrdsar"/>
+    <w:bookmarkStart w:id="39" w:name="sec:meta-memare-sar"/>
     <w:p>
       <w:pPr>
         <w:pStyle w:val="berschrift4"/>
@@ -1899,7 +1899,7 @@
         <w:rPr>
           <w:rStyle w:val="VerbatimChar"/>
         </w:rPr>
-        <w:t xml:space="preserve">meta-mrdsar</w:t>
+        <w:t xml:space="preserve">meta-memare-sar</w:t>
       </w:r>
     </w:p>
     <w:bookmarkStart w:id="36" w:name="threshold-requirements-1"/>
@@ -2004,7 +2004,7 @@
     </w:p>
     <w:bookmarkEnd w:id="38"/>
     <w:bookmarkEnd w:id="39"/>
-    <w:bookmarkStart w:id="43" w:name="sec:meta-prdtyp"/>
+    <w:bookmarkStart w:id="43" w:name="sec:meta-protype"/>
     <w:p>
       <w:pPr>
         <w:pStyle w:val="berschrift4"/>
@@ -2036,7 +2036,7 @@
         <w:rPr>
           <w:rStyle w:val="VerbatimChar"/>
         </w:rPr>
-        <w:t xml:space="preserve">meta-prdtyp</w:t>
+        <w:t xml:space="preserve">meta-protype</w:t>
       </w:r>
     </w:p>
     <w:bookmarkStart w:id="40" w:name="threshold-requirements-2"/>
@@ -2284,7 +2284,7 @@
     </w:p>
     <w:bookmarkEnd w:id="46"/>
     <w:bookmarkEnd w:id="47"/>
-    <w:bookmarkStart w:id="51" w:name="sec:meta-timsar"/>
+    <w:bookmarkStart w:id="51" w:name="sec:meta-time-sar"/>
     <w:p>
       <w:pPr>
         <w:pStyle w:val="berschrift4"/>
@@ -2316,7 +2316,7 @@
         <w:rPr>
           <w:rStyle w:val="VerbatimChar"/>
         </w:rPr>
-        <w:t xml:space="preserve">meta-timsar</w:t>
+        <w:t xml:space="preserve">meta-time-sar</w:t>
       </w:r>
     </w:p>
     <w:bookmarkStart w:id="48" w:name="threshold-requirements-4"/>
@@ -2350,7 +2350,7 @@
       <w:r>
         <w:t xml:space="preserve">“</w:t>
       </w:r>
-      <w:hyperlink w:anchor="sec:pxl-ppacqd">
+      <w:hyperlink w:anchor="sec:pxl-pacqid">
         <w:r>
           <w:rPr>
             <w:rStyle w:val="Hyperlink"/>
@@ -2498,7 +2498,7 @@
         <w:t xml:space="preserve">This may be one or mutliple acquisitions.</w:t>
       </w:r>
     </w:p>
-    <w:bookmarkStart w:id="56" w:name="sec:src-acqid"/>
+    <w:bookmarkStart w:id="56" w:name="sec:src-macqid"/>
     <w:p>
       <w:pPr>
         <w:pStyle w:val="berschrift4"/>
@@ -2530,7 +2530,7 @@
         <w:rPr>
           <w:rStyle w:val="VerbatimChar"/>
         </w:rPr>
-        <w:t xml:space="preserve">src-acqid</w:t>
+        <w:t xml:space="preserve">src-macqid</w:t>
       </w:r>
     </w:p>
     <w:bookmarkStart w:id="53" w:name="threshold-requirements-5"/>
@@ -2638,7 +2638,7 @@
     </w:p>
     <w:bookmarkEnd w:id="55"/>
     <w:bookmarkEnd w:id="56"/>
-    <w:bookmarkStart w:id="60" w:name="sec:src-dacsrc"/>
+    <w:bookmarkStart w:id="60" w:name="sec:src-daccess-src"/>
     <w:p>
       <w:pPr>
         <w:pStyle w:val="berschrift4"/>
@@ -2670,7 +2670,7 @@
         <w:rPr>
           <w:rStyle w:val="VerbatimChar"/>
         </w:rPr>
-        <w:t xml:space="preserve">src-dacsrc</w:t>
+        <w:t xml:space="preserve">src-daccess-src</w:t>
       </w:r>
     </w:p>
     <w:bookmarkStart w:id="57" w:name="threshold-requirements-6"/>
@@ -2775,7 +2775,7 @@
     </w:p>
     <w:bookmarkEnd w:id="59"/>
     <w:bookmarkEnd w:id="60"/>
-    <w:bookmarkStart w:id="65" w:name="sec:src-inssar"/>
+    <w:bookmarkStart w:id="65" w:name="sec:src-instru-sar"/>
     <w:p>
       <w:pPr>
         <w:pStyle w:val="berschrift4"/>
@@ -2807,7 +2807,7 @@
         <w:rPr>
           <w:rStyle w:val="VerbatimChar"/>
         </w:rPr>
-        <w:t xml:space="preserve">src-inssar</w:t>
+        <w:t xml:space="preserve">src-instru-sar</w:t>
       </w:r>
     </w:p>
     <w:bookmarkStart w:id="61" w:name="threshold-requirements-7"/>
@@ -2953,7 +2953,7 @@
     </w:p>
     <w:bookmarkEnd w:id="64"/>
     <w:bookmarkEnd w:id="65"/>
-    <w:bookmarkStart w:id="69" w:name="sec:src-timsrc"/>
+    <w:bookmarkStart w:id="69" w:name="sec:src-time-src"/>
     <w:p>
       <w:pPr>
         <w:pStyle w:val="berschrift4"/>
@@ -2985,7 +2985,7 @@
         <w:rPr>
           <w:rStyle w:val="VerbatimChar"/>
         </w:rPr>
-        <w:t xml:space="preserve">src-timsrc</w:t>
+        <w:t xml:space="preserve">src-time-src</w:t>
       </w:r>
     </w:p>
     <w:bookmarkStart w:id="66" w:name="threshold-requirements-8"/>
@@ -3508,7 +3508,7 @@
     </w:p>
     <w:bookmarkEnd w:id="77"/>
     <w:bookmarkEnd w:id="78"/>
-    <w:bookmarkStart w:id="82" w:name="sec:src-prcpar"/>
+    <w:bookmarkStart w:id="82" w:name="sec:src-propar"/>
     <w:p>
       <w:pPr>
         <w:pStyle w:val="berschrift4"/>
@@ -3540,7 +3540,7 @@
         <w:rPr>
           <w:rStyle w:val="VerbatimChar"/>
         </w:rPr>
-        <w:t xml:space="preserve">src-prcpar</w:t>
+        <w:t xml:space="preserve">src-propar</w:t>
       </w:r>
     </w:p>
     <w:bookmarkStart w:id="79" w:name="threshold-requirements-11"/>
@@ -3729,7 +3729,7 @@
     </w:p>
     <w:bookmarkEnd w:id="81"/>
     <w:bookmarkEnd w:id="82"/>
-    <w:bookmarkStart w:id="86" w:name="sec:src-imgatt"/>
+    <w:bookmarkStart w:id="86" w:name="sec:src-imgatt-sar"/>
     <w:p>
       <w:pPr>
         <w:pStyle w:val="berschrift4"/>
@@ -3761,7 +3761,7 @@
         <w:rPr>
           <w:rStyle w:val="VerbatimChar"/>
         </w:rPr>
-        <w:t xml:space="preserve">src-imgatt</w:t>
+        <w:t xml:space="preserve">src-imgatt-sar</w:t>
       </w:r>
     </w:p>
     <w:bookmarkStart w:id="83" w:name="threshold-requirements-12"/>
@@ -3950,7 +3950,7 @@
     </w:p>
     <w:bookmarkEnd w:id="85"/>
     <w:bookmarkEnd w:id="86"/>
-    <w:bookmarkStart w:id="90" w:name="sec:src-scasar"/>
+    <w:bookmarkStart w:id="90" w:name="sec:src-sencal-sar"/>
     <w:p>
       <w:pPr>
         <w:pStyle w:val="berschrift4"/>
@@ -3982,7 +3982,7 @@
         <w:rPr>
           <w:rStyle w:val="VerbatimChar"/>
         </w:rPr>
-        <w:t xml:space="preserve">src-scasar</w:t>
+        <w:t xml:space="preserve">src-sencal-sar</w:t>
       </w:r>
     </w:p>
     <w:bookmarkStart w:id="87" w:name="threshold-requirements-13"/>
@@ -4096,7 +4096,7 @@
     </w:p>
     <w:bookmarkEnd w:id="89"/>
     <w:bookmarkEnd w:id="90"/>
-    <w:bookmarkStart w:id="94" w:name="sec:src-prfind"/>
+    <w:bookmarkStart w:id="94" w:name="sec:src-perfind"/>
     <w:p>
       <w:pPr>
         <w:pStyle w:val="berschrift4"/>
@@ -4128,7 +4128,7 @@
         <w:rPr>
           <w:rStyle w:val="VerbatimChar"/>
         </w:rPr>
-        <w:t xml:space="preserve">src-prfind</w:t>
+        <w:t xml:space="preserve">src-perfind</w:t>
       </w:r>
     </w:p>
     <w:bookmarkStart w:id="91" w:name="threshold-requirements-14"/>
@@ -4339,7 +4339,7 @@
     </w:p>
     <w:bookmarkEnd w:id="93"/>
     <w:bookmarkEnd w:id="94"/>
-    <w:bookmarkStart w:id="98" w:name="sec:src-polcal"/>
+    <w:bookmarkStart w:id="98" w:name="sec:src-polcalm"/>
     <w:p>
       <w:pPr>
         <w:pStyle w:val="berschrift4"/>
@@ -4371,7 +4371,7 @@
         <w:rPr>
           <w:rStyle w:val="VerbatimChar"/>
         </w:rPr>
-        <w:t xml:space="preserve">src-polcal</w:t>
+        <w:t xml:space="preserve">src-polcalm</w:t>
       </w:r>
     </w:p>
     <w:bookmarkStart w:id="95" w:name="threshold-requirements-15"/>
@@ -4479,7 +4479,7 @@
     </w:p>
     <w:bookmarkEnd w:id="97"/>
     <w:bookmarkEnd w:id="98"/>
-    <w:bookmarkStart w:id="102" w:name="sec:src-mfrang"/>
+    <w:bookmarkStart w:id="102" w:name="sec:src-farotan"/>
     <w:p>
       <w:pPr>
         <w:pStyle w:val="berschrift4"/>
@@ -4511,7 +4511,7 @@
         <w:rPr>
           <w:rStyle w:val="VerbatimChar"/>
         </w:rPr>
-        <w:t xml:space="preserve">src-mfrang</w:t>
+        <w:t xml:space="preserve">src-farotan</w:t>
       </w:r>
     </w:p>
     <w:bookmarkStart w:id="99" w:name="threshold-requirements-16"/>
@@ -4797,7 +4797,7 @@
         <w:t xml:space="preserve">Information related to the CEOS-ARD product generation procedure and geographic parameters.</w:t>
       </w:r>
     </w:p>
-    <w:bookmarkStart w:id="111" w:name="sec:prd-dacprd"/>
+    <w:bookmarkStart w:id="111" w:name="sec:prd-daccess-prod"/>
     <w:p>
       <w:pPr>
         <w:pStyle w:val="berschrift4"/>
@@ -4829,7 +4829,7 @@
         <w:rPr>
           <w:rStyle w:val="VerbatimChar"/>
         </w:rPr>
-        <w:t xml:space="preserve">prd-dacprd</w:t>
+        <w:t xml:space="preserve">prd-daccess-prod</w:t>
       </w:r>
     </w:p>
     <w:bookmarkStart w:id="108" w:name="threshold-requirements-18"/>
@@ -4982,7 +4982,7 @@
     </w:p>
     <w:bookmarkEnd w:id="110"/>
     <w:bookmarkEnd w:id="111"/>
-    <w:bookmarkStart w:id="115" w:name="sec:prd-auxdat"/>
+    <w:bookmarkStart w:id="115" w:name="sec:prd-auxdat-sar"/>
     <w:p>
       <w:pPr>
         <w:pStyle w:val="berschrift4"/>
@@ -5014,7 +5014,7 @@
         <w:rPr>
           <w:rStyle w:val="VerbatimChar"/>
         </w:rPr>
-        <w:t xml:space="preserve">prd-auxdat</w:t>
+        <w:t xml:space="preserve">prd-auxdat-sar</w:t>
       </w:r>
     </w:p>
     <w:bookmarkStart w:id="112" w:name="threshold-requirements-19"/>
@@ -5060,7 +5060,7 @@
         <w:pStyle w:val="Textkrper"/>
       </w:pPr>
       <w:r>
-        <w:t xml:space="preserve">Notes:</w:t>
+        <w:t xml:space="preserve">Note:</w:t>
       </w:r>
     </w:p>
     <w:p>
@@ -5142,7 +5142,7 @@
     </w:p>
     <w:bookmarkEnd w:id="114"/>
     <w:bookmarkEnd w:id="115"/>
-    <w:bookmarkStart w:id="119" w:name="sec:prd-smpspc"/>
+    <w:bookmarkStart w:id="119" w:name="sec:prd-samspa"/>
     <w:p>
       <w:pPr>
         <w:pStyle w:val="berschrift4"/>
@@ -5174,7 +5174,7 @@
         <w:rPr>
           <w:rStyle w:val="VerbatimChar"/>
         </w:rPr>
-        <w:t xml:space="preserve">prd-smpspc</w:t>
+        <w:t xml:space="preserve">prd-samspa</w:t>
       </w:r>
     </w:p>
     <w:bookmarkStart w:id="116" w:name="threshold-requirements-20"/>
@@ -5470,7 +5470,7 @@
     </w:p>
     <w:bookmarkEnd w:id="122"/>
     <w:bookmarkEnd w:id="123"/>
-    <w:bookmarkStart w:id="127" w:name="sec:prd-geobx"/>
+    <w:bookmarkStart w:id="127" w:name="sec:prd-geobbox"/>
     <w:p>
       <w:pPr>
         <w:pStyle w:val="berschrift4"/>
@@ -5502,7 +5502,7 @@
         <w:rPr>
           <w:rStyle w:val="VerbatimChar"/>
         </w:rPr>
-        <w:t xml:space="preserve">prd-geobx</w:t>
+        <w:t xml:space="preserve">prd-geobbox</w:t>
       </w:r>
     </w:p>
     <w:bookmarkStart w:id="124" w:name="threshold-requirements-22"/>
@@ -5530,7 +5530,7 @@
       <w:r>
         <w:t xml:space="preserve">“</w:t>
       </w:r>
-      <w:hyperlink w:anchor="sec:prd-crs">
+      <w:hyperlink w:anchor="sec:prd-crs-sar">
         <w:r>
           <w:rPr>
             <w:rStyle w:val="Hyperlink"/>
@@ -5550,7 +5550,7 @@
         <w:pStyle w:val="Textkrper"/>
       </w:pPr>
       <w:r>
-        <w:t xml:space="preserve">Notes:</w:t>
+        <w:t xml:space="preserve">Note:</w:t>
       </w:r>
     </w:p>
     <w:p>
@@ -5653,7 +5653,7 @@
     </w:p>
     <w:bookmarkEnd w:id="126"/>
     <w:bookmarkEnd w:id="127"/>
-    <w:bookmarkStart w:id="131" w:name="sec:prd-geoare"/>
+    <w:bookmarkStart w:id="131" w:name="sec:prd-geoarea-sar"/>
     <w:p>
       <w:pPr>
         <w:pStyle w:val="berschrift4"/>
@@ -5685,7 +5685,7 @@
         <w:rPr>
           <w:rStyle w:val="VerbatimChar"/>
         </w:rPr>
-        <w:t xml:space="preserve">prd-geoare</w:t>
+        <w:t xml:space="preserve">prd-geoarea-sar</w:t>
       </w:r>
     </w:p>
     <w:bookmarkStart w:id="128" w:name="threshold-requirements-23"/>
@@ -5793,7 +5793,7 @@
     </w:p>
     <w:bookmarkEnd w:id="130"/>
     <w:bookmarkEnd w:id="131"/>
-    <w:bookmarkStart w:id="135" w:name="sec:prd-imgsiz"/>
+    <w:bookmarkStart w:id="135" w:name="sec:prd-imgsize"/>
     <w:p>
       <w:pPr>
         <w:pStyle w:val="berschrift4"/>
@@ -5825,7 +5825,7 @@
         <w:rPr>
           <w:rStyle w:val="VerbatimChar"/>
         </w:rPr>
-        <w:t xml:space="preserve">prd-imgsiz</w:t>
+        <w:t xml:space="preserve">prd-imgsize</w:t>
       </w:r>
     </w:p>
     <w:bookmarkStart w:id="132" w:name="threshold-requirements-24"/>
@@ -5981,7 +5981,7 @@
     </w:p>
     <w:bookmarkEnd w:id="134"/>
     <w:bookmarkEnd w:id="135"/>
-    <w:bookmarkStart w:id="139" w:name="sec:prd-pxconv"/>
+    <w:bookmarkStart w:id="139" w:name="sec:prd-pixcoco"/>
     <w:p>
       <w:pPr>
         <w:pStyle w:val="berschrift4"/>
@@ -6013,7 +6013,7 @@
         <w:rPr>
           <w:rStyle w:val="VerbatimChar"/>
         </w:rPr>
-        <w:t xml:space="preserve">prd-pxconv</w:t>
+        <w:t xml:space="preserve">prd-pixcoco</w:t>
       </w:r>
     </w:p>
     <w:bookmarkStart w:id="136" w:name="threshold-requirements-25"/>
@@ -6127,7 +6127,7 @@
     </w:p>
     <w:bookmarkEnd w:id="138"/>
     <w:bookmarkEnd w:id="139"/>
-    <w:bookmarkStart w:id="143" w:name="sec:prd-crs"/>
+    <w:bookmarkStart w:id="143" w:name="sec:prd-crs-sar"/>
     <w:p>
       <w:pPr>
         <w:pStyle w:val="berschrift4"/>
@@ -6159,7 +6159,7 @@
         <w:rPr>
           <w:rStyle w:val="VerbatimChar"/>
         </w:rPr>
-        <w:t xml:space="preserve">prd-crs</w:t>
+        <w:t xml:space="preserve">prd-crs-sar</w:t>
       </w:r>
     </w:p>
     <w:bookmarkStart w:id="140" w:name="threshold-requirements-26"/>
@@ -6341,7 +6341,7 @@
       <w:r>
         <w:t xml:space="preserve">“</w:t>
       </w:r>
-      <w:hyperlink w:anchor="sec:pxl-pprulv">
+      <w:hyperlink w:anchor="sec:pxl-radulov">
         <w:r>
           <w:rPr>
             <w:rStyle w:val="Hyperlink"/>
@@ -6460,7 +6460,7 @@
     </w:p>
     <w:bookmarkEnd w:id="146"/>
     <w:bookmarkEnd w:id="147"/>
-    <w:bookmarkStart w:id="151" w:name="sec:prd-sltrng"/>
+    <w:bookmarkStart w:id="151" w:name="sec:prd-slarass"/>
     <w:p>
       <w:pPr>
         <w:pStyle w:val="berschrift4"/>
@@ -6492,7 +6492,7 @@
         <w:rPr>
           <w:rStyle w:val="VerbatimChar"/>
         </w:rPr>
-        <w:t xml:space="preserve">prd-sltrng</w:t>
+        <w:t xml:space="preserve">prd-slarass</w:t>
       </w:r>
     </w:p>
     <w:bookmarkStart w:id="148" w:name="threshold-requirements-28"/>
@@ -6522,7 +6522,7 @@
       <w:r>
         <w:t xml:space="preserve">“</w:t>
       </w:r>
-      <w:hyperlink w:anchor="sec:pxl-ppslrg">
+      <w:hyperlink w:anchor="sec:pxl-slarassi">
         <w:r>
           <w:rPr>
             <w:rStyle w:val="Hyperlink"/>
@@ -6641,7 +6641,7 @@
     </w:p>
     <w:bookmarkEnd w:id="150"/>
     <w:bookmarkEnd w:id="151"/>
-    <w:bookmarkStart w:id="155" w:name="sec:prd-orbgsl"/>
+    <w:bookmarkStart w:id="155" w:name="sec:prd-reorbit-gslc"/>
     <w:p>
       <w:pPr>
         <w:pStyle w:val="berschrift4"/>
@@ -6673,7 +6673,7 @@
         <w:rPr>
           <w:rStyle w:val="VerbatimChar"/>
         </w:rPr>
-        <w:t xml:space="preserve">prd-orbgsl</w:t>
+        <w:t xml:space="preserve">prd-reorbit-gslc</w:t>
       </w:r>
     </w:p>
     <w:p>
@@ -6861,16 +6861,32 @@
         <w:t xml:space="preserve"> </w:t>
       </w:r>
       <w:r>
-        <w:t xml:space="preserve">Whether the metadata are provided in a single record relevant to all pixels or separately for each pixel is at the discretion of the data provider.</w:t>
-      </w:r>
-      <w:r>
-        <w:t xml:space="preserve"> </w:t>
-      </w:r>
-      <w:r>
-        <w:t xml:space="preserve">Per-pixel metadata should allow users to discriminate between (choose) observations on the basis of their individual suitability for applications.</w:t>
-      </w:r>
-    </w:p>
-    <w:bookmarkStart w:id="160" w:name="sec:pxl-cldopt"/>
+        <w:t xml:space="preserve">Whether the metadata is provided in a single record relevant to all pixels, or separately for each pixel, is at the discretion of the data provider.</w:t>
+      </w:r>
+      <w:r>
+        <w:t xml:space="preserve"> </w:t>
+      </w:r>
+      <w:r>
+        <w:t xml:space="preserve">Per-pixel metadata should allow users to</w:t>
+      </w:r>
+      <w:r>
+        <w:t xml:space="preserve"> </w:t>
+      </w:r>
+      <w:r>
+        <w:rPr>
+          <w:b/>
+          <w:bCs/>
+        </w:rPr>
+        <w:t xml:space="preserve">discriminate between</w:t>
+      </w:r>
+      <w:r>
+        <w:t xml:space="preserve"> </w:t>
+      </w:r>
+      <w:r>
+        <w:t xml:space="preserve">(choose) observations on the basis of their individual suitability for application.</w:t>
+      </w:r>
+    </w:p>
+    <w:bookmarkStart w:id="160" w:name="sec:pxl-cngform"/>
     <w:p>
       <w:pPr>
         <w:pStyle w:val="berschrift4"/>
@@ -6902,7 +6918,7 @@
         <w:rPr>
           <w:rStyle w:val="VerbatimChar"/>
         </w:rPr>
-        <w:t xml:space="preserve">pxl-cldopt</w:t>
+        <w:t xml:space="preserve">pxl-cngform</w:t>
       </w:r>
     </w:p>
     <w:bookmarkStart w:id="157" w:name="threshold-requirements-30"/>
@@ -7010,7 +7026,7 @@
     </w:p>
     <w:bookmarkEnd w:id="159"/>
     <w:bookmarkEnd w:id="160"/>
-    <w:bookmarkStart w:id="164" w:name="sec:pxl-mrdsar"/>
+    <w:bookmarkStart w:id="164" w:name="sec:pxl-memare-sar"/>
     <w:p>
       <w:pPr>
         <w:pStyle w:val="berschrift4"/>
@@ -7042,7 +7058,7 @@
         <w:rPr>
           <w:rStyle w:val="VerbatimChar"/>
         </w:rPr>
-        <w:t xml:space="preserve">pxl-mrdsar</w:t>
+        <w:t xml:space="preserve">pxl-memare-sar</w:t>
       </w:r>
     </w:p>
     <w:bookmarkStart w:id="161" w:name="threshold-requirements-31"/>
@@ -7147,7 +7163,7 @@
     </w:p>
     <w:bookmarkEnd w:id="163"/>
     <w:bookmarkEnd w:id="164"/>
-    <w:bookmarkStart w:id="168" w:name="sec:pxl-ppmask"/>
+    <w:bookmarkStart w:id="168" w:name="sec:pxl-damaski"/>
     <w:p>
       <w:pPr>
         <w:pStyle w:val="berschrift4"/>
@@ -7179,7 +7195,7 @@
         <w:rPr>
           <w:rStyle w:val="VerbatimChar"/>
         </w:rPr>
-        <w:t xml:space="preserve">pxl-ppmask</w:t>
+        <w:t xml:space="preserve">pxl-damaski</w:t>
       </w:r>
     </w:p>
     <w:bookmarkStart w:id="165" w:name="threshold-requirements-32"/>
@@ -7472,7 +7488,7 @@
     </w:p>
     <w:bookmarkEnd w:id="167"/>
     <w:bookmarkEnd w:id="168"/>
-    <w:bookmarkStart w:id="172" w:name="sec:pxl-ppscta"/>
+    <w:bookmarkStart w:id="172" w:name="sec:pxl-piscata"/>
     <w:p>
       <w:pPr>
         <w:pStyle w:val="berschrift4"/>
@@ -7504,7 +7520,7 @@
         <w:rPr>
           <w:rStyle w:val="VerbatimChar"/>
         </w:rPr>
-        <w:t xml:space="preserve">pxl-ppscta</w:t>
+        <w:t xml:space="preserve">pxl-piscata</w:t>
       </w:r>
     </w:p>
     <w:p>
@@ -7778,7 +7794,7 @@
     </w:p>
     <w:bookmarkEnd w:id="171"/>
     <w:bookmarkEnd w:id="172"/>
-    <w:bookmarkStart w:id="176" w:name="sec:pxl-pplia"/>
+    <w:bookmarkStart w:id="176" w:name="sec:pxl-ploinca"/>
     <w:p>
       <w:pPr>
         <w:pStyle w:val="berschrift4"/>
@@ -7810,7 +7826,7 @@
         <w:rPr>
           <w:rStyle w:val="VerbatimChar"/>
         </w:rPr>
-        <w:t xml:space="preserve">pxl-pplia</w:t>
+        <w:t xml:space="preserve">pxl-ploinca</w:t>
       </w:r>
     </w:p>
     <w:bookmarkStart w:id="173" w:name="threshold-requirements-34"/>
@@ -7903,7 +7919,7 @@
         <w:pStyle w:val="FirstParagraph"/>
       </w:pPr>
       <w:r>
-        <w:t xml:space="preserve">Notes:</w:t>
+        <w:t xml:space="preserve">Note:</w:t>
       </w:r>
     </w:p>
     <w:p>
@@ -8006,7 +8022,7 @@
     </w:p>
     <w:bookmarkEnd w:id="175"/>
     <w:bookmarkEnd w:id="176"/>
-    <w:bookmarkStart w:id="180" w:name="sec:pxl-ppelia"/>
+    <w:bookmarkStart w:id="180" w:name="sec:pxl-pelinca"/>
     <w:p>
       <w:pPr>
         <w:pStyle w:val="berschrift4"/>
@@ -8038,7 +8054,7 @@
         <w:rPr>
           <w:rStyle w:val="VerbatimChar"/>
         </w:rPr>
-        <w:t xml:space="preserve">pxl-ppelia</w:t>
+        <w:t xml:space="preserve">pxl-pelinca</w:t>
       </w:r>
     </w:p>
     <w:bookmarkStart w:id="177" w:name="threshold-requirements-35"/>
@@ -8164,7 +8180,7 @@
         <w:pStyle w:val="FirstParagraph"/>
       </w:pPr>
       <w:r>
-        <w:t xml:space="preserve">Notes:</w:t>
+        <w:t xml:space="preserve">Note:</w:t>
       </w:r>
     </w:p>
     <w:p>
@@ -8246,7 +8262,7 @@
     </w:p>
     <w:bookmarkEnd w:id="179"/>
     <w:bookmarkEnd w:id="180"/>
-    <w:bookmarkStart w:id="184" w:name="sec:pxl-ppnspw"/>
+    <w:bookmarkStart w:id="184" w:name="sec:pxl-pinopow"/>
     <w:p>
       <w:pPr>
         <w:pStyle w:val="berschrift4"/>
@@ -8278,7 +8294,7 @@
         <w:rPr>
           <w:rStyle w:val="VerbatimChar"/>
         </w:rPr>
-        <w:t xml:space="preserve">pxl-ppnspw</w:t>
+        <w:t xml:space="preserve">pxl-pinopow</w:t>
       </w:r>
     </w:p>
     <w:bookmarkStart w:id="181" w:name="threshold-requirements-36"/>
@@ -8580,7 +8596,7 @@
     </w:p>
     <w:bookmarkEnd w:id="183"/>
     <w:bookmarkEnd w:id="184"/>
-    <w:bookmarkStart w:id="188" w:name="sec:pxl-ppgmsg"/>
+    <w:bookmarkStart w:id="188" w:name="sec:pxl-gasiri"/>
     <w:p>
       <w:pPr>
         <w:pStyle w:val="berschrift4"/>
@@ -8612,7 +8628,7 @@
         <w:rPr>
           <w:rStyle w:val="VerbatimChar"/>
         </w:rPr>
-        <w:t xml:space="preserve">pxl-ppgmsg</w:t>
+        <w:t xml:space="preserve">pxl-gasiri</w:t>
       </w:r>
     </w:p>
     <w:bookmarkStart w:id="185" w:name="threshold-requirements-37"/>
@@ -8853,7 +8869,7 @@
     </w:p>
     <w:bookmarkEnd w:id="187"/>
     <w:bookmarkEnd w:id="188"/>
-    <w:bookmarkStart w:id="192" w:name="sec:pxl-ppacqd"/>
+    <w:bookmarkStart w:id="192" w:name="sec:pxl-pacqid"/>
     <w:p>
       <w:pPr>
         <w:pStyle w:val="berschrift4"/>
@@ -8885,7 +8901,7 @@
         <w:rPr>
           <w:rStyle w:val="VerbatimChar"/>
         </w:rPr>
-        <w:t xml:space="preserve">pxl-ppacqd</w:t>
+        <w:t xml:space="preserve">pxl-pacqid</w:t>
       </w:r>
     </w:p>
     <w:bookmarkStart w:id="189" w:name="threshold-requirements-38"/>
@@ -8927,7 +8943,7 @@
       <w:r>
         <w:t xml:space="preserve">“</w:t>
       </w:r>
-      <w:hyperlink w:anchor="sec:src-acqid">
+      <w:hyperlink w:anchor="sec:src-macqid">
         <w:r>
           <w:rPr>
             <w:rStyle w:val="Hyperlink"/>
@@ -9117,7 +9133,7 @@
     </w:p>
     <w:bookmarkEnd w:id="191"/>
     <w:bookmarkEnd w:id="192"/>
-    <w:bookmarkStart w:id="196" w:name="sec:pxl-ppdem"/>
+    <w:bookmarkStart w:id="196" w:name="sec:pxl-pidem"/>
     <w:p>
       <w:pPr>
         <w:pStyle w:val="berschrift4"/>
@@ -9149,7 +9165,7 @@
         <w:rPr>
           <w:rStyle w:val="VerbatimChar"/>
         </w:rPr>
-        <w:t xml:space="preserve">pxl-ppdem</w:t>
+        <w:t xml:space="preserve">pxl-pidem</w:t>
       </w:r>
     </w:p>
     <w:bookmarkStart w:id="193" w:name="threshold-requirements-39"/>
@@ -9333,7 +9349,7 @@
     </w:p>
     <w:bookmarkEnd w:id="195"/>
     <w:bookmarkEnd w:id="196"/>
-    <w:bookmarkStart w:id="200" w:name="sec:pxl-pprulv"/>
+    <w:bookmarkStart w:id="200" w:name="sec:pxl-radulov"/>
     <w:p>
       <w:pPr>
         <w:pStyle w:val="berschrift4"/>
@@ -9365,7 +9381,7 @@
         <w:rPr>
           <w:rStyle w:val="VerbatimChar"/>
         </w:rPr>
-        <w:t xml:space="preserve">pxl-pprulv</w:t>
+        <w:t xml:space="preserve">pxl-radulov</w:t>
       </w:r>
     </w:p>
     <w:bookmarkStart w:id="197" w:name="threshold-requirements-40"/>
@@ -9547,7 +9563,7 @@
     </w:p>
     <w:bookmarkEnd w:id="199"/>
     <w:bookmarkEnd w:id="200"/>
-    <w:bookmarkStart w:id="204" w:name="sec:pxl-ppslrg"/>
+    <w:bookmarkStart w:id="204" w:name="sec:pxl-slarassi"/>
     <w:p>
       <w:pPr>
         <w:pStyle w:val="berschrift4"/>
@@ -9579,7 +9595,7 @@
         <w:rPr>
           <w:rStyle w:val="VerbatimChar"/>
         </w:rPr>
-        <w:t xml:space="preserve">pxl-ppslrg</w:t>
+        <w:t xml:space="preserve">pxl-slarassi</w:t>
       </w:r>
     </w:p>
     <w:bookmarkStart w:id="201" w:name="threshold-requirements-41"/>
@@ -9755,7 +9771,7 @@
     </w:p>
     <w:bookmarkEnd w:id="203"/>
     <w:bookmarkEnd w:id="204"/>
-    <w:bookmarkStart w:id="208" w:name="sec:pxl-ppiphu"/>
+    <w:bookmarkStart w:id="208" w:name="sec:pxl-pinphun"/>
     <w:p>
       <w:pPr>
         <w:pStyle w:val="berschrift4"/>
@@ -9787,7 +9803,7 @@
         <w:rPr>
           <w:rStyle w:val="VerbatimChar"/>
         </w:rPr>
-        <w:t xml:space="preserve">pxl-ppiphu</w:t>
+        <w:t xml:space="preserve">pxl-pinphun</w:t>
       </w:r>
     </w:p>
     <w:bookmarkStart w:id="205" w:name="threshold-requirements-42"/>
@@ -9975,7 +9991,7 @@
     </w:p>
     <w:bookmarkEnd w:id="207"/>
     <w:bookmarkEnd w:id="208"/>
-    <w:bookmarkStart w:id="212" w:name="sec:pxl-ppatpc"/>
+    <w:bookmarkStart w:id="212" w:name="sec:pxl-atphaci"/>
     <w:p>
       <w:pPr>
         <w:pStyle w:val="berschrift4"/>
@@ -10007,7 +10023,7 @@
         <w:rPr>
           <w:rStyle w:val="VerbatimChar"/>
         </w:rPr>
-        <w:t xml:space="preserve">pxl-ppatpc</w:t>
+        <w:t xml:space="preserve">pxl-atphaci</w:t>
       </w:r>
     </w:p>
     <w:bookmarkStart w:id="209" w:name="threshold-requirements-43"/>
@@ -10189,7 +10205,7 @@
     </w:p>
     <w:bookmarkEnd w:id="211"/>
     <w:bookmarkEnd w:id="212"/>
-    <w:bookmarkStart w:id="216" w:name="sec:pxl-ppionc"/>
+    <w:bookmarkStart w:id="216" w:name="sec:pxl-piopha"/>
     <w:p>
       <w:pPr>
         <w:pStyle w:val="berschrift4"/>
@@ -10221,7 +10237,7 @@
         <w:rPr>
           <w:rStyle w:val="VerbatimChar"/>
         </w:rPr>
-        <w:t xml:space="preserve">pxl-ppionc</w:t>
+        <w:t xml:space="preserve">pxl-piopha</w:t>
       </w:r>
     </w:p>
     <w:bookmarkStart w:id="213" w:name="threshold-requirements-44"/>
@@ -10441,7 +10457,7 @@
         <w:t xml:space="preserve">The requirements below must be met for all pixels/samples/observations in a collection.</w:t>
       </w:r>
     </w:p>
-    <w:bookmarkStart w:id="221" w:name="sec:rcm-cldopt"/>
+    <w:bookmarkStart w:id="221" w:name="sec:rcm-cngform"/>
     <w:p>
       <w:pPr>
         <w:pStyle w:val="berschrift4"/>
@@ -10473,7 +10489,7 @@
         <w:rPr>
           <w:rStyle w:val="VerbatimChar"/>
         </w:rPr>
-        <w:t xml:space="preserve">rcm-cldopt</w:t>
+        <w:t xml:space="preserve">rcm-cngform</w:t>
       </w:r>
     </w:p>
     <w:bookmarkStart w:id="218" w:name="threshold-requirements-45"/>
@@ -10581,7 +10597,7 @@
     </w:p>
     <w:bookmarkEnd w:id="220"/>
     <w:bookmarkEnd w:id="221"/>
-    <w:bookmarkStart w:id="225" w:name="sec:rcm-bsgslc"/>
+    <w:bookmarkStart w:id="225" w:name="sec:rcm-backsca-gslc"/>
     <w:p>
       <w:pPr>
         <w:pStyle w:val="berschrift4"/>
@@ -10613,7 +10629,7 @@
         <w:rPr>
           <w:rStyle w:val="VerbatimChar"/>
         </w:rPr>
-        <w:t xml:space="preserve">rcm-bsgslc</w:t>
+        <w:t xml:space="preserve">rcm-backsca-gslc</w:t>
       </w:r>
     </w:p>
     <w:bookmarkStart w:id="222" w:name="threshold-requirements-46"/>
@@ -10752,7 +10768,7 @@
         <w:pStyle w:val="FirstParagraph"/>
       </w:pPr>
       <w:r>
-        <w:t xml:space="preserve">Notes:</w:t>
+        <w:t xml:space="preserve">Note:</w:t>
       </w:r>
     </w:p>
     <w:p>
@@ -10855,7 +10871,7 @@
     </w:p>
     <w:bookmarkEnd w:id="224"/>
     <w:bookmarkEnd w:id="225"/>
-    <w:bookmarkStart w:id="229" w:name="sec:rcm-sclcnv"/>
+    <w:bookmarkStart w:id="229" w:name="sec:rcm-scaconv"/>
     <w:p>
       <w:pPr>
         <w:pStyle w:val="berschrift4"/>
@@ -10887,7 +10903,7 @@
         <w:rPr>
           <w:rStyle w:val="VerbatimChar"/>
         </w:rPr>
-        <w:t xml:space="preserve">rcm-sclcnv</w:t>
+        <w:t xml:space="preserve">rcm-scaconv</w:t>
       </w:r>
     </w:p>
     <w:bookmarkStart w:id="226" w:name="threshold-requirements-47"/>
@@ -10992,7 +11008,7 @@
     </w:p>
     <w:bookmarkEnd w:id="228"/>
     <w:bookmarkEnd w:id="229"/>
-    <w:bookmarkStart w:id="233" w:name="sec:rcm-nzrmvl"/>
+    <w:bookmarkStart w:id="233" w:name="sec:rcm-noiser"/>
     <w:p>
       <w:pPr>
         <w:pStyle w:val="berschrift4"/>
@@ -11024,7 +11040,7 @@
         <w:rPr>
           <w:rStyle w:val="VerbatimChar"/>
         </w:rPr>
-        <w:t xml:space="preserve">rcm-nzrmvl</w:t>
+        <w:t xml:space="preserve">rcm-noiser</w:t>
       </w:r>
     </w:p>
     <w:bookmarkStart w:id="230" w:name="threshold-requirements-48"/>
@@ -11055,7 +11071,7 @@
         <w:pStyle w:val="Textkrper"/>
       </w:pPr>
       <w:r>
-        <w:t xml:space="preserve">Notes:</w:t>
+        <w:t xml:space="preserve">Note:</w:t>
       </w:r>
     </w:p>
     <w:p>
@@ -11158,7 +11174,7 @@
     </w:p>
     <w:bookmarkEnd w:id="232"/>
     <w:bookmarkEnd w:id="233"/>
-    <w:bookmarkStart w:id="237" w:name="sec:rcm-rtagsl"/>
+    <w:bookmarkStart w:id="237" w:name="sec:rcm-radtalg-gslc"/>
     <w:p>
       <w:pPr>
         <w:pStyle w:val="berschrift4"/>
@@ -11190,7 +11206,7 @@
         <w:rPr>
           <w:rStyle w:val="VerbatimChar"/>
         </w:rPr>
-        <w:t xml:space="preserve">rcm-rtagsl</w:t>
+        <w:t xml:space="preserve">rcm-radtalg-gslc</w:t>
       </w:r>
     </w:p>
     <w:bookmarkStart w:id="234" w:name="threshold-requirements-49"/>
@@ -11316,7 +11332,7 @@
         <w:pStyle w:val="Textkrper"/>
       </w:pPr>
       <w:r>
-        <w:t xml:space="preserve">Notes:</w:t>
+        <w:t xml:space="preserve">Note:</w:t>
       </w:r>
     </w:p>
     <w:p>
@@ -11398,7 +11414,7 @@
     </w:p>
     <w:bookmarkEnd w:id="236"/>
     <w:bookmarkEnd w:id="237"/>
-    <w:bookmarkStart w:id="241" w:name="sec:rcm-rmasar"/>
+    <w:bookmarkStart w:id="241" w:name="sec:rcm-radacc-sar"/>
     <w:p>
       <w:pPr>
         <w:pStyle w:val="berschrift4"/>
@@ -11430,7 +11446,7 @@
         <w:rPr>
           <w:rStyle w:val="VerbatimChar"/>
         </w:rPr>
-        <w:t xml:space="preserve">rcm-rmasar</w:t>
+        <w:t xml:space="preserve">rcm-radacc-sar</w:t>
       </w:r>
     </w:p>
     <w:bookmarkStart w:id="238" w:name="threshold-requirements-50"/>
@@ -11613,7 +11629,7 @@
         <w:t xml:space="preserve">This section specifies any geometric correction requirements that must be met in order for the data to be analysis ready.</w:t>
       </w:r>
     </w:p>
-    <w:bookmarkStart w:id="246" w:name="sec:gcor-gmcalg"/>
+    <w:bookmarkStart w:id="246" w:name="sec:gcor-geocalg"/>
     <w:p>
       <w:pPr>
         <w:pStyle w:val="berschrift4"/>
@@ -11645,7 +11661,7 @@
         <w:rPr>
           <w:rStyle w:val="VerbatimChar"/>
         </w:rPr>
-        <w:t xml:space="preserve">gcor-gmcalg</w:t>
+        <w:t xml:space="preserve">gcor-geocalg</w:t>
       </w:r>
     </w:p>
     <w:bookmarkStart w:id="243" w:name="threshold-requirements-51"/>
@@ -11739,7 +11755,7 @@
         <w:pStyle w:val="FirstParagraph"/>
       </w:pPr>
       <w:r>
-        <w:t xml:space="preserve">Notes:</w:t>
+        <w:t xml:space="preserve">Note:</w:t>
       </w:r>
     </w:p>
     <w:p>
@@ -11821,7 +11837,7 @@
     </w:p>
     <w:bookmarkEnd w:id="245"/>
     <w:bookmarkEnd w:id="246"/>
-    <w:bookmarkStart w:id="250" w:name="sec:gcor-cordem"/>
+    <w:bookmarkStart w:id="250" w:name="sec:gcor-cdem"/>
     <w:p>
       <w:pPr>
         <w:pStyle w:val="berschrift4"/>
@@ -11853,7 +11869,7 @@
         <w:rPr>
           <w:rStyle w:val="VerbatimChar"/>
         </w:rPr>
-        <w:t xml:space="preserve">gcor-cordem</w:t>
+        <w:t xml:space="preserve">gcor-cdem</w:t>
       </w:r>
     </w:p>
     <w:p>
@@ -12032,7 +12048,7 @@
     </w:p>
     <w:bookmarkEnd w:id="249"/>
     <w:bookmarkEnd w:id="250"/>
-    <w:bookmarkStart w:id="254" w:name="sec:gcor-geoacr"/>
+    <w:bookmarkStart w:id="254" w:name="sec:gcor-geomacc-sar"/>
     <w:p>
       <w:pPr>
         <w:pStyle w:val="berschrift4"/>
@@ -12064,7 +12080,7 @@
         <w:rPr>
           <w:rStyle w:val="VerbatimChar"/>
         </w:rPr>
-        <w:t xml:space="preserve">gcor-geoacr</w:t>
+        <w:t xml:space="preserve">gcor-geomacc-sar</w:t>
       </w:r>
     </w:p>
     <w:bookmarkStart w:id="251" w:name="threshold-requirements-53"/>
@@ -12253,7 +12269,7 @@
     </w:p>
     <w:bookmarkEnd w:id="253"/>
     <w:bookmarkEnd w:id="254"/>
-    <w:bookmarkStart w:id="258" w:name="sec:gcor-georfa"/>
+    <w:bookmarkStart w:id="258" w:name="sec:gcor-georacc"/>
     <w:p>
       <w:pPr>
         <w:pStyle w:val="berschrift4"/>
@@ -12285,7 +12301,7 @@
         <w:rPr>
           <w:rStyle w:val="VerbatimChar"/>
         </w:rPr>
-        <w:t xml:space="preserve">gcor-georfa</w:t>
+        <w:t xml:space="preserve">gcor-georacc</w:t>
       </w:r>
     </w:p>
     <w:bookmarkStart w:id="255" w:name="threshold-requirements-54"/>
@@ -12328,7 +12344,7 @@
       <w:r>
         <w:t xml:space="preserve">“</w:t>
       </w:r>
-      <w:hyperlink w:anchor="sec:gcor-geoacr">
+      <w:hyperlink w:anchor="sec:gcor-geomacc-sar">
         <w:r>
           <w:rPr>
             <w:rStyle w:val="Hyperlink"/>
@@ -12429,7 +12445,7 @@
     </w:p>
     <w:bookmarkEnd w:id="257"/>
     <w:bookmarkEnd w:id="258"/>
-    <w:bookmarkStart w:id="262" w:name="sec:gcor-gridcv"/>
+    <w:bookmarkStart w:id="262" w:name="sec:gcor-gridconv"/>
     <w:p>
       <w:pPr>
         <w:pStyle w:val="berschrift4"/>
@@ -12461,7 +12477,7 @@
         <w:rPr>
           <w:rStyle w:val="VerbatimChar"/>
         </w:rPr>
-        <w:t xml:space="preserve">gcor-gridcv</w:t>
+        <w:t xml:space="preserve">gcor-gridconv</w:t>
       </w:r>
     </w:p>
     <w:bookmarkStart w:id="259" w:name="threshold-requirements-55"/>
@@ -12504,7 +12520,7 @@
         <w:pStyle w:val="Textkrper"/>
       </w:pPr>
       <w:r>
-        <w:t xml:space="preserve">Notes:</w:t>
+        <w:t xml:space="preserve">Note:</w:t>
       </w:r>
     </w:p>
     <w:p>
@@ -12726,7 +12742,7 @@
               <w:rPr>
                 <w:rStyle w:val="VerbatimChar"/>
               </w:rPr>
-              <w:t xml:space="preserve">meta-trcsar</w:t>
+              <w:t xml:space="preserve">meta-trace-sar</w:t>
             </w:r>
           </w:p>
         </w:tc>
@@ -12777,7 +12793,7 @@
               <w:rPr>
                 <w:rStyle w:val="VerbatimChar"/>
               </w:rPr>
-              <w:t xml:space="preserve">meta-mrdsar</w:t>
+              <w:t xml:space="preserve">meta-memare-sar</w:t>
             </w:r>
           </w:p>
         </w:tc>
@@ -12820,7 +12836,7 @@
               <w:rPr>
                 <w:rStyle w:val="VerbatimChar"/>
               </w:rPr>
-              <w:t xml:space="preserve">meta-prdtyp</w:t>
+              <w:t xml:space="preserve">meta-protype</w:t>
             </w:r>
           </w:p>
         </w:tc>
@@ -12922,7 +12938,7 @@
               <w:rPr>
                 <w:rStyle w:val="VerbatimChar"/>
               </w:rPr>
-              <w:t xml:space="preserve">meta-timsar</w:t>
+              <w:t xml:space="preserve">meta-time-sar</w:t>
             </w:r>
           </w:p>
         </w:tc>
@@ -13048,7 +13064,7 @@
               <w:rPr>
                 <w:rStyle w:val="VerbatimChar"/>
               </w:rPr>
-              <w:t xml:space="preserve">src-acqid</w:t>
+              <w:t xml:space="preserve">src-macqid</w:t>
             </w:r>
           </w:p>
         </w:tc>
@@ -13099,7 +13115,7 @@
               <w:rPr>
                 <w:rStyle w:val="VerbatimChar"/>
               </w:rPr>
-              <w:t xml:space="preserve">src-dacsrc</w:t>
+              <w:t xml:space="preserve">src-daccess-src</w:t>
             </w:r>
           </w:p>
         </w:tc>
@@ -13142,7 +13158,7 @@
               <w:rPr>
                 <w:rStyle w:val="VerbatimChar"/>
               </w:rPr>
-              <w:t xml:space="preserve">src-inssar</w:t>
+              <w:t xml:space="preserve">src-instru-sar</w:t>
             </w:r>
           </w:p>
         </w:tc>
@@ -13185,7 +13201,7 @@
               <w:rPr>
                 <w:rStyle w:val="VerbatimChar"/>
               </w:rPr>
-              <w:t xml:space="preserve">src-timsrc</w:t>
+              <w:t xml:space="preserve">src-time-src</w:t>
             </w:r>
           </w:p>
         </w:tc>
@@ -13330,7 +13346,7 @@
               <w:rPr>
                 <w:rStyle w:val="VerbatimChar"/>
               </w:rPr>
-              <w:t xml:space="preserve">src-prcpar</w:t>
+              <w:t xml:space="preserve">src-propar</w:t>
             </w:r>
           </w:p>
         </w:tc>
@@ -13373,7 +13389,7 @@
               <w:rPr>
                 <w:rStyle w:val="VerbatimChar"/>
               </w:rPr>
-              <w:t xml:space="preserve">src-imgatt</w:t>
+              <w:t xml:space="preserve">src-imgatt-sar</w:t>
             </w:r>
           </w:p>
         </w:tc>
@@ -13416,7 +13432,7 @@
               <w:rPr>
                 <w:rStyle w:val="VerbatimChar"/>
               </w:rPr>
-              <w:t xml:space="preserve">src-scasar</w:t>
+              <w:t xml:space="preserve">src-sencal-sar</w:t>
             </w:r>
           </w:p>
         </w:tc>
@@ -13467,7 +13483,7 @@
               <w:rPr>
                 <w:rStyle w:val="VerbatimChar"/>
               </w:rPr>
-              <w:t xml:space="preserve">src-prfind</w:t>
+              <w:t xml:space="preserve">src-perfind</w:t>
             </w:r>
           </w:p>
         </w:tc>
@@ -13510,7 +13526,7 @@
               <w:rPr>
                 <w:rStyle w:val="VerbatimChar"/>
               </w:rPr>
-              <w:t xml:space="preserve">src-polcal</w:t>
+              <w:t xml:space="preserve">src-polcalm</w:t>
             </w:r>
           </w:p>
         </w:tc>
@@ -13561,7 +13577,7 @@
               <w:rPr>
                 <w:rStyle w:val="VerbatimChar"/>
               </w:rPr>
-              <w:t xml:space="preserve">src-mfrang</w:t>
+              <w:t xml:space="preserve">src-farotan</w:t>
             </w:r>
           </w:p>
         </w:tc>
@@ -13738,7 +13754,7 @@
               <w:rPr>
                 <w:rStyle w:val="VerbatimChar"/>
               </w:rPr>
-              <w:t xml:space="preserve">prd-dacprd</w:t>
+              <w:t xml:space="preserve">prd-daccess-prod</w:t>
             </w:r>
           </w:p>
         </w:tc>
@@ -13781,7 +13797,7 @@
               <w:rPr>
                 <w:rStyle w:val="VerbatimChar"/>
               </w:rPr>
-              <w:t xml:space="preserve">prd-auxdat</w:t>
+              <w:t xml:space="preserve">prd-auxdat-sar</w:t>
             </w:r>
           </w:p>
         </w:tc>
@@ -13832,7 +13848,7 @@
               <w:rPr>
                 <w:rStyle w:val="VerbatimChar"/>
               </w:rPr>
-              <w:t xml:space="preserve">prd-smpspc</w:t>
+              <w:t xml:space="preserve">prd-samspa</w:t>
             </w:r>
           </w:p>
         </w:tc>
@@ -13934,7 +13950,7 @@
               <w:rPr>
                 <w:rStyle w:val="VerbatimChar"/>
               </w:rPr>
-              <w:t xml:space="preserve">prd-geobx</w:t>
+              <w:t xml:space="preserve">prd-geobbox</w:t>
             </w:r>
           </w:p>
         </w:tc>
@@ -13985,7 +14001,7 @@
               <w:rPr>
                 <w:rStyle w:val="VerbatimChar"/>
               </w:rPr>
-              <w:t xml:space="preserve">prd-geoare</w:t>
+              <w:t xml:space="preserve">prd-geoarea-sar</w:t>
             </w:r>
           </w:p>
         </w:tc>
@@ -14036,7 +14052,7 @@
               <w:rPr>
                 <w:rStyle w:val="VerbatimChar"/>
               </w:rPr>
-              <w:t xml:space="preserve">prd-imgsiz</w:t>
+              <w:t xml:space="preserve">prd-imgsize</w:t>
             </w:r>
           </w:p>
         </w:tc>
@@ -14087,7 +14103,7 @@
               <w:rPr>
                 <w:rStyle w:val="VerbatimChar"/>
               </w:rPr>
-              <w:t xml:space="preserve">prd-pxconv</w:t>
+              <w:t xml:space="preserve">prd-pixcoco</w:t>
             </w:r>
           </w:p>
         </w:tc>
@@ -14138,7 +14154,7 @@
               <w:rPr>
                 <w:rStyle w:val="VerbatimChar"/>
               </w:rPr>
-              <w:t xml:space="preserve">prd-crs</w:t>
+              <w:t xml:space="preserve">prd-crs-sar</w:t>
             </w:r>
           </w:p>
         </w:tc>
@@ -14240,7 +14256,7 @@
               <w:rPr>
                 <w:rStyle w:val="VerbatimChar"/>
               </w:rPr>
-              <w:t xml:space="preserve">prd-sltrng</w:t>
+              <w:t xml:space="preserve">prd-slarass</w:t>
             </w:r>
           </w:p>
         </w:tc>
@@ -14291,7 +14307,7 @@
               <w:rPr>
                 <w:rStyle w:val="VerbatimChar"/>
               </w:rPr>
-              <w:t xml:space="preserve">prd-orbgsl</w:t>
+              <w:t xml:space="preserve">prd-reorbit-gslc</w:t>
             </w:r>
           </w:p>
         </w:tc>
@@ -14417,7 +14433,7 @@
               <w:rPr>
                 <w:rStyle w:val="VerbatimChar"/>
               </w:rPr>
-              <w:t xml:space="preserve">pxl-cldopt</w:t>
+              <w:t xml:space="preserve">pxl-cngform</w:t>
             </w:r>
           </w:p>
         </w:tc>
@@ -14468,7 +14484,7 @@
               <w:rPr>
                 <w:rStyle w:val="VerbatimChar"/>
               </w:rPr>
-              <w:t xml:space="preserve">pxl-mrdsar</w:t>
+              <w:t xml:space="preserve">pxl-memare-sar</w:t>
             </w:r>
           </w:p>
         </w:tc>
@@ -14511,7 +14527,7 @@
               <w:rPr>
                 <w:rStyle w:val="VerbatimChar"/>
               </w:rPr>
-              <w:t xml:space="preserve">pxl-ppmask</w:t>
+              <w:t xml:space="preserve">pxl-damaski</w:t>
             </w:r>
           </w:p>
         </w:tc>
@@ -14554,7 +14570,7 @@
               <w:rPr>
                 <w:rStyle w:val="VerbatimChar"/>
               </w:rPr>
-              <w:t xml:space="preserve">pxl-ppscta</w:t>
+              <w:t xml:space="preserve">pxl-piscata</w:t>
             </w:r>
           </w:p>
         </w:tc>
@@ -14605,7 +14621,7 @@
               <w:rPr>
                 <w:rStyle w:val="VerbatimChar"/>
               </w:rPr>
-              <w:t xml:space="preserve">pxl-pplia</w:t>
+              <w:t xml:space="preserve">pxl-ploinca</w:t>
             </w:r>
           </w:p>
         </w:tc>
@@ -14656,7 +14672,7 @@
               <w:rPr>
                 <w:rStyle w:val="VerbatimChar"/>
               </w:rPr>
-              <w:t xml:space="preserve">pxl-ppelia</w:t>
+              <w:t xml:space="preserve">pxl-pelinca</w:t>
             </w:r>
           </w:p>
         </w:tc>
@@ -14707,7 +14723,7 @@
               <w:rPr>
                 <w:rStyle w:val="VerbatimChar"/>
               </w:rPr>
-              <w:t xml:space="preserve">pxl-ppnspw</w:t>
+              <w:t xml:space="preserve">pxl-pinopow</w:t>
             </w:r>
           </w:p>
         </w:tc>
@@ -14758,7 +14774,7 @@
               <w:rPr>
                 <w:rStyle w:val="VerbatimChar"/>
               </w:rPr>
-              <w:t xml:space="preserve">pxl-ppgmsg</w:t>
+              <w:t xml:space="preserve">pxl-gasiri</w:t>
             </w:r>
           </w:p>
         </w:tc>
@@ -14809,7 +14825,7 @@
               <w:rPr>
                 <w:rStyle w:val="VerbatimChar"/>
               </w:rPr>
-              <w:t xml:space="preserve">pxl-ppacqd</w:t>
+              <w:t xml:space="preserve">pxl-pacqid</w:t>
             </w:r>
           </w:p>
         </w:tc>
@@ -14852,7 +14868,7 @@
               <w:rPr>
                 <w:rStyle w:val="VerbatimChar"/>
               </w:rPr>
-              <w:t xml:space="preserve">pxl-ppdem</w:t>
+              <w:t xml:space="preserve">pxl-pidem</w:t>
             </w:r>
           </w:p>
         </w:tc>
@@ -14903,7 +14919,7 @@
               <w:rPr>
                 <w:rStyle w:val="VerbatimChar"/>
               </w:rPr>
-              <w:t xml:space="preserve">pxl-pprulv</w:t>
+              <w:t xml:space="preserve">pxl-radulov</w:t>
             </w:r>
           </w:p>
         </w:tc>
@@ -14954,7 +14970,7 @@
               <w:rPr>
                 <w:rStyle w:val="VerbatimChar"/>
               </w:rPr>
-              <w:t xml:space="preserve">pxl-ppslrg</w:t>
+              <w:t xml:space="preserve">pxl-slarassi</w:t>
             </w:r>
           </w:p>
         </w:tc>
@@ -15005,7 +15021,7 @@
               <w:rPr>
                 <w:rStyle w:val="VerbatimChar"/>
               </w:rPr>
-              <w:t xml:space="preserve">pxl-ppiphu</w:t>
+              <w:t xml:space="preserve">pxl-pinphun</w:t>
             </w:r>
           </w:p>
         </w:tc>
@@ -15056,7 +15072,7 @@
               <w:rPr>
                 <w:rStyle w:val="VerbatimChar"/>
               </w:rPr>
-              <w:t xml:space="preserve">pxl-ppatpc</w:t>
+              <w:t xml:space="preserve">pxl-atphaci</w:t>
             </w:r>
           </w:p>
         </w:tc>
@@ -15107,7 +15123,7 @@
               <w:rPr>
                 <w:rStyle w:val="VerbatimChar"/>
               </w:rPr>
-              <w:t xml:space="preserve">pxl-ppionc</w:t>
+              <w:t xml:space="preserve">pxl-piopha</w:t>
             </w:r>
           </w:p>
         </w:tc>
@@ -15233,7 +15249,7 @@
               <w:rPr>
                 <w:rStyle w:val="VerbatimChar"/>
               </w:rPr>
-              <w:t xml:space="preserve">rcm-cldopt</w:t>
+              <w:t xml:space="preserve">rcm-cngform</w:t>
             </w:r>
           </w:p>
         </w:tc>
@@ -15284,7 +15300,7 @@
               <w:rPr>
                 <w:rStyle w:val="VerbatimChar"/>
               </w:rPr>
-              <w:t xml:space="preserve">rcm-bsgslc</w:t>
+              <w:t xml:space="preserve">rcm-backsca-gslc</w:t>
             </w:r>
           </w:p>
         </w:tc>
@@ -15335,7 +15351,7 @@
               <w:rPr>
                 <w:rStyle w:val="VerbatimChar"/>
               </w:rPr>
-              <w:t xml:space="preserve">rcm-sclcnv</w:t>
+              <w:t xml:space="preserve">rcm-scaconv</w:t>
             </w:r>
           </w:p>
         </w:tc>
@@ -15378,7 +15394,7 @@
               <w:rPr>
                 <w:rStyle w:val="VerbatimChar"/>
               </w:rPr>
-              <w:t xml:space="preserve">rcm-nzrmvl</w:t>
+              <w:t xml:space="preserve">rcm-noiser</w:t>
             </w:r>
           </w:p>
         </w:tc>
@@ -15429,7 +15445,7 @@
               <w:rPr>
                 <w:rStyle w:val="VerbatimChar"/>
               </w:rPr>
-              <w:t xml:space="preserve">rcm-rtagsl</w:t>
+              <w:t xml:space="preserve">rcm-radtalg-gslc</w:t>
             </w:r>
           </w:p>
         </w:tc>
@@ -15480,7 +15496,7 @@
               <w:rPr>
                 <w:rStyle w:val="VerbatimChar"/>
               </w:rPr>
-              <w:t xml:space="preserve">rcm-rmasar</w:t>
+              <w:t xml:space="preserve">rcm-radacc-sar</w:t>
             </w:r>
           </w:p>
         </w:tc>
@@ -15605,7 +15621,7 @@
               <w:rPr>
                 <w:rStyle w:val="VerbatimChar"/>
               </w:rPr>
-              <w:t xml:space="preserve">gcor-gmcalg</w:t>
+              <w:t xml:space="preserve">gcor-geocalg</w:t>
             </w:r>
           </w:p>
         </w:tc>
@@ -15656,7 +15672,7 @@
               <w:rPr>
                 <w:rStyle w:val="VerbatimChar"/>
               </w:rPr>
-              <w:t xml:space="preserve">gcor-cordem</w:t>
+              <w:t xml:space="preserve">gcor-cdem</w:t>
             </w:r>
           </w:p>
         </w:tc>
@@ -15699,7 +15715,7 @@
               <w:rPr>
                 <w:rStyle w:val="VerbatimChar"/>
               </w:rPr>
-              <w:t xml:space="preserve">gcor-geoacr</w:t>
+              <w:t xml:space="preserve">gcor-geomacc-sar</w:t>
             </w:r>
           </w:p>
         </w:tc>
@@ -15742,7 +15758,7 @@
               <w:rPr>
                 <w:rStyle w:val="VerbatimChar"/>
               </w:rPr>
-              <w:t xml:space="preserve">gcor-georfa</w:t>
+              <w:t xml:space="preserve">gcor-georacc</w:t>
             </w:r>
           </w:p>
         </w:tc>
@@ -15793,7 +15809,7 @@
               <w:rPr>
                 <w:rStyle w:val="VerbatimChar"/>
               </w:rPr>
-              <w:t xml:space="preserve">gcor-gridcv</w:t>
+              <w:t xml:space="preserve">gcor-gridconv</w:t>
             </w:r>
           </w:p>
         </w:tc>

</xml_diff>